<commit_message>
Revise IRB submission packet to version 1.1
</commit_message>
<xml_diff>
--- a/irb_submission/IRB_SUBMISSION_BUNDLE/01_SORA_IRB_Submission_Packet.docx
+++ b/irb_submission/IRB_SUBMISSION_BUNDLE/01_SORA_IRB_Submission_Packet.docx
@@ -132,7 +132,7 @@
               <w:pStyle w:val="Compact"/>
             </w:pPr>
             <w:r>
-              <w:t xml:space="preserve">[IRB assigned] / Version 1.0 / 11 August 2026</w:t>
+              <w:t xml:space="preserve">[IRB assigned] / Version 1.1 / 11 August 2026</w:t>
             </w:r>
           </w:p>
         </w:tc>
@@ -244,7 +244,7 @@
     </w:p>
     <w:bookmarkEnd w:id="9"/>
     <w:bookmarkEnd w:id="10"/>
-    <w:bookmarkStart w:id="31" w:name="part-1-full-research-protocol"/>
+    <w:bookmarkStart w:id="32" w:name="part-1-full-research-protocol"/>
     <w:p>
       <w:pPr>
         <w:pStyle w:val="Heading1"/>
@@ -291,25 +291,37 @@
         <w:t xml:space="preserve"> </w:t>
       </w:r>
       <w:r>
-        <w:t xml:space="preserve">Investigators receive only a nonidentifying site code, a clinic-assigned</w:t>
-      </w:r>
-      <w:r>
-        <w:t xml:space="preserve"> </w:t>
-      </w:r>
-      <w:r>
-        <w:t xml:space="preserve">row ID, sex, age at onset in completed months, days from the preceding</w:t>
-      </w:r>
-      <w:r>
-        <w:t xml:space="preserve"> </w:t>
-      </w:r>
-      <w:r>
-        <w:t xml:space="preserve">vaccination to onset (Dpre), and days from onset to the subsequent</w:t>
-      </w:r>
-      <w:r>
-        <w:t xml:space="preserve"> </w:t>
-      </w:r>
-      <w:r>
-        <w:t xml:space="preserve">vaccination (Dpost).</w:t>
+        <w:t xml:space="preserve">Investigators receive only a study site code, a clinic-assigned row ID,</w:t>
+      </w:r>
+      <w:r>
+        <w:t xml:space="preserve"> </w:t>
+      </w:r>
+      <w:r>
+        <w:t xml:space="preserve">sex, age at onset in days, vaccination-before-onset status,</w:t>
+      </w:r>
+      <w:r>
+        <w:t xml:space="preserve"> </w:t>
+      </w:r>
+      <w:r>
+        <w:t xml:space="preserve">days from the preceding vaccination to onset (Dpre, when applicable),</w:t>
+      </w:r>
+      <w:r>
+        <w:t xml:space="preserve"> </w:t>
+      </w:r>
+      <w:r>
+        <w:t xml:space="preserve">and days from onset to the subsequent vaccination (Dpost, when</w:t>
+      </w:r>
+      <w:r>
+        <w:t xml:space="preserve"> </w:t>
+      </w:r>
+      <w:r>
+        <w:t xml:space="preserve">available). Each clinic also submits four aggregate counts concerning</w:t>
+      </w:r>
+      <w:r>
+        <w:t xml:space="preserve"> </w:t>
+      </w:r>
+      <w:r>
+        <w:t xml:space="preserve">vaccination status through 24 months.</w:t>
       </w:r>
       <w:r>
         <w:t xml:space="preserve"> </w:t>
@@ -413,61 +425,55 @@
         <w:pStyle w:val="BodyText"/>
       </w:pPr>
       <w:r>
-        <w:t xml:space="preserve">Large cohort and meta-analytic studies have not found an association</w:t>
-      </w:r>
-      <w:r>
-        <w:t xml:space="preserve"> </w:t>
-      </w:r>
-      <w:r>
-        <w:t xml:space="preserve">between vaccination and autism overall, and several studies specifically</w:t>
-      </w:r>
-      <w:r>
-        <w:t xml:space="preserve"> </w:t>
-      </w:r>
-      <w:r>
-        <w:t xml:space="preserve">examining regression or onset pattern have not supported an MMR-related</w:t>
-      </w:r>
-      <w:r>
-        <w:t xml:space="preserve"> </w:t>
-      </w:r>
-      <w:r>
-        <w:t xml:space="preserve">regressive phenotype. The present study therefore does not treat a</w:t>
-      </w:r>
-      <w:r>
-        <w:t xml:space="preserve"> </w:t>
-      </w:r>
-      <w:r>
-        <w:t xml:space="preserve">causal association as established. Its narrower question is whether a</w:t>
-      </w:r>
-      <w:r>
-        <w:t xml:space="preserve"> </w:t>
-      </w:r>
-      <w:r>
-        <w:t xml:space="preserve">highly selected subgroup with a documented, abrupt, readily dated</w:t>
-      </w:r>
-      <w:r>
-        <w:t xml:space="preserve"> </w:t>
-      </w:r>
-      <w:r>
-        <w:t xml:space="preserve">parent-observed onset shows nonrandom temporal positioning between</w:t>
-      </w:r>
-      <w:r>
-        <w:t xml:space="preserve"> </w:t>
-      </w:r>
-      <w:r>
-        <w:t xml:space="preserve">adjacent vaccination encounters. This question is scientifically</w:t>
-      </w:r>
-      <w:r>
-        <w:t xml:space="preserve"> </w:t>
-      </w:r>
-      <w:r>
-        <w:t xml:space="preserve">testable, but selection, recall, documentation, diagnostic, and</w:t>
-      </w:r>
-      <w:r>
-        <w:t xml:space="preserve"> </w:t>
-      </w:r>
-      <w:r>
-        <w:t xml:space="preserve">time-varying confounding must be addressed explicitly.</w:t>
+        <w:t xml:space="preserve">Extensive epidemiologic research has generally not found an association</w:t>
+      </w:r>
+      <w:r>
+        <w:t xml:space="preserve"> </w:t>
+      </w:r>
+      <w:r>
+        <w:t xml:space="preserve">between vaccination and autism spectrum disorder at the population</w:t>
+      </w:r>
+      <w:r>
+        <w:t xml:space="preserve"> </w:t>
+      </w:r>
+      <w:r>
+        <w:t xml:space="preserve">level. However, some observational studies using vaccinated-versus-</w:t>
+      </w:r>
+      <w:r>
+        <w:t xml:space="preserve"> </w:t>
+      </w:r>
+      <w:r>
+        <w:t xml:space="preserve">unvaccinated comparisons have reported associations, and questions</w:t>
+      </w:r>
+      <w:r>
+        <w:t xml:space="preserve"> </w:t>
+      </w:r>
+      <w:r>
+        <w:t xml:space="preserve">remain regarding whether a narrowly defined subgroup characterized by</w:t>
+      </w:r>
+      <w:r>
+        <w:t xml:space="preserve"> </w:t>
+      </w:r>
+      <w:r>
+        <w:t xml:space="preserve">sudden, readily dateable regression could exhibit a distinct temporal</w:t>
+      </w:r>
+      <w:r>
+        <w:t xml:space="preserve"> </w:t>
+      </w:r>
+      <w:r>
+        <w:t xml:space="preserve">pattern. Existing studies may not have been designed specifically to</w:t>
+      </w:r>
+      <w:r>
+        <w:t xml:space="preserve"> </w:t>
+      </w:r>
+      <w:r>
+        <w:t xml:space="preserve">detect short-term clustering of an unambiguous parent-observed onset</w:t>
+      </w:r>
+      <w:r>
+        <w:t xml:space="preserve"> </w:t>
+      </w:r>
+      <w:r>
+        <w:t xml:space="preserve">relative to adjacent vaccination dates.</w:t>
       </w:r>
     </w:p>
     <w:p>
@@ -475,49 +481,129 @@
         <w:pStyle w:val="BodyText"/>
       </w:pPr>
       <w:r>
-        <w:t xml:space="preserve">The scientific value is methodological: to determine whether</w:t>
-      </w:r>
-      <w:r>
-        <w:t xml:space="preserve"> </w:t>
-      </w:r>
-      <w:r>
-        <w:t xml:space="preserve">clinic-derived timing data are sufficiently reliable and whether any</w:t>
-      </w:r>
-      <w:r>
-        <w:t xml:space="preserve"> </w:t>
-      </w:r>
-      <w:r>
-        <w:t xml:space="preserve">temporal clustering persists under prespecified,</w:t>
-      </w:r>
-      <w:r>
-        <w:t xml:space="preserve"> </w:t>
-      </w:r>
-      <w:r>
-        <w:t xml:space="preserve">exposure-opportunity-adjusted analyses. A positive result would be</w:t>
-      </w:r>
-      <w:r>
-        <w:t xml:space="preserve"> </w:t>
-      </w:r>
-      <w:r>
-        <w:t xml:space="preserve">hypothesis-generating and would require independent confirmation in</w:t>
-      </w:r>
-      <w:r>
-        <w:t xml:space="preserve"> </w:t>
-      </w:r>
-      <w:r>
-        <w:t xml:space="preserve">population-based records with prospectively recorded developmental</w:t>
-      </w:r>
-      <w:r>
-        <w:t xml:space="preserve"> </w:t>
-      </w:r>
-      <w:r>
-        <w:t xml:space="preserve">measures. A null result would constrain the magnitude of short-window</w:t>
-      </w:r>
-      <w:r>
-        <w:t xml:space="preserve"> </w:t>
-      </w:r>
-      <w:r>
-        <w:t xml:space="preserve">clustering in this selected phenotype.</w:t>
+        <w:t xml:space="preserve">This study addresses that narrower question in three complementary ways.</w:t>
+      </w:r>
+      <w:r>
+        <w:t xml:space="preserve"> </w:t>
+      </w:r>
+      <w:r>
+        <w:t xml:space="preserve">First, the broad age-dependent pattern of parent-recognized SORA onset</w:t>
+      </w:r>
+      <w:r>
+        <w:t xml:space="preserve"> </w:t>
+      </w:r>
+      <w:r>
+        <w:t xml:space="preserve">is estimated from all qualifying SORA cases using a prespecified smooth,</w:t>
+      </w:r>
+      <w:r>
+        <w:t xml:space="preserve"> </w:t>
+      </w:r>
+      <w:r>
+        <w:t xml:space="preserve">cross-fitted model. Second, the complete Dpre distribution among cases</w:t>
+      </w:r>
+      <w:r>
+        <w:t xml:space="preserve"> </w:t>
+      </w:r>
+      <w:r>
+        <w:t xml:space="preserve">vaccinated before onset is examined for short-term clustering, including</w:t>
+      </w:r>
+      <w:r>
+        <w:t xml:space="preserve"> </w:t>
+      </w:r>
+      <w:r>
+        <w:t xml:space="preserve">localized peaks that do not begin on the day of vaccination. Cases with</w:t>
+      </w:r>
+      <w:r>
+        <w:t xml:space="preserve"> </w:t>
+      </w:r>
+      <w:r>
+        <w:t xml:space="preserve">no vaccination before onset provide a supplementary age-distribution</w:t>
+      </w:r>
+      <w:r>
+        <w:t xml:space="preserve"> </w:t>
+      </w:r>
+      <w:r>
+        <w:t xml:space="preserve">comparison but are not expected to be numerous enough to estimate the</w:t>
+      </w:r>
+      <w:r>
+        <w:t xml:space="preserve"> </w:t>
+      </w:r>
+      <w:r>
+        <w:t xml:space="preserve">baseline independently. Third, aggregate clinic counts</w:t>
+      </w:r>
+      <w:r>
+        <w:t xml:space="preserve"> </w:t>
+      </w:r>
+      <w:r>
+        <w:t xml:space="preserve">compare the proportion with no documented vaccination through 24 months</w:t>
+      </w:r>
+      <w:r>
+        <w:t xml:space="preserve"> </w:t>
+      </w:r>
+      <w:r>
+        <w:t xml:space="preserve">among SORA cases with the corresponding proportion in the clinic source</w:t>
+      </w:r>
+      <w:r>
+        <w:t xml:space="preserve"> </w:t>
+      </w:r>
+      <w:r>
+        <w:t xml:space="preserve">population. These analyses avoid assuming that the natural age of onset</w:t>
+      </w:r>
+      <w:r>
+        <w:t xml:space="preserve"> </w:t>
+      </w:r>
+      <w:r>
+        <w:t xml:space="preserve">is uniformly distributed.</w:t>
+      </w:r>
+    </w:p>
+    <w:p>
+      <w:pPr>
+        <w:pStyle w:val="BodyText"/>
+      </w:pPr>
+      <w:r>
+        <w:t xml:space="preserve">The study is intended to clarify temporal association in the defined</w:t>
+      </w:r>
+      <w:r>
+        <w:t xml:space="preserve"> </w:t>
+      </w:r>
+      <w:r>
+        <w:t xml:space="preserve">SORA cohort. It does not, by itself, estimate vaccine-attributable autism</w:t>
+      </w:r>
+      <w:r>
+        <w:t xml:space="preserve"> </w:t>
+      </w:r>
+      <w:r>
+        <w:t xml:space="preserve">risk or establish causation. Selection, recall, documentation,</w:t>
+      </w:r>
+      <w:r>
+        <w:t xml:space="preserve"> </w:t>
+      </w:r>
+      <w:r>
+        <w:t xml:space="preserve">diagnostic, age-related, healthcare-contact, and other potential</w:t>
+      </w:r>
+      <w:r>
+        <w:t xml:space="preserve"> </w:t>
+      </w:r>
+      <w:r>
+        <w:t xml:space="preserve">confounding must be addressed explicitly. Any observed clustering would</w:t>
+      </w:r>
+      <w:r>
+        <w:t xml:space="preserve"> </w:t>
+      </w:r>
+      <w:r>
+        <w:t xml:space="preserve">be hypothesis-generating and require independent confirmation using</w:t>
+      </w:r>
+      <w:r>
+        <w:t xml:space="preserve"> </w:t>
+      </w:r>
+      <w:r>
+        <w:t xml:space="preserve">designs capable of addressing those limitations. A null result would</w:t>
+      </w:r>
+      <w:r>
+        <w:t xml:space="preserve"> </w:t>
+      </w:r>
+      <w:r>
+        <w:t xml:space="preserve">constrain the magnitude of temporal clustering in this selected cohort.</w:t>
       </w:r>
     </w:p>
     <w:bookmarkEnd w:id="12"/>
@@ -538,37 +624,31 @@
         </w:numPr>
       </w:pPr>
       <w:r>
-        <w:t xml:space="preserve">Aim 1: Test whether onset timing is distributed uniformly within the</w:t>
-      </w:r>
-      <w:r>
-        <w:t xml:space="preserve"> </w:t>
-      </w:r>
-      <w:r>
-        <w:t xml:space="preserve">interval between adjacent vaccinations or is disproportionately</w:t>
-      </w:r>
-      <w:r>
-        <w:t xml:space="preserve"> </w:t>
-      </w:r>
-      <w:r>
-        <w:t xml:space="preserve">concentrated near the preceding vaccination. Primary normalized</w:t>
-      </w:r>
-      <w:r>
-        <w:t xml:space="preserve"> </w:t>
-      </w:r>
-      <w:r>
-        <w:t xml:space="preserve">measure: U = Dpre / (Dpre + Dpost). Under the primary null model,</w:t>
-      </w:r>
-      <w:r>
-        <w:t xml:space="preserve"> </w:t>
-      </w:r>
-      <w:r>
-        <w:t xml:space="preserve">onset is uniformly distributed within each observed interval and U</w:t>
-      </w:r>
-      <w:r>
-        <w:t xml:space="preserve"> </w:t>
-      </w:r>
-      <w:r>
-        <w:t xml:space="preserve">follows Uniform(0,1).</w:t>
+        <w:t xml:space="preserve">Aim 1: Estimate the broad age-dependent pattern of parent-recognized</w:t>
+      </w:r>
+      <w:r>
+        <w:t xml:space="preserve"> </w:t>
+      </w:r>
+      <w:r>
+        <w:t xml:space="preserve">SORA onset from all qualifying cases using age in days and a</w:t>
+      </w:r>
+      <w:r>
+        <w:t xml:space="preserve"> </w:t>
+      </w:r>
+      <w:r>
+        <w:t xml:space="preserve">prespecified smooth model cross-fitted by site. Compare vaccinated-</w:t>
+      </w:r>
+      <w:r>
+        <w:t xml:space="preserve"> </w:t>
+      </w:r>
+      <w:r>
+        <w:t xml:space="preserve">before-onset and unvaccinated-before-onset age distributions as a</w:t>
+      </w:r>
+      <w:r>
+        <w:t xml:space="preserve"> </w:t>
+      </w:r>
+      <w:r>
+        <w:t xml:space="preserve">supplementary analysis.</w:t>
       </w:r>
     </w:p>
     <w:p>
@@ -579,31 +659,31 @@
         </w:numPr>
       </w:pPr>
       <w:r>
-        <w:t xml:space="preserve">Aim 2: Estimate and compare prespecified short-window</w:t>
-      </w:r>
-      <w:r>
-        <w:t xml:space="preserve"> </w:t>
-      </w:r>
-      <w:r>
-        <w:t xml:space="preserve">concentrations, especially Dpre = 0–2 days and Dpre = 0–7 days,</w:t>
-      </w:r>
-      <w:r>
-        <w:t xml:space="preserve"> </w:t>
-      </w:r>
-      <w:r>
-        <w:t xml:space="preserve">against their child-specific null expectations. These windows</w:t>
-      </w:r>
-      <w:r>
-        <w:t xml:space="preserve"> </w:t>
-      </w:r>
-      <w:r>
-        <w:t xml:space="preserve">provide interpretable effect estimates without defining the study’s</w:t>
-      </w:r>
-      <w:r>
-        <w:t xml:space="preserve"> </w:t>
-      </w:r>
-      <w:r>
-        <w:t xml:space="preserve">success by one arbitrary cutoff.</w:t>
+        <w:t xml:space="preserve">Aim 2: Describe the complete Dpre distribution among SORA cases</w:t>
+      </w:r>
+      <w:r>
+        <w:t xml:space="preserve"> </w:t>
+      </w:r>
+      <w:r>
+        <w:t xml:space="preserve">vaccinated before onset and evaluate prespecified 0–2-day and</w:t>
+      </w:r>
+      <w:r>
+        <w:t xml:space="preserve"> </w:t>
+      </w:r>
+      <w:r>
+        <w:t xml:space="preserve">0–7-day windows plus a multiplicity-adjusted moving-window scan.</w:t>
+      </w:r>
+      <w:r>
+        <w:t xml:space="preserve"> </w:t>
+      </w:r>
+      <w:r>
+        <w:t xml:space="preserve">These analyses are exploratory and do not assume a uniform natural</w:t>
+      </w:r>
+      <w:r>
+        <w:t xml:space="preserve"> </w:t>
+      </w:r>
+      <w:r>
+        <w:t xml:space="preserve">onset distribution.</w:t>
       </w:r>
     </w:p>
     <w:p>
@@ -614,25 +694,25 @@
         </w:numPr>
       </w:pPr>
       <w:r>
-        <w:t xml:space="preserve">Aim 3: Describe timing patterns by age at onset and sex, and assess</w:t>
-      </w:r>
-      <w:r>
-        <w:t xml:space="preserve"> </w:t>
-      </w:r>
-      <w:r>
-        <w:t xml:space="preserve">robustness to same-day coding, interval length, alternative risk</w:t>
-      </w:r>
-      <w:r>
-        <w:t xml:space="preserve"> </w:t>
-      </w:r>
-      <w:r>
-        <w:t xml:space="preserve">windows, and other sensitivity analyses supported by the six</w:t>
-      </w:r>
-      <w:r>
-        <w:t xml:space="preserve"> </w:t>
-      </w:r>
-      <w:r>
-        <w:t xml:space="preserve">received variables.</w:t>
+        <w:t xml:space="preserve">Aim 3: Compare, within each clinic and overall, the proportion with</w:t>
+      </w:r>
+      <w:r>
+        <w:t xml:space="preserve"> </w:t>
+      </w:r>
+      <w:r>
+        <w:t xml:space="preserve">no documented vaccination through 24 months among qualifying SORA</w:t>
+      </w:r>
+      <w:r>
+        <w:t xml:space="preserve"> </w:t>
+      </w:r>
+      <w:r>
+        <w:t xml:space="preserve">cases with the corresponding proportion among all clinic patients</w:t>
+      </w:r>
+      <w:r>
+        <w:t xml:space="preserve"> </w:t>
+      </w:r>
+      <w:r>
+        <w:t xml:space="preserve">whose vaccination status through 24 months can be established.</w:t>
       </w:r>
     </w:p>
     <w:p>
@@ -664,13 +744,25 @@
         <w:pStyle w:val="FirstParagraph"/>
       </w:pPr>
       <w:r>
-        <w:t xml:space="preserve">Retrospective, multisite clinical case series using existing medical</w:t>
-      </w:r>
-      <w:r>
-        <w:t xml:space="preserve"> </w:t>
-      </w:r>
-      <w:r>
-        <w:t xml:space="preserve">records. Clinic personnel will screen records, verify eligibility,</w:t>
+        <w:t xml:space="preserve">Retrospective, multisite clinical case series using only records and</w:t>
+      </w:r>
+      <w:r>
+        <w:t xml:space="preserve"> </w:t>
+      </w:r>
+      <w:r>
+        <w:t xml:space="preserve">clinical data created before the study cutoff date of [date] for</w:t>
+      </w:r>
+      <w:r>
+        <w:t xml:space="preserve"> </w:t>
+      </w:r>
+      <w:r>
+        <w:t xml:space="preserve">purposes of clinical care, not for this research. Clinic personnel will</w:t>
+      </w:r>
+      <w:r>
+        <w:t xml:space="preserve"> </w:t>
+      </w:r>
+      <w:r>
+        <w:t xml:space="preserve">screen records, verify eligibility,</w:t>
       </w:r>
       <w:r>
         <w:t xml:space="preserve"> </w:t>
@@ -766,7 +858,7 @@
         <w:t xml:space="preserve"> </w:t>
       </w:r>
       <w:r>
-        <w:t xml:space="preserve">calendar date, or an interval no longer than 48 hours, when persistent</w:t>
+        <w:t xml:space="preserve">calendar date when persistent</w:t>
       </w:r>
       <w:r>
         <w:t xml:space="preserve"> </w:t>
@@ -895,13 +987,13 @@
         </w:numPr>
       </w:pPr>
       <w:r>
-        <w:t xml:space="preserve">A parent/caregiver-reported onset date or ≤48-hour onset interval for</w:t>
-      </w:r>
-      <w:r>
-        <w:t xml:space="preserve"> </w:t>
-      </w:r>
-      <w:r>
-        <w:t xml:space="preserve">a persistent change meeting the SORA definition.</w:t>
+        <w:t xml:space="preserve">A parent/caregiver-reported specific calendar onset date for a</w:t>
+      </w:r>
+      <w:r>
+        <w:t xml:space="preserve"> </w:t>
+      </w:r>
+      <w:r>
+        <w:t xml:space="preserve">persistent change meeting the SORA definition.</w:t>
       </w:r>
     </w:p>
     <w:p>
@@ -912,25 +1004,25 @@
         </w:numPr>
       </w:pPr>
       <w:r>
-        <w:t xml:space="preserve">A verifiable vaccination date before onset and a verifiable</w:t>
-      </w:r>
-      <w:r>
-        <w:t xml:space="preserve"> </w:t>
-      </w:r>
-      <w:r>
-        <w:t xml:space="preserve">vaccination date after onset in the source record. If no later</w:t>
-      </w:r>
-      <w:r>
-        <w:t xml:space="preserve"> </w:t>
-      </w:r>
-      <w:r>
-        <w:t xml:space="preserve">vaccination exists, retain for descriptive analysis but exclude from</w:t>
-      </w:r>
-      <w:r>
-        <w:t xml:space="preserve"> </w:t>
-      </w:r>
-      <w:r>
-        <w:t xml:space="preserve">normalized-position analysis.</w:t>
+        <w:t xml:space="preserve">Vaccination history sufficient to determine whether any vaccination</w:t>
+      </w:r>
+      <w:r>
+        <w:t xml:space="preserve"> </w:t>
+      </w:r>
+      <w:r>
+        <w:t xml:space="preserve">occurred before onset. A preceding vaccination date is required only</w:t>
+      </w:r>
+      <w:r>
+        <w:t xml:space="preserve"> </w:t>
+      </w:r>
+      <w:r>
+        <w:t xml:space="preserve">for cases classified as vaccinated before onset. Absence of a later</w:t>
+      </w:r>
+      <w:r>
+        <w:t xml:space="preserve"> </w:t>
+      </w:r>
+      <w:r>
+        <w:t xml:space="preserve">vaccination does not exclude a case.</w:t>
       </w:r>
     </w:p>
     <w:p>
@@ -1014,19 +1106,19 @@
         </w:numPr>
       </w:pPr>
       <w:r>
-        <w:t xml:space="preserve">Gradual, uncertain, or retrospectively approximated onset exceeding 48</w:t>
-      </w:r>
-      <w:r>
-        <w:t xml:space="preserve"> </w:t>
-      </w:r>
-      <w:r>
-        <w:t xml:space="preserve">hours; these may be logged as screen failures or analyzed separately,</w:t>
-      </w:r>
-      <w:r>
-        <w:t xml:space="preserve"> </w:t>
-      </w:r>
-      <w:r>
-        <w:t xml:space="preserve">not included in the primary cohort.</w:t>
+        <w:t xml:space="preserve">Gradual, interval-censored, uncertain, or retrospectively approximated</w:t>
+      </w:r>
+      <w:r>
+        <w:t xml:space="preserve"> </w:t>
+      </w:r>
+      <w:r>
+        <w:t xml:space="preserve">onset without a specific calendar date; these are logged as screen</w:t>
+      </w:r>
+      <w:r>
+        <w:t xml:space="preserve"> </w:t>
+      </w:r>
+      <w:r>
+        <w:t xml:space="preserve">failures and are not included in the analytic cohort.</w:t>
       </w:r>
     </w:p>
     <w:p>
@@ -1054,13 +1146,19 @@
         </w:numPr>
       </w:pPr>
       <w:r>
-        <w:t xml:space="preserve">Conflicting dates that cannot be resolved by the site adjudicator, or</w:t>
-      </w:r>
-      <w:r>
-        <w:t xml:space="preserve"> </w:t>
-      </w:r>
-      <w:r>
-        <w:t xml:space="preserve">missing required timing data.</w:t>
+        <w:t xml:space="preserve">Conflicting onset information that cannot be resolved by the site</w:t>
+      </w:r>
+      <w:r>
+        <w:t xml:space="preserve"> </w:t>
+      </w:r>
+      <w:r>
+        <w:t xml:space="preserve">adjudicator, or vaccination history insufficient to classify exposure</w:t>
+      </w:r>
+      <w:r>
+        <w:t xml:space="preserve"> </w:t>
+      </w:r>
+      <w:r>
+        <w:t xml:space="preserve">before onset.</w:t>
       </w:r>
     </w:p>
     <w:bookmarkEnd w:id="17"/>
@@ -1082,7 +1180,13 @@
         </w:numPr>
       </w:pPr>
       <w:r>
-        <w:t xml:space="preserve">Each site defines the full source population and ascertainment dates</w:t>
+        <w:t xml:space="preserve">Each site defines the complete ASD source population, referral type,</w:t>
+      </w:r>
+      <w:r>
+        <w:t xml:space="preserve"> </w:t>
+      </w:r>
+      <w:r>
+        <w:t xml:space="preserve">reproducible search method, and ascertainment dates</w:t>
       </w:r>
       <w:r>
         <w:t xml:space="preserve"> </w:t>
@@ -1186,19 +1290,37 @@
         <w:t xml:space="preserve"> </w:t>
       </w:r>
       <w:r>
-        <w:t xml:space="preserve">billing, recommendation, or a generic well-child visit. Combination</w:t>
-      </w:r>
-      <w:r>
-        <w:t xml:space="preserve"> </w:t>
-      </w:r>
-      <w:r>
-        <w:t xml:space="preserve">products and simultaneous vaccines count as one vaccination date;</w:t>
-      </w:r>
-      <w:r>
-        <w:t xml:space="preserve"> </w:t>
-      </w:r>
-      <w:r>
-        <w:t xml:space="preserve">product/antigen fields are optional secondary variables.</w:t>
+        <w:t xml:space="preserve">billing, recommendation, or a generic well-child visit. Multiple</w:t>
+      </w:r>
+      <w:r>
+        <w:t xml:space="preserve"> </w:t>
+      </w:r>
+      <w:r>
+        <w:t xml:space="preserve">vaccines administered on the same calendar date count as one</w:t>
+      </w:r>
+      <w:r>
+        <w:t xml:space="preserve"> </w:t>
+      </w:r>
+      <w:r>
+        <w:t xml:space="preserve">vaccination event. Vaccine product, manufacturer, dose, lot, and</w:t>
+      </w:r>
+      <w:r>
+        <w:t xml:space="preserve"> </w:t>
+      </w:r>
+      <w:r>
+        <w:t xml:space="preserve">antigen information will not be collected or transmitted. Outside</w:t>
+      </w:r>
+      <w:r>
+        <w:t xml:space="preserve"> </w:t>
+      </w:r>
+      <w:r>
+        <w:t xml:space="preserve">immunization histories must be sufficiently complete to support the</w:t>
+      </w:r>
+      <w:r>
+        <w:t xml:space="preserve"> </w:t>
+      </w:r>
+      <w:r>
+        <w:t xml:space="preserve">assigned exposure classification.</w:t>
       </w:r>
     </w:p>
     <w:p>
@@ -1221,13 +1343,25 @@
         <w:t xml:space="preserve"> </w:t>
       </w:r>
       <w:r>
-        <w:t xml:space="preserve">coded Dpre=0, with time ordering recorded only if contemporaneously</w:t>
-      </w:r>
-      <w:r>
-        <w:t xml:space="preserve"> </w:t>
-      </w:r>
-      <w:r>
-        <w:t xml:space="preserve">documented.</w:t>
+        <w:t xml:space="preserve">coded Dpre=0. The endpoint is parent-recognized onset, not asserted</w:t>
+      </w:r>
+      <w:r>
+        <w:t xml:space="preserve"> </w:t>
+      </w:r>
+      <w:r>
+        <w:t xml:space="preserve">biological onset. If onset and vaccination occur on the same date,</w:t>
+      </w:r>
+      <w:r>
+        <w:t xml:space="preserve"> </w:t>
+      </w:r>
+      <w:r>
+        <w:t xml:space="preserve">within-day ordering will not be inferred unless contemporaneously</w:t>
+      </w:r>
+      <w:r>
+        <w:t xml:space="preserve"> </w:t>
+      </w:r>
+      <w:r>
+        <w:t xml:space="preserve">documented; same-day cases will also be reported separately.</w:t>
       </w:r>
     </w:p>
     <w:bookmarkEnd w:id="19"/>
@@ -1390,7 +1524,7 @@
               <w:pStyle w:val="Compact"/>
             </w:pPr>
             <w:r>
-              <w:t xml:space="preserve">Completed months at onset; public release may bin to protect privacy</w:t>
+              <w:t xml:space="preserve">Age in whole days on the parent-recognized onset date, calculated locally from dates that are not transmitted; public release may bin age</w:t>
             </w:r>
           </w:p>
         </w:tc>
@@ -1449,18 +1583,18 @@
               <w:pStyle w:val="Compact"/>
             </w:pPr>
             <w:r>
-              <w:t xml:space="preserve">Dpre</w:t>
-            </w:r>
-          </w:p>
-        </w:tc>
-        <w:tc>
-          <w:tcPr/>
-          <w:p>
-            <w:pPr>
-              <w:pStyle w:val="Compact"/>
-            </w:pPr>
-            <w:r>
-              <w:t xml:space="preserve">Calendar days: onset minus most recent administered vaccination before/on onset</w:t>
+              <w:t xml:space="preserve">Vaccination before onset</w:t>
+            </w:r>
+          </w:p>
+        </w:tc>
+        <w:tc>
+          <w:tcPr/>
+          <w:p>
+            <w:pPr>
+              <w:pStyle w:val="Compact"/>
+            </w:pPr>
+            <w:r>
+              <w:t xml:space="preserve">Yes = at least one documented vaccination before/on onset; No = documented absence before onset; Unknown is not eligible</w:t>
             </w:r>
           </w:p>
         </w:tc>
@@ -1484,6 +1618,41 @@
               <w:pStyle w:val="Compact"/>
             </w:pPr>
             <w:r>
+              <w:t xml:space="preserve">Dpre</w:t>
+            </w:r>
+          </w:p>
+        </w:tc>
+        <w:tc>
+          <w:tcPr/>
+          <w:p>
+            <w:pPr>
+              <w:pStyle w:val="Compact"/>
+            </w:pPr>
+            <w:r>
+              <w:t xml:space="preserve">Calendar days: onset minus most recent administered vaccination before/on onset; NA when vaccination-before-onset = No</w:t>
+            </w:r>
+          </w:p>
+        </w:tc>
+        <w:tc>
+          <w:tcPr/>
+          <w:p>
+            <w:pPr>
+              <w:pStyle w:val="Compact"/>
+            </w:pPr>
+            <w:r>
+              <w:t xml:space="preserve">Required when applicable</w:t>
+            </w:r>
+          </w:p>
+        </w:tc>
+      </w:tr>
+      <w:tr>
+        <w:tc>
+          <w:tcPr/>
+          <w:p>
+            <w:pPr>
+              <w:pStyle w:val="Compact"/>
+            </w:pPr>
+            <w:r>
               <w:t xml:space="preserve">Dpost</w:t>
             </w:r>
           </w:p>
@@ -1495,18 +1664,18 @@
               <w:pStyle w:val="Compact"/>
             </w:pPr>
             <w:r>
-              <w:t xml:space="preserve">Calendar days: first administered vaccination after onset minus onset</w:t>
-            </w:r>
-          </w:p>
-        </w:tc>
-        <w:tc>
-          <w:tcPr/>
-          <w:p>
-            <w:pPr>
-              <w:pStyle w:val="Compact"/>
-            </w:pPr>
-            <w:r>
-              <w:t xml:space="preserve">Required for primary normalized analysis</w:t>
+              <w:t xml:space="preserve">Calendar days: first administered vaccination after onset minus onset; NA if none is documented</w:t>
+            </w:r>
+          </w:p>
+        </w:tc>
+        <w:tc>
+          <w:tcPr/>
+          <w:p>
+            <w:pPr>
+              <w:pStyle w:val="Compact"/>
+            </w:pPr>
+            <w:r>
+              <w:t xml:space="preserve">Optional secondary timing variable</w:t>
             </w:r>
           </w:p>
         </w:tc>
@@ -1517,13 +1686,19 @@
         <w:pStyle w:val="BodyText"/>
       </w:pPr>
       <w:r>
-        <w:t xml:space="preserve">The three temporal data points supplied for each qualifying child are</w:t>
-      </w:r>
-      <w:r>
-        <w:t xml:space="preserve"> </w:t>
-      </w:r>
-      <w:r>
-        <w:t xml:space="preserve">age at onset, Dpre, and Dpost. Sex is the sole demographic variable. No</w:t>
+        <w:t xml:space="preserve">The patient-level dataset contains the seven variables shown above. Sex</w:t>
+      </w:r>
+      <w:r>
+        <w:t xml:space="preserve"> </w:t>
+      </w:r>
+      <w:r>
+        <w:t xml:space="preserve">is recorded as Female, Male, Intersex, or Unknown/not recorded; clinic</w:t>
+      </w:r>
+      <w:r>
+        <w:t xml:space="preserve"> </w:t>
+      </w:r>
+      <w:r>
+        <w:t xml:space="preserve">staff will not infer a value. No</w:t>
       </w:r>
       <w:r>
         <w:t xml:space="preserve"> </w:t>
@@ -1551,7 +1726,7 @@
       </w:r>
     </w:p>
     <w:bookmarkEnd w:id="20"/>
-    <w:bookmarkStart w:id="27" w:name="Xf9fabf6844541499ab840434c2ee93523a991e4"/>
+    <w:bookmarkStart w:id="28" w:name="Xf9fabf6844541499ab840434c2ee93523a991e4"/>
     <w:p>
       <w:pPr>
         <w:pStyle w:val="Heading2"/>
@@ -1571,69 +1746,108 @@
     </w:p>
     <w:p>
       <w:pPr>
+        <w:pStyle w:val="Compact"/>
         <w:numPr>
           <w:ilvl w:val="0"/>
           <w:numId w:val="1005"/>
         </w:numPr>
       </w:pPr>
       <w:r>
-        <w:t xml:space="preserve">Primary analysis set: all eligible records with exact or ≤48-hour</w:t>
-      </w:r>
-      <w:r>
-        <w:t xml:space="preserve"> </w:t>
-      </w:r>
-      <w:r>
-        <w:t xml:space="preserve">onset and valid vaccination dates on both sides of onset.</w:t>
-      </w:r>
-    </w:p>
-    <w:p>
-      <w:pPr>
+        <w:t xml:space="preserve">Age-reference analysis: all eligible SORA records with known</w:t>
+      </w:r>
+      <w:r>
+        <w:t xml:space="preserve"> </w:t>
+      </w:r>
+      <w:r>
+        <w:t xml:space="preserve">vaccination-before-onset status, regardless of whether a subsequent</w:t>
+      </w:r>
+      <w:r>
+        <w:t xml:space="preserve"> </w:t>
+      </w:r>
+      <w:r>
+        <w:t xml:space="preserve">vaccination occurred.</w:t>
+      </w:r>
+    </w:p>
+    <w:p>
+      <w:pPr>
+        <w:pStyle w:val="Compact"/>
         <w:numPr>
           <w:ilvl w:val="0"/>
           <w:numId w:val="1005"/>
         </w:numPr>
       </w:pPr>
       <w:r>
-        <w:t xml:space="preserve">Descriptive set: all eligible records, including those lacking a</w:t>
-      </w:r>
-      <w:r>
-        <w:t xml:space="preserve"> </w:t>
-      </w:r>
-      <w:r>
-        <w:t xml:space="preserve">subsequent vaccination.</w:t>
-      </w:r>
-    </w:p>
-    <w:p>
-      <w:pPr>
+        <w:t xml:space="preserve">Dpre analysis: eligible SORA records vaccinated before onset with a</w:t>
+      </w:r>
+      <w:r>
+        <w:t xml:space="preserve"> </w:t>
+      </w:r>
+      <w:r>
+        <w:t xml:space="preserve">verified preceding administration date. Dpost is not required.</w:t>
+      </w:r>
+    </w:p>
+    <w:p>
+      <w:pPr>
+        <w:pStyle w:val="Compact"/>
         <w:numPr>
           <w:ilvl w:val="0"/>
           <w:numId w:val="1005"/>
         </w:numPr>
       </w:pPr>
       <w:r>
-        <w:t xml:space="preserve">Sensitivity sets available from the received variables: intervals</w:t>
-      </w:r>
-      <w:r>
-        <w:t xml:space="preserve"> </w:t>
-      </w:r>
-      <w:r>
-        <w:t xml:space="preserve">≤[365] days, exclusion of same-day cases when ordering is unknown,</w:t>
-      </w:r>
-      <w:r>
-        <w:t xml:space="preserve"> </w:t>
-      </w:r>
-      <w:r>
-        <w:t xml:space="preserve">site-stratified results, and leave-one-site-out analyses.</w:t>
+        <w:t xml:space="preserve">Adjacent-interval analysis: the subset with verified vaccination dates</w:t>
+      </w:r>
+      <w:r>
+        <w:t xml:space="preserve"> </w:t>
+      </w:r>
+      <w:r>
+        <w:t xml:space="preserve">on both sides of onset; this is secondary because vaccination behavior</w:t>
+      </w:r>
+      <w:r>
+        <w:t xml:space="preserve"> </w:t>
+      </w:r>
+      <w:r>
+        <w:t xml:space="preserve">after onset may be affected by the onset itself.</w:t>
+      </w:r>
+    </w:p>
+    <w:p>
+      <w:pPr>
+        <w:pStyle w:val="Compact"/>
+        <w:numPr>
+          <w:ilvl w:val="0"/>
+          <w:numId w:val="1005"/>
+        </w:numPr>
+      </w:pPr>
+      <w:r>
+        <w:t xml:space="preserve">Aggregate 24-month analysis: clinic counts restricted to patients and</w:t>
+      </w:r>
+      <w:r>
+        <w:t xml:space="preserve"> </w:t>
+      </w:r>
+      <w:r>
+        <w:t xml:space="preserve">SORA cases whose records are sufficient to establish vaccination</w:t>
+      </w:r>
+      <w:r>
+        <w:t xml:space="preserve"> </w:t>
+      </w:r>
+      <w:r>
+        <w:t xml:space="preserve">status through 24 months. Unknown histories are excluded from both</w:t>
+      </w:r>
+      <w:r>
+        <w:t xml:space="preserve"> </w:t>
+      </w:r>
+      <w:r>
+        <w:t xml:space="preserve">numerator and denominator and reported separately.</w:t>
       </w:r>
     </w:p>
     <w:bookmarkEnd w:id="21"/>
-    <w:bookmarkStart w:id="22" w:name="Xdcadfc6d3aae39278edd7f0b28ab24ac048232e"/>
+    <w:bookmarkStart w:id="22" w:name="X7d3ebbf94b76a898032def6d14159704b33edf1"/>
     <w:p>
       <w:pPr>
         <w:pStyle w:val="Heading3"/>
       </w:pPr>
       <w:r>
-        <w:t xml:space="preserve">9.2 Primary estimands and tests</w:t>
+        <w:t xml:space="preserve">9.2 Age-at-onset reference analysis</w:t>
       </w:r>
     </w:p>
     <w:p>
@@ -1641,49 +1855,55 @@
         <w:pStyle w:val="FirstParagraph"/>
       </w:pPr>
       <w:r>
-        <w:t xml:space="preserve">For child i, let aᵢ=Dpre, bᵢ=Dpost, Lᵢ=aᵢ+bᵢ, and Uᵢ=aᵢ/Lᵢ. The primary</w:t>
-      </w:r>
-      <w:r>
-        <w:t xml:space="preserve"> </w:t>
-      </w:r>
-      <w:r>
-        <w:t xml:space="preserve">analysis evaluates whether U is Uniform(0,1) using a prespecified</w:t>
-      </w:r>
-      <w:r>
-        <w:t xml:space="preserve"> </w:t>
-      </w:r>
-      <w:r>
-        <w:t xml:space="preserve">one-sample Cramér–von Mises statistic with a Monte Carlo conditional</w:t>
-      </w:r>
-      <w:r>
-        <w:t xml:space="preserve"> </w:t>
-      </w:r>
-      <w:r>
-        <w:t xml:space="preserve">randomization distribution generated within each observed interval Lᵢ.</w:t>
-      </w:r>
-      <w:r>
-        <w:t xml:space="preserve"> </w:t>
-      </w:r>
-      <w:r>
-        <w:t xml:space="preserve">The primary directional contrast will test excess concentration near the</w:t>
-      </w:r>
-      <w:r>
-        <w:t xml:space="preserve"> </w:t>
-      </w:r>
-      <w:r>
-        <w:t xml:space="preserve">preceding vaccination using a prespecified statistic such as mean</w:t>
-      </w:r>
-      <w:r>
-        <w:t xml:space="preserve"> </w:t>
-      </w:r>
-      <w:r>
-        <w:t xml:space="preserve">−log[max(U,ε)]. The empirical cumulative distribution and histogram of</w:t>
-      </w:r>
-      <w:r>
-        <w:t xml:space="preserve"> </w:t>
-      </w:r>
-      <w:r>
-        <w:t xml:space="preserve">Dpre and U will be reported regardless of statistical significance.</w:t>
+        <w:t xml:space="preserve">The broad age-dependent SORA-onset curve will be estimated from all</w:t>
+      </w:r>
+      <w:r>
+        <w:t xml:space="preserve"> </w:t>
+      </w:r>
+      <w:r>
+        <w:t xml:space="preserve">qualifying cases using age in whole days. Before database lock, the</w:t>
+      </w:r>
+      <w:r>
+        <w:t xml:space="preserve"> </w:t>
+      </w:r>
+      <w:r>
+        <w:t xml:space="preserve">statistician will prespecify a smoothing scale substantially wider than</w:t>
+      </w:r>
+      <w:r>
+        <w:t xml:space="preserve"> </w:t>
+      </w:r>
+      <w:r>
+        <w:t xml:space="preserve">the 1–7-day windows being examined, so short localized peaks are not</w:t>
+      </w:r>
+      <w:r>
+        <w:t xml:space="preserve"> </w:t>
+      </w:r>
+      <w:r>
+        <w:t xml:space="preserve">absorbed into the developmental-age trend. Estimation will be</w:t>
+      </w:r>
+      <w:r>
+        <w:t xml:space="preserve"> </w:t>
+      </w:r>
+      <w:r>
+        <w:t xml:space="preserve">cross-fitted by site: each site's expected age curve will be estimated</w:t>
+      </w:r>
+      <w:r>
+        <w:t xml:space="preserve"> </w:t>
+      </w:r>
+      <w:r>
+        <w:t xml:space="preserve">without that site's cases, or by another prespecified cross-fitting</w:t>
+      </w:r>
+      <w:r>
+        <w:t xml:space="preserve"> </w:t>
+      </w:r>
+      <w:r>
+        <w:t xml:space="preserve">scheme appropriate to site sizes. Raw age histograms, the smooth curve,</w:t>
+      </w:r>
+      <w:r>
+        <w:t xml:space="preserve"> </w:t>
+      </w:r>
+      <w:r>
+        <w:t xml:space="preserve">site-specific displays, and leave-one-site-out results will be shown.</w:t>
       </w:r>
     </w:p>
     <w:p>
@@ -1691,71 +1911,558 @@
         <w:pStyle w:val="BodyText"/>
       </w:pPr>
       <w:r>
-        <w:t xml:space="preserve">The 0–2-day and 0–7-day windows are prespecified key secondary</w:t>
-      </w:r>
-      <w:r>
-        <w:t xml:space="preserve"> </w:t>
-      </w:r>
-      <w:r>
-        <w:t xml:space="preserve">estimands. For a window 0–w, the null probability for child i is</w:t>
-      </w:r>
-      <w:r>
-        <w:t xml:space="preserve"> </w:t>
-      </w:r>
-      <w:r>
-        <w:t xml:space="preserve">min((w+1)/Lᵢ,1) when eligible discrete onset days are 0,…,Lᵢ−1;</w:t>
-      </w:r>
-      <w:r>
-        <w:t xml:space="preserve"> </w:t>
-      </w:r>
-      <w:r>
-        <w:t xml:space="preserve">conventions will be fixed before database lock. Each observed count will</w:t>
-      </w:r>
-      <w:r>
-        <w:t xml:space="preserve"> </w:t>
-      </w:r>
-      <w:r>
-        <w:t xml:space="preserve">be compared with its Poisson-binomial null distribution. Report observed</w:t>
-      </w:r>
-      <w:r>
-        <w:t xml:space="preserve"> </w:t>
-      </w:r>
-      <w:r>
-        <w:t xml:space="preserve">and expected proportions, risk ratios, risk differences, 95% confidence</w:t>
-      </w:r>
-      <w:r>
-        <w:t xml:space="preserve"> </w:t>
-      </w:r>
-      <w:r>
-        <w:t xml:space="preserve">intervals, and multiplicity-adjusted p values. Holm correction will</w:t>
-      </w:r>
-      <w:r>
-        <w:t xml:space="preserve"> </w:t>
-      </w:r>
-      <w:r>
-        <w:t xml:space="preserve">control family-wise α=0.05 across the primary omnibus/directional test</w:t>
-      </w:r>
-      <w:r>
-        <w:t xml:space="preserve"> </w:t>
-      </w:r>
-      <w:r>
-        <w:t xml:space="preserve">family and the two key windows, as finalized by the statistician before</w:t>
-      </w:r>
-      <w:r>
-        <w:t xml:space="preserve"> </w:t>
-      </w:r>
-      <w:r>
-        <w:t xml:space="preserve">database lock.</w:t>
+        <w:t xml:space="preserve">For secondary age-adjusted analyses among cases with both adjacent</w:t>
+      </w:r>
+      <w:r>
+        <w:t xml:space="preserve"> </w:t>
+      </w:r>
+      <w:r>
+        <w:t xml:space="preserve">vaccination dates, the expected probability of onset on each eligible</w:t>
+      </w:r>
+      <w:r>
+        <w:t xml:space="preserve"> </w:t>
+      </w:r>
+      <w:r>
+        <w:t xml:space="preserve">day in the interval will be proportional to the cross-fitted smooth</w:t>
+      </w:r>
+      <w:r>
+        <w:t xml:space="preserve"> </w:t>
+      </w:r>
+      <w:r>
+        <w:t xml:space="preserve">onset frequency at that developmental age rather than assumed uniform.</w:t>
+      </w:r>
+      <w:r>
+        <w:t xml:space="preserve"> </w:t>
+      </w:r>
+      <w:r>
+        <w:t xml:space="preserve">The clinic-transmitted variables permit reconstruction of age at the</w:t>
+      </w:r>
+      <w:r>
+        <w:t xml:space="preserve"> </w:t>
+      </w:r>
+      <w:r>
+        <w:t xml:space="preserve">preceding vaccination as age-at-onset-days minus Dpre and age at the</w:t>
+      </w:r>
+      <w:r>
+        <w:t xml:space="preserve"> </w:t>
+      </w:r>
+      <w:r>
+        <w:t xml:space="preserve">subsequent vaccination as age-at-onset-days plus Dpost, without</w:t>
+      </w:r>
+      <w:r>
+        <w:t xml:space="preserve"> </w:t>
+      </w:r>
+      <w:r>
+        <w:t xml:space="preserve">transmitting calendar dates. Unvaccinated-before-onset cases will be</w:t>
+      </w:r>
+      <w:r>
+        <w:t xml:space="preserve"> </w:t>
+      </w:r>
+      <w:r>
+        <w:t xml:space="preserve">shown separately as a supplementary comparison, not as the sole source</w:t>
+      </w:r>
+      <w:r>
+        <w:t xml:space="preserve"> </w:t>
+      </w:r>
+      <w:r>
+        <w:t xml:space="preserve">of the baseline curve.</w:t>
+      </w:r>
+    </w:p>
+    <w:p>
+      <w:pPr>
+        <w:pStyle w:val="BodyText"/>
+      </w:pPr>
+      <w:r>
+        <w:t xml:space="preserve">The age curve is estimated from a selected case series and could contain</w:t>
+      </w:r>
+      <w:r>
+        <w:t xml:space="preserve"> </w:t>
+      </w:r>
+      <w:r>
+        <w:t xml:space="preserve">effects of vaccination or ascertainment. Cross-fitting and broad</w:t>
+      </w:r>
+      <w:r>
+        <w:t xml:space="preserve"> </w:t>
+      </w:r>
+      <w:r>
+        <w:t xml:space="preserve">smoothing reduce circularity but do not eliminate it; therefore this</w:t>
+      </w:r>
+      <w:r>
+        <w:t xml:space="preserve"> </w:t>
+      </w:r>
+      <w:r>
+        <w:t xml:space="preserve">analysis remains exploratory and does not estimate incidence or a causal</w:t>
+      </w:r>
+      <w:r>
+        <w:t xml:space="preserve"> </w:t>
+      </w:r>
+      <w:r>
+        <w:t xml:space="preserve">effect.</w:t>
       </w:r>
     </w:p>
     <w:bookmarkEnd w:id="22"/>
-    <w:bookmarkStart w:id="23" w:name="X0bf3bfb05e5227aa7e5efd4bc59375d9a94bcb5"/>
+    <w:bookmarkStart w:id="23" w:name="Xcbd04d51aa7c3c1d1728a482d130d52820496be"/>
     <w:p>
       <w:pPr>
         <w:pStyle w:val="Heading3"/>
       </w:pPr>
       <w:r>
-        <w:t xml:space="preserve">9.3 Secondary and exploratory analyses</w:t>
+        <w:t xml:space="preserve">9.3 Dpre timing analysis</w:t>
+      </w:r>
+    </w:p>
+    <w:p>
+      <w:pPr>
+        <w:pStyle w:val="FirstParagraph"/>
+      </w:pPr>
+      <w:r>
+        <w:t xml:space="preserve">For cases vaccinated before onset, the complete integer-day Dpre</w:t>
+      </w:r>
+      <w:r>
+        <w:t xml:space="preserve"> </w:t>
+      </w:r>
+      <w:r>
+        <w:t xml:space="preserve">distribution will be shown with raw counts, proportions, an empirical</w:t>
+      </w:r>
+      <w:r>
+        <w:t xml:space="preserve"> </w:t>
+      </w:r>
+      <w:r>
+        <w:t xml:space="preserve">cumulative distribution, and site-stratified results. Prespecified</w:t>
+      </w:r>
+      <w:r>
+        <w:t xml:space="preserve"> </w:t>
+      </w:r>
+      <w:r>
+        <w:t xml:space="preserve">descriptive windows are 0–2 and 0–7 days. A moving-window scan will</w:t>
+      </w:r>
+      <w:r>
+        <w:t xml:space="preserve"> </w:t>
+      </w:r>
+      <w:r>
+        <w:t xml:space="preserve">evaluate every contiguous window of width 1–7 days with endpoints within</w:t>
+      </w:r>
+      <w:r>
+        <w:t xml:space="preserve"> </w:t>
+      </w:r>
+      <w:r>
+        <w:t xml:space="preserve">days 0–30, including a possible days 2–4 peak. The maximum standardized</w:t>
+      </w:r>
+      <w:r>
+        <w:t xml:space="preserve"> </w:t>
+      </w:r>
+      <w:r>
+        <w:t xml:space="preserve">excess statistic and its randomization-adjusted p value may be reported</w:t>
+      </w:r>
+      <w:r>
+        <w:t xml:space="preserve"> </w:t>
+      </w:r>
+      <w:r>
+        <w:t xml:space="preserve">only under a statistician-approved null model finalized before database</w:t>
+      </w:r>
+      <w:r>
+        <w:t xml:space="preserve"> </w:t>
+      </w:r>
+      <w:r>
+        <w:t xml:space="preserve">lock; otherwise the scan is descriptive. The selected peak will always</w:t>
+      </w:r>
+      <w:r>
+        <w:t xml:space="preserve"> </w:t>
+      </w:r>
+      <w:r>
+        <w:t xml:space="preserve">be labeled data-adaptive. The protocol does not assume onset is uniform</w:t>
+      </w:r>
+      <w:r>
+        <w:t xml:space="preserve"> </w:t>
+      </w:r>
+      <w:r>
+        <w:t xml:space="preserve">between vaccinations.</w:t>
+      </w:r>
+    </w:p>
+    <w:p>
+      <w:pPr>
+        <w:pStyle w:val="BodyText"/>
+      </w:pPr>
+      <w:r>
+        <w:t xml:space="preserve">The normalized position U=Dpre/(Dpre+Dpost) will be reported only as a</w:t>
+      </w:r>
+      <w:r>
+        <w:t xml:space="preserve"> </w:t>
+      </w:r>
+      <w:r>
+        <w:t xml:space="preserve">secondary sensitivity analysis among cases with a later vaccination. No</w:t>
+      </w:r>
+      <w:r>
+        <w:t xml:space="preserve"> </w:t>
+      </w:r>
+      <w:r>
+        <w:t xml:space="preserve">causal or confirmatory inference will rely on that complete-case subset.</w:t>
+      </w:r>
+    </w:p>
+    <w:bookmarkEnd w:id="23"/>
+    <w:bookmarkStart w:id="24" w:name="Xc2c9b5fbf3d3664e5a49a3368a3a6c3d0836356"/>
+    <w:p>
+      <w:pPr>
+        <w:pStyle w:val="Heading3"/>
+      </w:pPr>
+      <w:r>
+        <w:t xml:space="preserve">9.4 Aggregate 24-month comparison</w:t>
+      </w:r>
+    </w:p>
+    <w:p>
+      <w:pPr>
+        <w:pStyle w:val="FirstParagraph"/>
+      </w:pPr>
+      <w:r>
+        <w:t xml:space="preserve">Each clinic will provide separately from the patient-level file: (1) all</w:t>
+      </w:r>
+      <w:r>
+        <w:t xml:space="preserve"> </w:t>
+      </w:r>
+      <w:r>
+        <w:t xml:space="preserve">clinic patients with records sufficient to establish vaccination status</w:t>
+      </w:r>
+      <w:r>
+        <w:t xml:space="preserve"> </w:t>
+      </w:r>
+      <w:r>
+        <w:t xml:space="preserve">through 24 months; (2) those patients with no documented vaccination</w:t>
+      </w:r>
+      <w:r>
+        <w:t xml:space="preserve"> </w:t>
+      </w:r>
+      <w:r>
+        <w:t xml:space="preserve">through 24 months; (3) qualifying SORA cases with sufficient records to</w:t>
+      </w:r>
+      <w:r>
+        <w:t xml:space="preserve"> </w:t>
+      </w:r>
+      <w:r>
+        <w:t xml:space="preserve">establish vaccination status through 24 months; and (4) those SORA cases</w:t>
+      </w:r>
+      <w:r>
+        <w:t xml:space="preserve"> </w:t>
+      </w:r>
+      <w:r>
+        <w:t xml:space="preserve">with no documented vaccination through 24 months. The proportion</w:t>
+      </w:r>
+      <w:r>
+        <w:t xml:space="preserve"> </w:t>
+      </w:r>
+      <w:r>
+        <w:t xml:space="preserve">unvaccinated through 24 months among SORA cases will be compared with the</w:t>
+      </w:r>
+      <w:r>
+        <w:t xml:space="preserve"> </w:t>
+      </w:r>
+      <w:r>
+        <w:t xml:space="preserve">corresponding proportion in the clinic source population using</w:t>
+      </w:r>
+      <w:r>
+        <w:t xml:space="preserve"> </w:t>
+      </w:r>
+      <w:r>
+        <w:t xml:space="preserve">site-stratified estimates and a pooled method prespecified by the</w:t>
+      </w:r>
+      <w:r>
+        <w:t xml:space="preserve"> </w:t>
+      </w:r>
+      <w:r>
+        <w:t xml:space="preserve">statistician. These aggregate counts contain no patient-level data.</w:t>
+      </w:r>
+    </w:p>
+    <w:p>
+      <w:pPr>
+        <w:pStyle w:val="BodyText"/>
+      </w:pPr>
+      <w:r>
+        <w:t xml:space="preserve">This exploratory comparison does not estimate population-level vaccine</w:t>
+      </w:r>
+      <w:r>
+        <w:t xml:space="preserve"> </w:t>
+      </w:r>
+      <w:r>
+        <w:t xml:space="preserve">effects unless the clinic source population and follow-up are complete</w:t>
+      </w:r>
+      <w:r>
+        <w:t xml:space="preserve"> </w:t>
+      </w:r>
+      <w:r>
+        <w:t xml:space="preserve">and comparable. Unknown or incomplete histories will never be classified</w:t>
+      </w:r>
+      <w:r>
+        <w:t xml:space="preserve"> </w:t>
+      </w:r>
+      <w:r>
+        <w:t xml:space="preserve">as unvaccinated.</w:t>
+      </w:r>
+    </w:p>
+    <w:bookmarkEnd w:id="24"/>
+    <w:bookmarkStart w:id="25" w:name="X170c0877b138649bffbe8304ee693384b59d60d"/>
+    <w:p>
+      <w:pPr>
+        <w:pStyle w:val="Heading3"/>
+      </w:pPr>
+      <w:r>
+        <w:t xml:space="preserve">9.5 Missing data, site effects, and multiplicity</w:t>
+      </w:r>
+    </w:p>
+    <w:p>
+      <w:pPr>
+        <w:pStyle w:val="FirstParagraph"/>
+      </w:pPr>
+      <w:r>
+        <w:t xml:space="preserve">Missing Dpost does not exclude a case from the age-reference or Dpre</w:t>
+      </w:r>
+      <w:r>
+        <w:t xml:space="preserve"> </w:t>
+      </w:r>
+      <w:r>
+        <w:t xml:space="preserve">analyses. Missingness and exclusions will be reported by site and, when</w:t>
+      </w:r>
+      <w:r>
+        <w:t xml:space="preserve"> </w:t>
+      </w:r>
+      <w:r>
+        <w:t xml:space="preserve">observable, by age, sex, vaccination-before-onset status, and Dpre. Site</w:t>
+      </w:r>
+      <w:r>
+        <w:t xml:space="preserve"> </w:t>
+      </w:r>
+      <w:r>
+        <w:t xml:space="preserve">heterogeneity is an estimand; analyses will include site-stratified and</w:t>
+      </w:r>
+      <w:r>
+        <w:t xml:space="preserve"> </w:t>
+      </w:r>
+      <w:r>
+        <w:t xml:space="preserve">leave-one-site-out results. With only five or a small number of sites,</w:t>
+      </w:r>
+      <w:r>
+        <w:t xml:space="preserve"> </w:t>
+      </w:r>
+      <w:r>
+        <w:t xml:space="preserve">the statistician will use a small-sample-valid fixed-effect,</w:t>
+      </w:r>
+      <w:r>
+        <w:t xml:space="preserve"> </w:t>
+      </w:r>
+      <w:r>
+        <w:t xml:space="preserve">randomization, or hierarchical method rather than uncorrected</w:t>
+      </w:r>
+      <w:r>
+        <w:t xml:space="preserve"> </w:t>
+      </w:r>
+      <w:r>
+        <w:t xml:space="preserve">cluster-robust standard errors. Confirmatory and exploratory analyses,</w:t>
+      </w:r>
+      <w:r>
+        <w:t xml:space="preserve"> </w:t>
+      </w:r>
+      <w:r>
+        <w:t xml:space="preserve">if any, and their multiplicity family will be frozen before database</w:t>
+      </w:r>
+      <w:r>
+        <w:t xml:space="preserve"> </w:t>
+      </w:r>
+      <w:r>
+        <w:t xml:space="preserve">lock. No record will be excluded because its timing value is unfavorable</w:t>
+      </w:r>
+      <w:r>
+        <w:t xml:space="preserve"> </w:t>
+      </w:r>
+      <w:r>
+        <w:t xml:space="preserve">to a hypothesis.</w:t>
+      </w:r>
+    </w:p>
+    <w:bookmarkEnd w:id="25"/>
+    <w:bookmarkStart w:id="26" w:name="Xd9e05f5c57bd1dc1192502d5e02374e10a1dbf0"/>
+    <w:p>
+      <w:pPr>
+        <w:pStyle w:val="Heading3"/>
+      </w:pPr>
+      <w:r>
+        <w:t xml:space="preserve">9.6 Sample size</w:t>
+      </w:r>
+    </w:p>
+    <w:p>
+      <w:pPr>
+        <w:pStyle w:val="FirstParagraph"/>
+      </w:pPr>
+      <w:r>
+        <w:t xml:space="preserve">The study will target at least 300 eligible records from at least five</w:t>
+      </w:r>
+      <w:r>
+        <w:t xml:space="preserve"> </w:t>
+      </w:r>
+      <w:r>
+        <w:t xml:space="preserve">clinics. The final sample-size calculation must be completed by the</w:t>
+      </w:r>
+      <w:r>
+        <w:t xml:space="preserve"> </w:t>
+      </w:r>
+      <w:r>
+        <w:t xml:space="preserve">study statistician using conservative age-curve shapes, alternative</w:t>
+      </w:r>
+      <w:r>
+        <w:t xml:space="preserve"> </w:t>
+      </w:r>
+      <w:r>
+        <w:t xml:space="preserve">smoothing scales, short-window concentrations including a days 2–4</w:t>
+      </w:r>
+      <w:r>
+        <w:t xml:space="preserve"> </w:t>
+      </w:r>
+      <w:r>
+        <w:t xml:space="preserve">peak, unequal site contributions,</w:t>
+      </w:r>
+      <w:r>
+        <w:t xml:space="preserve"> </w:t>
+      </w:r>
+      <w:r>
+        <w:t xml:space="preserve">within-site dependence, missing Dpost, and any multiplicity adjustment.</w:t>
+      </w:r>
+      <w:r>
+        <w:t xml:space="preserve"> </w:t>
+      </w:r>
+      <w:r>
+        <w:t xml:space="preserve">The simulation and its assumptions will be finalized before IRB approval</w:t>
+      </w:r>
+      <w:r>
+        <w:t xml:space="preserve"> </w:t>
+      </w:r>
+      <w:r>
+        <w:t xml:space="preserve">and data collection and will not use observed study outcomes to stop or</w:t>
+      </w:r>
+      <w:r>
+        <w:t xml:space="preserve"> </w:t>
+      </w:r>
+      <w:r>
+        <w:t xml:space="preserve">extend enrollment.</w:t>
+      </w:r>
+    </w:p>
+    <w:bookmarkEnd w:id="26"/>
+    <w:bookmarkStart w:id="27" w:name="Xd04103762daf08f52f583ea17d52cd2b8ea3643"/>
+    <w:p>
+      <w:pPr>
+        <w:pStyle w:val="Heading3"/>
+      </w:pPr>
+      <w:r>
+        <w:t xml:space="preserve">9.7 Interpretation limits</w:t>
+      </w:r>
+    </w:p>
+    <w:p>
+      <w:pPr>
+        <w:pStyle w:val="FirstParagraph"/>
+      </w:pPr>
+      <w:r>
+        <w:t xml:space="preserve">This case-series design cannot estimate ASD incidence or</w:t>
+      </w:r>
+      <w:r>
+        <w:t xml:space="preserve"> </w:t>
+      </w:r>
+      <w:r>
+        <w:t xml:space="preserve">vaccine-attributable risk, or by itself distinguish a causal trigger from</w:t>
+      </w:r>
+      <w:r>
+        <w:t xml:space="preserve"> </w:t>
+      </w:r>
+      <w:r>
+        <w:t xml:space="preserve">recall anchoring, healthcare-contact patterns, concurrent illness,</w:t>
+      </w:r>
+      <w:r>
+        <w:t xml:space="preserve"> </w:t>
+      </w:r>
+      <w:r>
+        <w:t xml:space="preserve">age-related developmental change, or selective documentation.</w:t>
+      </w:r>
+      <w:r>
+        <w:t xml:space="preserve"> </w:t>
+      </w:r>
+      <w:r>
+        <w:t xml:space="preserve">Conclusions will be limited to age and temporal distributions in the</w:t>
+      </w:r>
+      <w:r>
+        <w:t xml:space="preserve"> </w:t>
+      </w:r>
+      <w:r>
+        <w:t xml:space="preserve">defined cohort and the exploratory 24-month proportions within</w:t>
+      </w:r>
+      <w:r>
+        <w:t xml:space="preserve"> </w:t>
+      </w:r>
+      <w:r>
+        <w:t xml:space="preserve">participating clinics.</w:t>
+      </w:r>
+    </w:p>
+    <w:bookmarkEnd w:id="27"/>
+    <w:bookmarkEnd w:id="28"/>
+    <w:bookmarkStart w:id="29" w:name="X8ce97a550421320c70f07bfcc10976969dcc001"/>
+    <w:p>
+      <w:pPr>
+        <w:pStyle w:val="Heading2"/>
+      </w:pPr>
+      <w:r>
+        <w:t xml:space="preserve">10. Risks, benefits, and safeguards</w:t>
+      </w:r>
+    </w:p>
+    <w:p>
+      <w:pPr>
+        <w:pStyle w:val="FirstParagraph"/>
+      </w:pPr>
+      <w:r>
+        <w:t xml:space="preserve">There is no intervention and no direct participant benefit. Principal</w:t>
+      </w:r>
+      <w:r>
+        <w:t xml:space="preserve"> </w:t>
+      </w:r>
+      <w:r>
+        <w:t xml:space="preserve">risk is informational: re-identification or unwanted disclosure of a</w:t>
+      </w:r>
+      <w:r>
+        <w:t xml:space="preserve"> </w:t>
+      </w:r>
+      <w:r>
+        <w:t xml:space="preserve">child’s developmental and vaccination history. Risk is minimized by</w:t>
+      </w:r>
+      <w:r>
+        <w:t xml:space="preserve"> </w:t>
+      </w:r>
+      <w:r>
+        <w:t xml:space="preserve">site-level abstraction; no central access to PHI; no direct identifiers,</w:t>
+      </w:r>
+      <w:r>
+        <w:t xml:space="preserve"> </w:t>
+      </w:r>
+      <w:r>
+        <w:t xml:space="preserve">exact dates, free text, or MRN-derived codes; encrypted transfer and</w:t>
+      </w:r>
+      <w:r>
+        <w:t xml:space="preserve"> </w:t>
+      </w:r>
+      <w:r>
+        <w:t xml:space="preserve">storage; least-privilege access; audit logging;</w:t>
+      </w:r>
+      <w:r>
+        <w:t xml:space="preserve"> </w:t>
+      </w:r>
+      <w:r>
+        <w:t xml:space="preserve">suppression/generalization for public release; and incident-response</w:t>
+      </w:r>
+      <w:r>
+        <w:t xml:space="preserve"> </w:t>
+      </w:r>
+      <w:r>
+        <w:t xml:space="preserve">procedures. Record inclusion will not affect a child's care or services.</w:t>
+      </w:r>
+    </w:p>
+    <w:bookmarkEnd w:id="29"/>
+    <w:bookmarkStart w:id="30" w:name="X924529b758df2bb5b0bf97f11a5774f23e51811"/>
+    <w:p>
+      <w:pPr>
+        <w:pStyle w:val="Heading2"/>
+      </w:pPr>
+      <w:r>
+        <w:t xml:space="preserve">11. Quality assurance and reproducibility</w:t>
       </w:r>
     </w:p>
     <w:p>
@@ -1766,19 +2473,13 @@
         </w:numPr>
       </w:pPr>
       <w:r>
-        <w:t xml:space="preserve">Risk windows 0–1, 0–2, 0–7, 8–14, and 15–30 days, with exact</w:t>
-      </w:r>
-      <w:r>
-        <w:t xml:space="preserve"> </w:t>
-      </w:r>
-      <w:r>
-        <w:t xml:space="preserve">exposure-opportunity denominators. The 0–2 and 0–7 windows are key</w:t>
-      </w:r>
-      <w:r>
-        <w:t xml:space="preserve"> </w:t>
-      </w:r>
-      <w:r>
-        <w:t xml:space="preserve">secondary; the remaining windows are exploratory.</w:t>
+        <w:t xml:space="preserve">Training manual and worked examples for onset and vaccination-date</w:t>
+      </w:r>
+      <w:r>
+        <w:t xml:space="preserve"> </w:t>
+      </w:r>
+      <w:r>
+        <w:t xml:space="preserve">abstraction.</w:t>
       </w:r>
     </w:p>
     <w:p>
@@ -1789,61 +2490,13 @@
         </w:numPr>
       </w:pPr>
       <w:r>
-        <w:t xml:space="preserve">Empirical cumulative distribution, histogram, and kernel density</w:t>
-      </w:r>
-      <w:r>
-        <w:t xml:space="preserve"> </w:t>
-      </w:r>
-      <w:r>
-        <w:t xml:space="preserve">(descriptive only). A prespecified moving-window scan will evaluate</w:t>
-      </w:r>
-      <w:r>
-        <w:t xml:space="preserve"> </w:t>
-      </w:r>
-      <w:r>
-        <w:t xml:space="preserve">every contiguous window of width 1–7 days whose endpoints fall within</w:t>
-      </w:r>
-      <w:r>
-        <w:t xml:space="preserve"> </w:t>
-      </w:r>
-      <w:r>
-        <w:t xml:space="preserve">days 0–30 (for example, days 2–4). The test statistic will be the</w:t>
-      </w:r>
-      <w:r>
-        <w:t xml:space="preserve"> </w:t>
-      </w:r>
-      <w:r>
-        <w:t xml:space="preserve">largest standardized observed-minus-expected excess across all scanned</w:t>
-      </w:r>
-      <w:r>
-        <w:t xml:space="preserve"> </w:t>
-      </w:r>
-      <w:r>
-        <w:t xml:space="preserve">windows. Its p value and simultaneous uncertainty will be obtained</w:t>
-      </w:r>
-      <w:r>
-        <w:t xml:space="preserve"> </w:t>
-      </w:r>
-      <w:r>
-        <w:t xml:space="preserve">from the conditional randomization distribution of that maximum</w:t>
-      </w:r>
-      <w:r>
-        <w:t xml:space="preserve"> </w:t>
-      </w:r>
-      <w:r>
-        <w:t xml:space="preserve">statistic, thereby accounting for searching across window locations</w:t>
-      </w:r>
-      <w:r>
-        <w:t xml:space="preserve"> </w:t>
-      </w:r>
-      <w:r>
-        <w:t xml:space="preserve">and widths. The window with the largest excess will be reported as</w:t>
-      </w:r>
-      <w:r>
-        <w:t xml:space="preserve"> </w:t>
-      </w:r>
-      <w:r>
-        <w:t xml:space="preserve">data-adaptive and not as an independently prespecified effect.</w:t>
+        <w:t xml:space="preserve">Pilot abstraction of at least 10 records per site and inter-rater</w:t>
+      </w:r>
+      <w:r>
+        <w:t xml:space="preserve"> </w:t>
+      </w:r>
+      <w:r>
+        <w:t xml:space="preserve">agreement reporting.</w:t>
       </w:r>
     </w:p>
     <w:p>
@@ -1854,13 +2507,13 @@
         </w:numPr>
       </w:pPr>
       <w:r>
-        <w:t xml:space="preserve">Stratification by age band and sex when cell sizes permit. No subgroup</w:t>
-      </w:r>
-      <w:r>
-        <w:t xml:space="preserve"> </w:t>
-      </w:r>
-      <w:r>
-        <w:t xml:space="preserve">causal claims.</w:t>
+        <w:t xml:space="preserve">Publicly timestamped preregistration and frozen protocol, data</w:t>
+      </w:r>
+      <w:r>
+        <w:t xml:space="preserve"> </w:t>
+      </w:r>
+      <w:r>
+        <w:t xml:space="preserve">dictionary, and statistical code before database lock.</w:t>
       </w:r>
     </w:p>
     <w:p>
@@ -1871,31 +2524,13 @@
         </w:numPr>
       </w:pPr>
       <w:r>
-        <w:t xml:space="preserve">Site-stratified estimates, leave-one-site-out analyses, and a</w:t>
-      </w:r>
-      <w:r>
-        <w:t xml:space="preserve"> </w:t>
-      </w:r>
-      <w:r>
-        <w:t xml:space="preserve">site-level random effect or other cluster-robust method selected by the</w:t>
-      </w:r>
-      <w:r>
-        <w:t xml:space="preserve"> </w:t>
-      </w:r>
-      <w:r>
-        <w:t xml:space="preserve">statistician. No single clinic will be described as an independent</w:t>
-      </w:r>
-      <w:r>
-        <w:t xml:space="preserve"> </w:t>
-      </w:r>
-      <w:r>
-        <w:t xml:space="preserve">replication unless its sample size and prespecified analysis support</w:t>
-      </w:r>
-      <w:r>
-        <w:t xml:space="preserve"> </w:t>
-      </w:r>
-      <w:r>
-        <w:t xml:space="preserve">that characterization.</w:t>
+        <w:t xml:space="preserve">Aggregate screening flow by site and a reproducible analysis</w:t>
+      </w:r>
+      <w:r>
+        <w:t xml:space="preserve"> </w:t>
+      </w:r>
+      <w:r>
+        <w:t xml:space="preserve">repository.</w:t>
       </w:r>
     </w:p>
     <w:p>
@@ -1906,58 +2541,23 @@
         </w:numPr>
       </w:pPr>
       <w:r>
-        <w:t xml:space="preserve">Sensitivity to heaping at 0, 1, 7, 14, and 30 days; interval-censored</w:t>
-      </w:r>
-      <w:r>
-        <w:t xml:space="preserve"> </w:t>
-      </w:r>
-      <w:r>
-        <w:t xml:space="preserve">onset; alternative handling of simultaneous onset/vaccination; and</w:t>
-      </w:r>
-      <w:r>
-        <w:t xml:space="preserve"> </w:t>
-      </w:r>
-      <w:r>
-        <w:t xml:space="preserve">exclusion of long inter-vaccination intervals.</w:t>
-      </w:r>
-    </w:p>
-    <w:p>
-      <w:pPr>
-        <w:numPr>
-          <w:ilvl w:val="0"/>
-          <w:numId w:val="1006"/>
-        </w:numPr>
-      </w:pPr>
-      <w:r>
-        <w:t xml:space="preserve">Negative-control assessment, if available, using timing from onset to</w:t>
-      </w:r>
-      <w:r>
-        <w:t xml:space="preserve"> </w:t>
-      </w:r>
-      <w:r>
-        <w:t xml:space="preserve">non-vaccine routine visits or vaccination dates after onset. Such</w:t>
-      </w:r>
-      <w:r>
-        <w:t xml:space="preserve"> </w:t>
-      </w:r>
-      <w:r>
-        <w:t xml:space="preserve">analyses require an amended instrument and analysis plan before</w:t>
-      </w:r>
-      <w:r>
-        <w:t xml:space="preserve"> </w:t>
-      </w:r>
-      <w:r>
-        <w:t xml:space="preserve">database lock.</w:t>
-      </w:r>
-    </w:p>
-    <w:bookmarkEnd w:id="23"/>
-    <w:bookmarkStart w:id="24" w:name="X3789bc08f565d4ef57f1eefb9d3c2c76b7665ab"/>
-    <w:p>
-      <w:pPr>
-        <w:pStyle w:val="Heading3"/>
-      </w:pPr>
-      <w:r>
-        <w:t xml:space="preserve">9.4 Missing data, exclusions, and multiplicity</w:t>
+        <w:t xml:space="preserve">Independent statistical review before public claims or manuscript</w:t>
+      </w:r>
+      <w:r>
+        <w:t xml:space="preserve"> </w:t>
+      </w:r>
+      <w:r>
+        <w:t xml:space="preserve">submission.</w:t>
+      </w:r>
+    </w:p>
+    <w:bookmarkEnd w:id="30"/>
+    <w:bookmarkStart w:id="31" w:name="X4c8c0127a27889c36b522e8e8c19f99d7d4efcd"/>
+    <w:p>
+      <w:pPr>
+        <w:pStyle w:val="Heading2"/>
+      </w:pPr>
+      <w:r>
+        <w:t xml:space="preserve">12. Dissemination</w:t>
       </w:r>
     </w:p>
     <w:p>
@@ -1965,228 +2565,87 @@
         <w:pStyle w:val="FirstParagraph"/>
       </w:pPr>
       <w:r>
-        <w:t xml:space="preserve">Missing required dates will not be imputed for the primary analysis.</w:t>
-      </w:r>
-      <w:r>
-        <w:t xml:space="preserve"> </w:t>
-      </w:r>
-      <w:r>
-        <w:t xml:space="preserve">Counts and reasons for missingness will be reported by clinic. No record</w:t>
-      </w:r>
-      <w:r>
-        <w:t xml:space="preserve"> </w:t>
-      </w:r>
-      <w:r>
-        <w:t xml:space="preserve">will be excluded based on the magnitude or direction of Dpre/Dpost after</w:t>
-      </w:r>
-      <w:r>
-        <w:t xml:space="preserve"> </w:t>
-      </w:r>
-      <w:r>
-        <w:t xml:space="preserve">eligibility is determined. All deviations, exclusions, and analytic</w:t>
-      </w:r>
-      <w:r>
-        <w:t xml:space="preserve"> </w:t>
-      </w:r>
-      <w:r>
-        <w:t xml:space="preserve">decisions will be logged before unblinding aggregate results.</w:t>
-      </w:r>
-      <w:r>
-        <w:t xml:space="preserve"> </w:t>
-      </w:r>
-      <w:r>
-        <w:t xml:space="preserve">Exploratory p values will be labeled unadjusted or adjusted as</w:t>
-      </w:r>
-      <w:r>
-        <w:t xml:space="preserve"> </w:t>
-      </w:r>
-      <w:r>
-        <w:t xml:space="preserve">applicable.</w:t>
-      </w:r>
-    </w:p>
-    <w:bookmarkEnd w:id="24"/>
-    <w:bookmarkStart w:id="25" w:name="X977b1f9792fe25a04123a317ff8857bdff89d72"/>
-    <w:p>
-      <w:pPr>
-        <w:pStyle w:val="Heading3"/>
-      </w:pPr>
-      <w:r>
-        <w:t xml:space="preserve">9.5 Sample size</w:t>
-      </w:r>
-    </w:p>
-    <w:p>
-      <w:pPr>
-        <w:pStyle w:val="FirstParagraph"/>
-      </w:pPr>
-      <w:r>
-        <w:t xml:space="preserve">The study will target at least 300 eligible records from at least five</w:t>
-      </w:r>
-      <w:r>
-        <w:t xml:space="preserve"> </w:t>
-      </w:r>
-      <w:r>
-        <w:t xml:space="preserve">clinics. The final sample-size calculation must be completed by the</w:t>
-      </w:r>
-      <w:r>
-        <w:t xml:space="preserve"> </w:t>
-      </w:r>
-      <w:r>
-        <w:t xml:space="preserve">study statistician using the anticipated Lᵢ distribution, conservative</w:t>
-      </w:r>
-      <w:r>
-        <w:t xml:space="preserve"> </w:t>
-      </w:r>
-      <w:r>
-        <w:t xml:space="preserve">effect sizes, unequal site contributions, within-site dependence, the</w:t>
-      </w:r>
-      <w:r>
-        <w:t xml:space="preserve"> </w:t>
-      </w:r>
-      <w:r>
-        <w:t xml:space="preserve">primary distributional test, and multiplicity from the moving-window</w:t>
-      </w:r>
-      <w:r>
-        <w:t xml:space="preserve"> </w:t>
-      </w:r>
-      <w:r>
-        <w:t xml:space="preserve">scan. The simulation and its assumptions will be finalized before data</w:t>
-      </w:r>
-      <w:r>
-        <w:t xml:space="preserve"> </w:t>
-      </w:r>
-      <w:r>
-        <w:t xml:space="preserve">collection and will not use observed study outcomes to stop or extend</w:t>
-      </w:r>
-      <w:r>
-        <w:t xml:space="preserve"> </w:t>
-      </w:r>
-      <w:r>
-        <w:t xml:space="preserve">enrollment.</w:t>
-      </w:r>
-    </w:p>
-    <w:bookmarkEnd w:id="25"/>
-    <w:bookmarkStart w:id="26" w:name="X7c50195b39b2f302d9fb69cea64c3be2e20aaa2"/>
-    <w:p>
-      <w:pPr>
-        <w:pStyle w:val="Heading3"/>
-      </w:pPr>
-      <w:r>
-        <w:t xml:space="preserve">9.6 Interpretation limits</w:t>
-      </w:r>
-    </w:p>
-    <w:p>
-      <w:pPr>
-        <w:pStyle w:val="FirstParagraph"/>
-      </w:pPr>
-      <w:r>
-        <w:t xml:space="preserve">This case-only design cannot estimate ASD incidence or</w:t>
-      </w:r>
-      <w:r>
-        <w:t xml:space="preserve"> </w:t>
-      </w:r>
-      <w:r>
-        <w:t xml:space="preserve">vaccine-attributable risk, compare vaccinated with unvaccinated</w:t>
-      </w:r>
-      <w:r>
-        <w:t xml:space="preserve"> </w:t>
-      </w:r>
-      <w:r>
-        <w:t xml:space="preserve">children, or by itself distinguish a causal trigger from recall</w:t>
-      </w:r>
-      <w:r>
-        <w:t xml:space="preserve"> </w:t>
-      </w:r>
-      <w:r>
-        <w:t xml:space="preserve">anchoring, healthcare-contact patterns, concurrent illness, age-related</w:t>
-      </w:r>
-      <w:r>
-        <w:t xml:space="preserve"> </w:t>
-      </w:r>
-      <w:r>
-        <w:t xml:space="preserve">developmental change, or selective documentation. Conclusions will be</w:t>
-      </w:r>
-      <w:r>
-        <w:t xml:space="preserve"> </w:t>
-      </w:r>
-      <w:r>
-        <w:t xml:space="preserve">limited to the observed temporal distribution in the defined cohort.</w:t>
-      </w:r>
-    </w:p>
-    <w:bookmarkEnd w:id="26"/>
-    <w:bookmarkEnd w:id="27"/>
-    <w:bookmarkStart w:id="28" w:name="X8ce97a550421320c70f07bfcc10976969dcc001"/>
+        <w:t xml:space="preserve">Results will be reported regardless of direction. Row-level public</w:t>
+      </w:r>
+      <w:r>
+        <w:t xml:space="preserve"> </w:t>
+      </w:r>
+      <w:r>
+        <w:t xml:space="preserve">release may occur only after documented disclosure-risk review by</w:t>
+      </w:r>
+      <w:r>
+        <w:t xml:space="preserve"> </w:t>
+      </w:r>
+      <w:r>
+        <w:t xml:space="preserve">[named qualified reviewer/privacy office]. If acceptable risk cannot</w:t>
+      </w:r>
+      <w:r>
+        <w:t xml:space="preserve"> </w:t>
+      </w:r>
+      <w:r>
+        <w:t xml:space="preserve">be achieved, only aggregate results and analysis code will be released.</w:t>
+      </w:r>
+      <w:r>
+        <w:t xml:space="preserve"> </w:t>
+      </w:r>
+      <w:r>
+        <w:t xml:space="preserve">The internal analytic dataset will not automatically be public. Cell</w:t>
+      </w:r>
+      <w:r>
+        <w:t xml:space="preserve"> </w:t>
+      </w:r>
+      <w:r>
+        <w:t xml:space="preserve">suppression, age binning, top/bottom coding of intervals, clinic masking</w:t>
+      </w:r>
+      <w:r>
+        <w:t xml:space="preserve"> </w:t>
+      </w:r>
+      <w:r>
+        <w:t xml:space="preserve">or pooling, and removal of rare combinations will be applied as needed.</w:t>
+      </w:r>
+      <w:r>
+        <w:t xml:space="preserve"> </w:t>
+      </w:r>
+      <w:r>
+        <w:t xml:space="preserve">If Safe Harbor cannot be established because a retained variable is a</w:t>
+      </w:r>
+      <w:r>
+        <w:t xml:space="preserve"> </w:t>
+      </w:r>
+      <w:r>
+        <w:t xml:space="preserve">unique characteristic or code, a qualified expert determination will be</w:t>
+      </w:r>
+      <w:r>
+        <w:t xml:space="preserve"> </w:t>
+      </w:r>
+      <w:r>
+        <w:t xml:space="preserve">obtained before release. Neither MAPS nor investigators will attempt</w:t>
+      </w:r>
+      <w:r>
+        <w:t xml:space="preserve"> </w:t>
+      </w:r>
+      <w:r>
+        <w:t xml:space="preserve">re-identification.</w:t>
+      </w:r>
+    </w:p>
+    <w:bookmarkEnd w:id="31"/>
+    <w:bookmarkEnd w:id="32"/>
+    <w:bookmarkStart w:id="38" w:name="part-2-data-privacy-and-security-plan"/>
+    <w:p>
+      <w:pPr>
+        <w:pStyle w:val="Heading1"/>
+      </w:pPr>
+      <w:r>
+        <w:t xml:space="preserve">Part 2. Data Privacy and Security Plan</w:t>
+      </w:r>
+    </w:p>
+    <w:bookmarkStart w:id="33" w:name="X321b5802770932e8c3d279a536fa97c740522fd"/>
     <w:p>
       <w:pPr>
         <w:pStyle w:val="Heading2"/>
       </w:pPr>
       <w:r>
-        <w:t xml:space="preserve">10. Risks, benefits, and safeguards</w:t>
-      </w:r>
-    </w:p>
-    <w:p>
-      <w:pPr>
-        <w:pStyle w:val="FirstParagraph"/>
-      </w:pPr>
-      <w:r>
-        <w:t xml:space="preserve">There is no intervention and no direct participant benefit. Principal</w:t>
-      </w:r>
-      <w:r>
-        <w:t xml:space="preserve"> </w:t>
-      </w:r>
-      <w:r>
-        <w:t xml:space="preserve">risk is informational: re-identification or unwanted disclosure of a</w:t>
-      </w:r>
-      <w:r>
-        <w:t xml:space="preserve"> </w:t>
-      </w:r>
-      <w:r>
-        <w:t xml:space="preserve">child’s developmental and vaccination history. Risk is minimized by</w:t>
-      </w:r>
-      <w:r>
-        <w:t xml:space="preserve"> </w:t>
-      </w:r>
-      <w:r>
-        <w:t xml:space="preserve">site-level abstraction; no central access to PHI; no direct identifiers,</w:t>
-      </w:r>
-      <w:r>
-        <w:t xml:space="preserve"> </w:t>
-      </w:r>
-      <w:r>
-        <w:t xml:space="preserve">exact dates, free text, or MRN-derived codes; encrypted transfer and</w:t>
-      </w:r>
-      <w:r>
-        <w:t xml:space="preserve"> </w:t>
-      </w:r>
-      <w:r>
-        <w:t xml:space="preserve">storage; least-privilege access; audit logging;</w:t>
-      </w:r>
-      <w:r>
-        <w:t xml:space="preserve"> </w:t>
-      </w:r>
-      <w:r>
-        <w:t xml:space="preserve">suppression/generalization for public release; and incident-response</w:t>
-      </w:r>
-      <w:r>
-        <w:t xml:space="preserve"> </w:t>
-      </w:r>
-      <w:r>
-        <w:t xml:space="preserve">procedures. Clinics will not make participation or care decisions based</w:t>
-      </w:r>
-      <w:r>
-        <w:t xml:space="preserve"> </w:t>
-      </w:r>
-      <w:r>
-        <w:t xml:space="preserve">on study inclusion.</w:t>
-      </w:r>
-    </w:p>
-    <w:bookmarkEnd w:id="28"/>
-    <w:bookmarkStart w:id="29" w:name="X924529b758df2bb5b0bf97f11a5774f23e51811"/>
-    <w:p>
-      <w:pPr>
-        <w:pStyle w:val="Heading2"/>
-      </w:pPr>
-      <w:r>
-        <w:t xml:space="preserve">11. Quality assurance and reproducibility</w:t>
+        <w:t xml:space="preserve">1. Data flow</w:t>
       </w:r>
     </w:p>
     <w:p>
@@ -2197,13 +2656,13 @@
         </w:numPr>
       </w:pPr>
       <w:r>
-        <w:t xml:space="preserve">Training manual and worked examples for onset and vaccination-date</w:t>
-      </w:r>
-      <w:r>
-        <w:t xml:space="preserve"> </w:t>
-      </w:r>
-      <w:r>
-        <w:t xml:space="preserve">abstraction.</w:t>
+        <w:t xml:space="preserve">Authorized clinic workforce members access PHI inside the clinic</w:t>
+      </w:r>
+      <w:r>
+        <w:t xml:space="preserve"> </w:t>
+      </w:r>
+      <w:r>
+        <w:t xml:space="preserve">under local policy and the IRB/privacy determination.</w:t>
       </w:r>
     </w:p>
     <w:p>
@@ -2214,13 +2673,19 @@
         </w:numPr>
       </w:pPr>
       <w:r>
-        <w:t xml:space="preserve">Pilot abstraction of at least 10 records per site and inter-rater</w:t>
-      </w:r>
-      <w:r>
-        <w:t xml:space="preserve"> </w:t>
-      </w:r>
-      <w:r>
-        <w:t xml:space="preserve">agreement reporting.</w:t>
+        <w:t xml:space="preserve">Clinic staff determine eligibility, record source dates in a local</w:t>
+      </w:r>
+      <w:r>
+        <w:t xml:space="preserve"> </w:t>
+      </w:r>
+      <w:r>
+        <w:t xml:space="preserve">worksheet, calculate age in months, Dpre, and Dpost, and run</w:t>
+      </w:r>
+      <w:r>
+        <w:t xml:space="preserve"> </w:t>
+      </w:r>
+      <w:r>
+        <w:t xml:space="preserve">validation checks.</w:t>
       </w:r>
     </w:p>
     <w:p>
@@ -2231,13 +2696,25 @@
         </w:numPr>
       </w:pPr>
       <w:r>
-        <w:t xml:space="preserve">Frozen protocol, data dictionary, and statistical code before database</w:t>
-      </w:r>
-      <w:r>
-        <w:t xml:space="preserve"> </w:t>
-      </w:r>
-      <w:r>
-        <w:t xml:space="preserve">lock.</w:t>
+        <w:t xml:space="preserve">Before transmission, clinic staff delete direct identifiers, exact</w:t>
+      </w:r>
+      <w:r>
+        <w:t xml:space="preserve"> </w:t>
+      </w:r>
+      <w:r>
+        <w:t xml:space="preserve">dates, free text, granular geography, contact data, device/IP data,</w:t>
+      </w:r>
+      <w:r>
+        <w:t xml:space="preserve"> </w:t>
+      </w:r>
+      <w:r>
+        <w:t xml:space="preserve">and any MRN-derived identifier. A random study ID is assigned. The</w:t>
+      </w:r>
+      <w:r>
+        <w:t xml:space="preserve"> </w:t>
+      </w:r>
+      <w:r>
+        <w:t xml:space="preserve">linkage key remains at the clinic and is never shared.</w:t>
       </w:r>
     </w:p>
     <w:p>
@@ -2248,13 +2725,49 @@
         </w:numPr>
       </w:pPr>
       <w:r>
-        <w:t xml:space="preserve">Aggregate screening flow by site and a reproducible analysis</w:t>
-      </w:r>
-      <w:r>
-        <w:t xml:space="preserve"> </w:t>
-      </w:r>
-      <w:r>
-        <w:t xml:space="preserve">repository.</w:t>
+        <w:t xml:space="preserve">The clinic submits the patient-level data electronically as the study-provided</w:t>
+      </w:r>
+      <w:r>
+        <w:t xml:space="preserve"> </w:t>
+      </w:r>
+      <w:r>
+        <w:t xml:space="preserve">Excel workbook or an equivalent CSV file through [approved secure</w:t>
+      </w:r>
+      <w:r>
+        <w:t xml:space="preserve"> </w:t>
+      </w:r>
+      <w:r>
+        <w:t xml:space="preserve">upload portal]. Paper forms, scanned forms, photographs, fax, and</w:t>
+      </w:r>
+      <w:r>
+        <w:t xml:space="preserve"> </w:t>
+      </w:r>
+      <w:r>
+        <w:t xml:space="preserve">submission in an email body are not accepted. The electronic table</w:t>
+      </w:r>
+      <w:r>
+        <w:t xml:space="preserve"> </w:t>
+      </w:r>
+      <w:r>
+        <w:t xml:space="preserve">contains only site code, clinic row ID, sex, age at onset in days,</w:t>
+      </w:r>
+      <w:r>
+        <w:t xml:space="preserve"> </w:t>
+      </w:r>
+      <w:r>
+        <w:t xml:space="preserve">vaccination-before-onset status, Dpre, and Dpost. The four aggregate</w:t>
+      </w:r>
+      <w:r>
+        <w:t xml:space="preserve"> </w:t>
+      </w:r>
+      <w:r>
+        <w:t xml:space="preserve">24-month counts and screening-flow counts are transmitted separately</w:t>
+      </w:r>
+      <w:r>
+        <w:t xml:space="preserve"> </w:t>
+      </w:r>
+      <w:r>
+        <w:t xml:space="preserve">and contain no patient rows or free text.</w:t>
       </w:r>
     </w:p>
     <w:p>
@@ -2265,249 +2778,36 @@
         </w:numPr>
       </w:pPr>
       <w:r>
-        <w:t xml:space="preserve">Independent statistical review before public claims or manuscript</w:t>
-      </w:r>
-      <w:r>
-        <w:t xml:space="preserve"> </w:t>
-      </w:r>
-      <w:r>
-        <w:t xml:space="preserve">submission.</w:t>
-      </w:r>
-    </w:p>
-    <w:bookmarkEnd w:id="29"/>
-    <w:bookmarkStart w:id="30" w:name="X4c8c0127a27889c36b522e8e8c19f99d7d4efcd"/>
-    <w:p>
-      <w:pPr>
-        <w:pStyle w:val="Heading2"/>
-      </w:pPr>
-      <w:r>
-        <w:t xml:space="preserve">12. Dissemination</w:t>
-      </w:r>
-    </w:p>
-    <w:p>
-      <w:pPr>
-        <w:pStyle w:val="FirstParagraph"/>
-      </w:pPr>
-      <w:r>
-        <w:t xml:space="preserve">Results will be reported regardless of direction. Public release is</w:t>
-      </w:r>
-      <w:r>
-        <w:t xml:space="preserve"> </w:t>
-      </w:r>
-      <w:r>
-        <w:t xml:space="preserve">limited to a disclosure-reviewed public-use dataset and analysis code.</w:t>
-      </w:r>
-      <w:r>
-        <w:t xml:space="preserve"> </w:t>
-      </w:r>
-      <w:r>
-        <w:t xml:space="preserve">The internal analytic dataset will not automatically be public. Cell</w:t>
-      </w:r>
-      <w:r>
-        <w:t xml:space="preserve"> </w:t>
-      </w:r>
-      <w:r>
-        <w:t xml:space="preserve">suppression, age binning, top/bottom coding of intervals, clinic masking</w:t>
-      </w:r>
-      <w:r>
-        <w:t xml:space="preserve"> </w:t>
-      </w:r>
-      <w:r>
-        <w:t xml:space="preserve">or pooling, and removal of rare combinations will be applied as needed.</w:t>
-      </w:r>
-      <w:r>
-        <w:t xml:space="preserve"> </w:t>
-      </w:r>
-      <w:r>
-        <w:t xml:space="preserve">If Safe Harbor cannot be established because a retained variable is a</w:t>
-      </w:r>
-      <w:r>
-        <w:t xml:space="preserve"> </w:t>
-      </w:r>
-      <w:r>
-        <w:t xml:space="preserve">unique characteristic or code, a qualified expert determination will be</w:t>
-      </w:r>
-      <w:r>
-        <w:t xml:space="preserve"> </w:t>
-      </w:r>
-      <w:r>
-        <w:t xml:space="preserve">obtained before release. Neither MAPS nor investigators will attempt</w:t>
-      </w:r>
-      <w:r>
-        <w:t xml:space="preserve"> </w:t>
-      </w:r>
-      <w:r>
-        <w:t xml:space="preserve">re-identification.</w:t>
-      </w:r>
-    </w:p>
-    <w:bookmarkEnd w:id="30"/>
-    <w:bookmarkEnd w:id="31"/>
-    <w:bookmarkStart w:id="37" w:name="part-2-data-privacy-and-security-plan"/>
-    <w:p>
-      <w:pPr>
-        <w:pStyle w:val="Heading1"/>
-      </w:pPr>
-      <w:r>
-        <w:t xml:space="preserve">Part 2. Data Privacy and Security Plan</w:t>
-      </w:r>
-    </w:p>
-    <w:bookmarkStart w:id="32" w:name="X321b5802770932e8c3d279a536fa97c740522fd"/>
-    <w:p>
-      <w:pPr>
-        <w:pStyle w:val="Heading2"/>
-      </w:pPr>
-      <w:r>
-        <w:t xml:space="preserve">1. Data flow</w:t>
+        <w:t xml:space="preserve">The coordinating center stores the internal analytic file in [named</w:t>
+      </w:r>
+      <w:r>
+        <w:t xml:space="preserve"> </w:t>
+      </w:r>
+      <w:r>
+        <w:t xml:space="preserve">institution-managed encrypted platform], encrypted in transit and</w:t>
+      </w:r>
+      <w:r>
+        <w:t xml:space="preserve"> </w:t>
+      </w:r>
+      <w:r>
+        <w:t xml:space="preserve">at rest, with multifactor authentication, role-based access, audit</w:t>
+      </w:r>
+      <w:r>
+        <w:t xml:space="preserve"> </w:t>
+      </w:r>
+      <w:r>
+        <w:t xml:space="preserve">logging, endpoint encryption, and institutional backups.</w:t>
       </w:r>
     </w:p>
     <w:p>
       <w:pPr>
         <w:numPr>
           <w:ilvl w:val="0"/>
-          <w:numId w:val="1008"/>
+          <w:numId w:val="1007"/>
         </w:numPr>
       </w:pPr>
       <w:r>
-        <w:t xml:space="preserve">Authorized clinic workforce members access PHI inside the clinic</w:t>
-      </w:r>
-      <w:r>
-        <w:t xml:space="preserve"> </w:t>
-      </w:r>
-      <w:r>
-        <w:t xml:space="preserve">under local policy and the IRB/privacy determination.</w:t>
-      </w:r>
-    </w:p>
-    <w:p>
-      <w:pPr>
-        <w:numPr>
-          <w:ilvl w:val="0"/>
-          <w:numId w:val="1008"/>
-        </w:numPr>
-      </w:pPr>
-      <w:r>
-        <w:t xml:space="preserve">Clinic staff determine eligibility, record source dates in a local</w:t>
-      </w:r>
-      <w:r>
-        <w:t xml:space="preserve"> </w:t>
-      </w:r>
-      <w:r>
-        <w:t xml:space="preserve">worksheet, calculate age in months, Dpre, and Dpost, and run</w:t>
-      </w:r>
-      <w:r>
-        <w:t xml:space="preserve"> </w:t>
-      </w:r>
-      <w:r>
-        <w:t xml:space="preserve">validation checks.</w:t>
-      </w:r>
-    </w:p>
-    <w:p>
-      <w:pPr>
-        <w:numPr>
-          <w:ilvl w:val="0"/>
-          <w:numId w:val="1008"/>
-        </w:numPr>
-      </w:pPr>
-      <w:r>
-        <w:t xml:space="preserve">Before transmission, clinic staff delete direct identifiers, exact</w:t>
-      </w:r>
-      <w:r>
-        <w:t xml:space="preserve"> </w:t>
-      </w:r>
-      <w:r>
-        <w:t xml:space="preserve">dates, free text, granular geography, contact data, device/IP data,</w:t>
-      </w:r>
-      <w:r>
-        <w:t xml:space="preserve"> </w:t>
-      </w:r>
-      <w:r>
-        <w:t xml:space="preserve">and any MRN-derived identifier. A random study ID is assigned. The</w:t>
-      </w:r>
-      <w:r>
-        <w:t xml:space="preserve"> </w:t>
-      </w:r>
-      <w:r>
-        <w:t xml:space="preserve">linkage key remains at the clinic and is never shared.</w:t>
-      </w:r>
-    </w:p>
-    <w:p>
-      <w:pPr>
-        <w:numPr>
-          <w:ilvl w:val="0"/>
-          <w:numId w:val="1008"/>
-        </w:numPr>
-      </w:pPr>
-      <w:r>
-        <w:t xml:space="preserve">The clinic submits the data electronically as the study-provided</w:t>
-      </w:r>
-      <w:r>
-        <w:t xml:space="preserve"> </w:t>
-      </w:r>
-      <w:r>
-        <w:t xml:space="preserve">Excel workbook or an equivalent CSV file through [approved secure</w:t>
-      </w:r>
-      <w:r>
-        <w:t xml:space="preserve"> </w:t>
-      </w:r>
-      <w:r>
-        <w:t xml:space="preserve">upload portal]. Paper forms, scanned forms, photographs, fax, and</w:t>
-      </w:r>
-      <w:r>
-        <w:t xml:space="preserve"> </w:t>
-      </w:r>
-      <w:r>
-        <w:t xml:space="preserve">submission in an email body are not accepted. The electronic table</w:t>
-      </w:r>
-      <w:r>
-        <w:t xml:space="preserve"> </w:t>
-      </w:r>
-      <w:r>
-        <w:t xml:space="preserve">contains only site code, clinic row ID, sex, age at onset in months,</w:t>
-      </w:r>
-      <w:r>
-        <w:t xml:space="preserve"> </w:t>
-      </w:r>
-      <w:r>
-        <w:t xml:space="preserve">Dpre, and Dpost.</w:t>
-      </w:r>
-    </w:p>
-    <w:p>
-      <w:pPr>
-        <w:numPr>
-          <w:ilvl w:val="0"/>
-          <w:numId w:val="1008"/>
-        </w:numPr>
-      </w:pPr>
-      <w:r>
-        <w:t xml:space="preserve">The coordinating center stores the internal analytic file in [named</w:t>
-      </w:r>
-      <w:r>
-        <w:t xml:space="preserve"> </w:t>
-      </w:r>
-      <w:r>
-        <w:t xml:space="preserve">institution-managed encrypted platform], encrypted in transit and</w:t>
-      </w:r>
-      <w:r>
-        <w:t xml:space="preserve"> </w:t>
-      </w:r>
-      <w:r>
-        <w:t xml:space="preserve">at rest, with multifactor authentication, role-based access, audit</w:t>
-      </w:r>
-      <w:r>
-        <w:t xml:space="preserve"> </w:t>
-      </w:r>
-      <w:r>
-        <w:t xml:space="preserve">logging, endpoint encryption, and institutional backups.</w:t>
-      </w:r>
-    </w:p>
-    <w:p>
-      <w:pPr>
-        <w:numPr>
-          <w:ilvl w:val="0"/>
-          <w:numId w:val="1008"/>
-        </w:numPr>
-      </w:pPr>
-      <w:r>
-        <w:t xml:space="preserve">Before public release, the received clinic row IDs are replaced with</w:t>
+        <w:t xml:space="preserve">Before any approved public release, the received clinic row IDs are replaced with</w:t>
       </w:r>
       <w:r>
         <w:t xml:space="preserve"> </w:t>
@@ -2522,8 +2822,8 @@
         <w:t xml:space="preserve">not published.</w:t>
       </w:r>
     </w:p>
-    <w:bookmarkEnd w:id="32"/>
-    <w:bookmarkStart w:id="33" w:name="X7396c84537fd1b0c86ec9b7526d22d5b203d5f4"/>
+    <w:bookmarkEnd w:id="33"/>
+    <w:bookmarkStart w:id="34" w:name="X7396c84537fd1b0c86ec9b7526d22d5b203d5f4"/>
     <w:p>
       <w:pPr>
         <w:pStyle w:val="Heading2"/>
@@ -2537,19 +2837,43 @@
         <w:pStyle w:val="FirstParagraph"/>
       </w:pPr>
       <w:r>
-        <w:t xml:space="preserve">The clinic’s source records and local mapping file contain PHI. The</w:t>
-      </w:r>
-      <w:r>
-        <w:t xml:space="preserve"> </w:t>
-      </w:r>
-      <w:r>
-        <w:t xml:space="preserve">transferred file contains no calendar dates or clinical phenotype</w:t>
-      </w:r>
-      <w:r>
-        <w:t xml:space="preserve"> </w:t>
-      </w:r>
-      <w:r>
-        <w:t xml:space="preserve">information and is intended to satisfy HIPAA de-identification. The</w:t>
+        <w:t xml:space="preserve">The clinic’s source records and local mapping file contain PHI. Before</w:t>
+      </w:r>
+      <w:r>
+        <w:t xml:space="preserve"> </w:t>
+      </w:r>
+      <w:r>
+        <w:t xml:space="preserve">research-specific screening, each clinic will document the lawful basis</w:t>
+      </w:r>
+      <w:r>
+        <w:t xml:space="preserve"> </w:t>
+      </w:r>
+      <w:r>
+        <w:t xml:space="preserve">for local PHI use and determine whether it is engaged in human-subjects</w:t>
+      </w:r>
+      <w:r>
+        <w:t xml:space="preserve"> </w:t>
+      </w:r>
+      <w:r>
+        <w:t xml:space="preserve">research, requires reliance on the reviewing IRB, or requires a local</w:t>
+      </w:r>
+      <w:r>
+        <w:t xml:space="preserve"> </w:t>
+      </w:r>
+      <w:r>
+        <w:t xml:space="preserve">determination. Before transfer, its privacy officer will document Safe</w:t>
+      </w:r>
+      <w:r>
+        <w:t xml:space="preserve"> </w:t>
+      </w:r>
+      <w:r>
+        <w:t xml:space="preserve">Harbor or Expert Determination; the seven fields alone do not</w:t>
+      </w:r>
+      <w:r>
+        <w:t xml:space="preserve"> </w:t>
+      </w:r>
+      <w:r>
+        <w:t xml:space="preserve">automatically establish HIPAA de-identification. The</w:t>
       </w:r>
       <w:r>
         <w:t xml:space="preserve"> </w:t>
@@ -2573,35 +2897,61 @@
         <w:t xml:space="preserve"> </w:t>
       </w:r>
       <w:r>
-        <w:t xml:space="preserve">entity/privacy officer will document the applicable de-identification</w:t>
-      </w:r>
-      <w:r>
-        <w:t xml:space="preserve"> </w:t>
-      </w:r>
-      <w:r>
-        <w:t xml:space="preserve">determination before transfer. If a clinic instead classifies the file</w:t>
-      </w:r>
-      <w:r>
-        <w:t xml:space="preserve"> </w:t>
-      </w:r>
-      <w:r>
-        <w:t xml:space="preserve">as coded PHI or a limited data set, the appropriate HIPAA</w:t>
-      </w:r>
-      <w:r>
-        <w:t xml:space="preserve"> </w:t>
-      </w:r>
-      <w:r>
-        <w:t xml:space="preserve">authorization/waiver and data use agreement must be in place before</w:t>
-      </w:r>
-      <w:r>
-        <w:t xml:space="preserve"> </w:t>
-      </w:r>
-      <w:r>
-        <w:t xml:space="preserve">disclosure.</w:t>
-      </w:r>
-    </w:p>
-    <w:bookmarkEnd w:id="33"/>
-    <w:bookmarkStart w:id="34" w:name="Xaecde47d4ef6250885165924ba61f51416bb3ac"/>
+        <w:t xml:space="preserve">entity/privacy officer will document the applicable determination before</w:t>
+      </w:r>
+      <w:r>
+        <w:t xml:space="preserve"> </w:t>
+      </w:r>
+      <w:r>
+        <w:t xml:space="preserve">transfer. Written site terms prohibit requesting or receiving the</w:t>
+      </w:r>
+      <w:r>
+        <w:t xml:space="preserve"> </w:t>
+      </w:r>
+      <w:r>
+        <w:t xml:space="preserve">patient mapping key and prohibit re-identification. If the file is coded</w:t>
+      </w:r>
+      <w:r>
+        <w:t xml:space="preserve"> </w:t>
+      </w:r>
+      <w:r>
+        <w:t xml:space="preserve">PHI or a HIPAA limited data set, the applicable authorization or waiver</w:t>
+      </w:r>
+      <w:r>
+        <w:t xml:space="preserve"> </w:t>
+      </w:r>
+      <w:r>
+        <w:t xml:space="preserve">and, for a limited data set, a data use agreement must be in place.</w:t>
+      </w:r>
+    </w:p>
+    <w:p>
+      <w:pPr>
+        <w:pStyle w:val="BodyText"/>
+      </w:pPr>
+      <w:r>
+        <w:t xml:space="preserve">Authorized coordinating personnel may know which clinic corresponds to</w:t>
+      </w:r>
+      <w:r>
+        <w:t xml:space="preserve"> </w:t>
+      </w:r>
+      <w:r>
+        <w:t xml:space="preserve">a site code for contracting and quality queries. The site-code mapping</w:t>
+      </w:r>
+      <w:r>
+        <w:t xml:space="preserve"> </w:t>
+      </w:r>
+      <w:r>
+        <w:t xml:space="preserve">identifies a clinic, not a patient; it will be stored separately from</w:t>
+      </w:r>
+      <w:r>
+        <w:t xml:space="preserve"> </w:t>
+      </w:r>
+      <w:r>
+        <w:t xml:space="preserve">patient-level analytic data and restricted to operations personnel.</w:t>
+      </w:r>
+    </w:p>
+    <w:bookmarkEnd w:id="34"/>
+    <w:bookmarkStart w:id="35" w:name="Xaecde47d4ef6250885165924ba61f51416bb3ac"/>
     <w:p>
       <w:pPr>
         <w:pStyle w:val="Heading2"/>
@@ -2989,8 +3339,8 @@
         </w:tc>
       </w:tr>
     </w:tbl>
-    <w:bookmarkEnd w:id="34"/>
-    <w:bookmarkStart w:id="35" w:name="X845763d3baf2fde4f7f4181b440e73c159cddaa"/>
+    <w:bookmarkEnd w:id="35"/>
+    <w:bookmarkStart w:id="36" w:name="X845763d3baf2fde4f7f4181b440e73c159cddaa"/>
     <w:p>
       <w:pPr>
         <w:pStyle w:val="Heading2"/>
@@ -3043,8 +3393,8 @@
         <w:t xml:space="preserve">review mandatory.</w:t>
       </w:r>
     </w:p>
-    <w:bookmarkEnd w:id="35"/>
-    <w:bookmarkStart w:id="36" w:name="Xc73486b64caa0ecf8c2a7dab761875f5cb8e567"/>
+    <w:bookmarkEnd w:id="36"/>
+    <w:bookmarkStart w:id="37" w:name="Xc73486b64caa0ecf8c2a7dab761875f5cb8e567"/>
     <w:p>
       <w:pPr>
         <w:pStyle w:val="Heading2"/>
@@ -3085,9 +3435,9 @@
         <w:t xml:space="preserve">applicable timelines. Corrective actions will be documented.</w:t>
       </w:r>
     </w:p>
-    <w:bookmarkEnd w:id="36"/>
     <w:bookmarkEnd w:id="37"/>
-    <w:bookmarkStart w:id="41" w:name="Xb78555386fa9229c0ea41bd17f13610e90be9f9"/>
+    <w:bookmarkEnd w:id="38"/>
+    <w:bookmarkStart w:id="42" w:name="Xb78555386fa9229c0ea41bd17f13610e90be9f9"/>
     <w:p>
       <w:pPr>
         <w:pStyle w:val="Heading1"/>
@@ -3096,7 +3446,7 @@
         <w:t xml:space="preserve">Part 3. Request for Waiver of Consent and HIPAA Authorization</w:t>
       </w:r>
     </w:p>
-    <w:bookmarkStart w:id="38" w:name="a-requested-regulatory-determination"/>
+    <w:bookmarkStart w:id="39" w:name="a-requested-regulatory-determination"/>
     <w:p>
       <w:pPr>
         <w:pStyle w:val="Heading2"/>
@@ -3110,59 +3460,77 @@
         <w:pStyle w:val="FirstParagraph"/>
       </w:pPr>
       <w:r>
-        <w:t xml:space="preserve">Primary request: the IRB determine whether receipt and analysis of</w:t>
-      </w:r>
-      <w:r>
-        <w:t xml:space="preserve"> </w:t>
-      </w:r>
-      <w:r>
-        <w:t xml:space="preserve">information that investigators cannot readily link to individuals is not</w:t>
-      </w:r>
-      <w:r>
-        <w:t xml:space="preserve"> </w:t>
-      </w:r>
-      <w:r>
-        <w:t xml:space="preserve">human-subjects research or is exempt secondary research under 45 CFR</w:t>
-      </w:r>
-      <w:r>
-        <w:t xml:space="preserve"> </w:t>
-      </w:r>
-      <w:r>
-        <w:t xml:space="preserve">46.104(d)(4), as applicable. In the alternative, the investigators</w:t>
-      </w:r>
-      <w:r>
-        <w:t xml:space="preserve"> </w:t>
-      </w:r>
-      <w:r>
-        <w:t xml:space="preserve">request expedited review and waiver of parental permission/informed</w:t>
-      </w:r>
-      <w:r>
-        <w:t xml:space="preserve"> </w:t>
-      </w:r>
-      <w:r>
-        <w:t xml:space="preserve">consent under 45 CFR 46.116(f), plus waiver of HIPAA authorization under</w:t>
-      </w:r>
-      <w:r>
-        <w:t xml:space="preserve"> </w:t>
-      </w:r>
-      <w:r>
-        <w:t xml:space="preserve">45 CFR 164.512(i), if the transferred information is deemed PHI. These</w:t>
-      </w:r>
-      <w:r>
-        <w:t xml:space="preserve"> </w:t>
-      </w:r>
-      <w:r>
-        <w:t xml:space="preserve">are alternative pathways; the IRB/privacy office will select the</w:t>
-      </w:r>
-      <w:r>
-        <w:t xml:space="preserve"> </w:t>
-      </w:r>
-      <w:r>
-        <w:t xml:space="preserve">applicable pathway.</w:t>
-      </w:r>
-    </w:p>
-    <w:bookmarkEnd w:id="38"/>
-    <w:bookmarkStart w:id="39" w:name="X60a25cda090c65b83f78d5083bc2e6e55cbdd43"/>
+        <w:t xml:space="preserve">Primary request: exemption under 45 CFR 46.104(d)(4)(ii) for the</w:t>
+      </w:r>
+      <w:r>
+        <w:t xml:space="preserve"> </w:t>
+      </w:r>
+      <w:r>
+        <w:t xml:space="preserve">coordinating institution's receipt and analysis of information recorded</w:t>
+      </w:r>
+      <w:r>
+        <w:t xml:space="preserve"> </w:t>
+      </w:r>
+      <w:r>
+        <w:t xml:space="preserve">so identities cannot readily be ascertained, with no subject contact or</w:t>
+      </w:r>
+      <w:r>
+        <w:t xml:space="preserve"> </w:t>
+      </w:r>
+      <w:r>
+        <w:t xml:space="preserve">re-identification attempt. Each clinic must obtain a documented</w:t>
+      </w:r>
+      <w:r>
+        <w:t xml:space="preserve"> </w:t>
+      </w:r>
+      <w:r>
+        <w:t xml:space="preserve">engagement, reliance/local IRB, and privacy determination before</w:t>
+      </w:r>
+      <w:r>
+        <w:t xml:space="preserve"> </w:t>
+      </w:r>
+      <w:r>
+        <w:t xml:space="preserve">screening or transfer; one central exemption determination is not</w:t>
+      </w:r>
+      <w:r>
+        <w:t xml:space="preserve"> </w:t>
+      </w:r>
+      <w:r>
+        <w:t xml:space="preserve">presumed to bind unaffiliated clinics. If an activity is found</w:t>
+      </w:r>
+      <w:r>
+        <w:t xml:space="preserve"> </w:t>
+      </w:r>
+      <w:r>
+        <w:t xml:space="preserve">nonexempt, it will not begin until the required expedited review,</w:t>
+      </w:r>
+      <w:r>
+        <w:t xml:space="preserve"> </w:t>
+      </w:r>
+      <w:r>
+        <w:t xml:space="preserve">parental-permission waiver under 45 CFR 46.408(c) applying the criteria</w:t>
+      </w:r>
+      <w:r>
+        <w:t xml:space="preserve"> </w:t>
+      </w:r>
+      <w:r>
+        <w:t xml:space="preserve">of 45 CFR 46.116(f), and any HIPAA waiver under 45 CFR 164.512(i) are</w:t>
+      </w:r>
+      <w:r>
+        <w:t xml:space="preserve"> </w:t>
+      </w:r>
+      <w:r>
+        <w:t xml:space="preserve">approved. No child assent is practicable because this is retrospective</w:t>
+      </w:r>
+      <w:r>
+        <w:t xml:space="preserve"> </w:t>
+      </w:r>
+      <w:r>
+        <w:t xml:space="preserve">records research with no contact.</w:t>
+      </w:r>
+    </w:p>
+    <w:bookmarkEnd w:id="39"/>
+    <w:bookmarkStart w:id="40" w:name="X60a25cda090c65b83f78d5083bc2e6e55cbdd43"/>
     <w:p>
       <w:pPr>
         <w:pStyle w:val="Heading2"/>
@@ -3307,7 +3675,7 @@
               <w:pStyle w:val="Compact"/>
             </w:pPr>
             <w:r>
-              <w:t xml:space="preserve">Individual debriefing is not appropriate because investigators cannot identify participants. Aggregate results and the public-use dataset/code will be posted at [URL] when available.</w:t>
+              <w:t xml:space="preserve">Not applicable: there is no subject contact and no clinically pertinent information to return. Dissemination is separate; aggregate results and code will be posted, while row-level data may be posted only after approval through disclosure-risk review.</w:t>
             </w:r>
           </w:p>
         </w:tc>
@@ -3337,8 +3705,8 @@
         </w:tc>
       </w:tr>
     </w:tbl>
-    <w:bookmarkEnd w:id="39"/>
-    <w:bookmarkStart w:id="40" w:name="c-hipaa-waiver-justification-if-needed"/>
+    <w:bookmarkEnd w:id="40"/>
+    <w:bookmarkStart w:id="41" w:name="c-hipaa-waiver-justification-if-needed"/>
     <w:p>
       <w:pPr>
         <w:pStyle w:val="Heading2"/>
@@ -3351,7 +3719,7 @@
       <w:pPr>
         <w:numPr>
           <w:ilvl w:val="0"/>
-          <w:numId w:val="1009"/>
+          <w:numId w:val="1008"/>
         </w:numPr>
       </w:pPr>
       <w:r>
@@ -3380,30 +3748,36 @@
       <w:pPr>
         <w:numPr>
           <w:ilvl w:val="0"/>
-          <w:numId w:val="1009"/>
+          <w:numId w:val="1008"/>
         </w:numPr>
       </w:pPr>
       <w:r>
-        <w:t xml:space="preserve">Identifiers used locally for screening will be destroyed or retained</w:t>
-      </w:r>
-      <w:r>
-        <w:t xml:space="preserve"> </w:t>
-      </w:r>
-      <w:r>
-        <w:t xml:space="preserve">only under documented clinical/legal requirements at the earliest</w:t>
-      </w:r>
-      <w:r>
-        <w:t xml:space="preserve"> </w:t>
-      </w:r>
-      <w:r>
-        <w:t xml:space="preserve">practicable time.</w:t>
+        <w:t xml:space="preserve">Clinical source records will not be destroyed. Research working files</w:t>
+      </w:r>
+      <w:r>
+        <w:t xml:space="preserve"> </w:t>
+      </w:r>
+      <w:r>
+        <w:t xml:space="preserve">and mapping materials will be retained or destroyed under approved</w:t>
+      </w:r>
+      <w:r>
+        <w:t xml:space="preserve"> </w:t>
+      </w:r>
+      <w:r>
+        <w:t xml:space="preserve">site policy at the earliest practicable time consistent with quality</w:t>
+      </w:r>
+      <w:r>
+        <w:t xml:space="preserve"> </w:t>
+      </w:r>
+      <w:r>
+        <w:t xml:space="preserve">review and legal requirements.</w:t>
       </w:r>
     </w:p>
     <w:p>
       <w:pPr>
         <w:numPr>
           <w:ilvl w:val="0"/>
-          <w:numId w:val="1009"/>
+          <w:numId w:val="1008"/>
         </w:numPr>
       </w:pPr>
       <w:r>
@@ -3426,7 +3800,7 @@
       <w:pPr>
         <w:numPr>
           <w:ilvl w:val="0"/>
-          <w:numId w:val="1009"/>
+          <w:numId w:val="1008"/>
         </w:numPr>
       </w:pPr>
       <w:r>
@@ -3455,7 +3829,7 @@
       <w:pPr>
         <w:numPr>
           <w:ilvl w:val="0"/>
-          <w:numId w:val="1009"/>
+          <w:numId w:val="1008"/>
         </w:numPr>
       </w:pPr>
       <w:r>
@@ -3468,9 +3842,9 @@
         <w:t xml:space="preserve">disclosed centrally unless separately approved.</w:t>
       </w:r>
     </w:p>
-    <w:bookmarkEnd w:id="40"/>
     <w:bookmarkEnd w:id="41"/>
-    <w:bookmarkStart w:id="42" w:name="part-4-data-collection-instrument"/>
+    <w:bookmarkEnd w:id="42"/>
+    <w:bookmarkStart w:id="43" w:name="part-4-data-collection-instrument"/>
     <w:p>
       <w:pPr>
         <w:pStyle w:val="Heading1"/>
@@ -3530,12 +3904,13 @@
         <w:tblLook w:firstRow="1" w:lastRow="0" w:firstColumn="0" w:lastColumn="0" w:noHBand="0" w:noVBand="0" w:val="0020"/>
       </w:tblPr>
       <w:tblGrid>
-        <w:gridCol w:w="1320"/>
-        <w:gridCol w:w="1320"/>
-        <w:gridCol w:w="1320"/>
-        <w:gridCol w:w="1320"/>
-        <w:gridCol w:w="1320"/>
-        <w:gridCol w:w="1320"/>
+        <w:gridCol w:w="1131"/>
+        <w:gridCol w:w="1131"/>
+        <w:gridCol w:w="1131"/>
+        <w:gridCol w:w="1131"/>
+        <w:gridCol w:w="1131"/>
+        <w:gridCol w:w="1131"/>
+        <w:gridCol w:w="1131"/>
       </w:tblGrid>
       <w:tr>
         <w:trPr>
@@ -3597,7 +3972,7 @@
                 <w:b/>
                 <w:bCs/>
               </w:rPr>
-              <w:t xml:space="preserve">Age at onset (months)</w:t>
+              <w:t xml:space="preserve">Age at onset (days)</w:t>
             </w:r>
           </w:p>
         </w:tc>
@@ -3612,7 +3987,7 @@
                 <w:b/>
                 <w:bCs/>
               </w:rPr>
-              <w:t xml:space="preserve">Dpre: days vaccination→onset</w:t>
+              <w:t xml:space="preserve">Vaccination before onset</w:t>
             </w:r>
           </w:p>
         </w:tc>
@@ -3627,7 +4002,22 @@
                 <w:b/>
                 <w:bCs/>
               </w:rPr>
-              <w:t xml:space="preserve">Dpost: days onset→next vaccination</w:t>
+              <w:t xml:space="preserve">Dpre (days)</w:t>
+            </w:r>
+          </w:p>
+        </w:tc>
+        <w:tc>
+          <w:tcPr/>
+          <w:p>
+            <w:pPr>
+              <w:pStyle w:val="Compact"/>
+            </w:pPr>
+            <w:r>
+              <w:rPr>
+                <w:b/>
+                <w:bCs/>
+              </w:rPr>
+              <w:t xml:space="preserve">Dpost (days)</w:t>
             </w:r>
           </w:p>
         </w:tc>
@@ -3681,6 +4071,14 @@
             </w:pPr>
           </w:p>
         </w:tc>
+        <w:tc>
+          <w:tcPr/>
+          <w:p>
+            <w:pPr>
+              <w:pStyle w:val="Compact"/>
+            </w:pPr>
+          </w:p>
+        </w:tc>
       </w:tr>
       <w:tr>
         <w:tc>
@@ -3731,6 +4129,14 @@
             </w:pPr>
           </w:p>
         </w:tc>
+        <w:tc>
+          <w:tcPr/>
+          <w:p>
+            <w:pPr>
+              <w:pStyle w:val="Compact"/>
+            </w:pPr>
+          </w:p>
+        </w:tc>
       </w:tr>
       <w:tr>
         <w:tc>
@@ -3781,98 +4187,6 @@
             </w:pPr>
           </w:p>
         </w:tc>
-      </w:tr>
-      <w:tr>
-        <w:tc>
-          <w:tcPr/>
-          <w:p>
-            <w:pPr>
-              <w:pStyle w:val="Compact"/>
-            </w:pPr>
-          </w:p>
-        </w:tc>
-        <w:tc>
-          <w:tcPr/>
-          <w:p>
-            <w:pPr>
-              <w:pStyle w:val="Compact"/>
-            </w:pPr>
-          </w:p>
-        </w:tc>
-        <w:tc>
-          <w:tcPr/>
-          <w:p>
-            <w:pPr>
-              <w:pStyle w:val="Compact"/>
-            </w:pPr>
-          </w:p>
-        </w:tc>
-        <w:tc>
-          <w:tcPr/>
-          <w:p>
-            <w:pPr>
-              <w:pStyle w:val="Compact"/>
-            </w:pPr>
-          </w:p>
-        </w:tc>
-        <w:tc>
-          <w:tcPr/>
-          <w:p>
-            <w:pPr>
-              <w:pStyle w:val="Compact"/>
-            </w:pPr>
-          </w:p>
-        </w:tc>
-        <w:tc>
-          <w:tcPr/>
-          <w:p>
-            <w:pPr>
-              <w:pStyle w:val="Compact"/>
-            </w:pPr>
-          </w:p>
-        </w:tc>
-      </w:tr>
-      <w:tr>
-        <w:tc>
-          <w:tcPr/>
-          <w:p>
-            <w:pPr>
-              <w:pStyle w:val="Compact"/>
-            </w:pPr>
-          </w:p>
-        </w:tc>
-        <w:tc>
-          <w:tcPr/>
-          <w:p>
-            <w:pPr>
-              <w:pStyle w:val="Compact"/>
-            </w:pPr>
-          </w:p>
-        </w:tc>
-        <w:tc>
-          <w:tcPr/>
-          <w:p>
-            <w:pPr>
-              <w:pStyle w:val="Compact"/>
-            </w:pPr>
-          </w:p>
-        </w:tc>
-        <w:tc>
-          <w:tcPr/>
-          <w:p>
-            <w:pPr>
-              <w:pStyle w:val="Compact"/>
-            </w:pPr>
-          </w:p>
-        </w:tc>
-        <w:tc>
-          <w:tcPr/>
-          <w:p>
-            <w:pPr>
-              <w:pStyle w:val="Compact"/>
-            </w:pPr>
-          </w:p>
-        </w:tc>
         <w:tc>
           <w:tcPr/>
           <w:p>
@@ -3888,43 +4202,43 @@
         <w:pStyle w:val="BodyText"/>
       </w:pPr>
       <w:r>
-        <w:t xml:space="preserve">Definitions: Dpre = onset date minus the most recent administered</w:t>
-      </w:r>
-      <w:r>
-        <w:t xml:space="preserve"> </w:t>
-      </w:r>
-      <w:r>
-        <w:t xml:space="preserve">vaccination date before/on onset. Dpost = first administered vaccination</w:t>
-      </w:r>
-      <w:r>
-        <w:t xml:space="preserve"> </w:t>
-      </w:r>
-      <w:r>
-        <w:t xml:space="preserve">date after onset minus onset date. Use 0 for same-day onset; mark</w:t>
-      </w:r>
-      <w:r>
-        <w:t xml:space="preserve"> </w:t>
-      </w:r>
-      <w:r>
-        <w:t xml:space="preserve">ordering unknown unless the note documents order. Do not substitute a</w:t>
-      </w:r>
-      <w:r>
-        <w:t xml:space="preserve"> </w:t>
-      </w:r>
-      <w:r>
-        <w:t xml:space="preserve">routine visit date for a vaccination date. Enter NA only when no</w:t>
-      </w:r>
-      <w:r>
-        <w:t xml:space="preserve"> </w:t>
-      </w:r>
-      <w:r>
-        <w:t xml:space="preserve">subsequent vaccination exists; explain only in the clinic-retained query</w:t>
-      </w:r>
-      <w:r>
-        <w:t xml:space="preserve"> </w:t>
-      </w:r>
-      <w:r>
-        <w:t xml:space="preserve">log.</w:t>
+        <w:t xml:space="preserve">Definitions: Vaccination before onset is Yes only when at least one</w:t>
+      </w:r>
+      <w:r>
+        <w:t xml:space="preserve"> </w:t>
+      </w:r>
+      <w:r>
+        <w:t xml:space="preserve">administration before/on onset is documented and No only when records</w:t>
+      </w:r>
+      <w:r>
+        <w:t xml:space="preserve"> </w:t>
+      </w:r>
+      <w:r>
+        <w:t xml:space="preserve">document no prior vaccination; incomplete history is not coded No. Dpre</w:t>
+      </w:r>
+      <w:r>
+        <w:t xml:space="preserve"> </w:t>
+      </w:r>
+      <w:r>
+        <w:t xml:space="preserve">= onset minus the most recent administered vaccination before/on onset</w:t>
+      </w:r>
+      <w:r>
+        <w:t xml:space="preserve"> </w:t>
+      </w:r>
+      <w:r>
+        <w:t xml:space="preserve">and is NA when status is No. Dpost = first administered vaccination</w:t>
+      </w:r>
+      <w:r>
+        <w:t xml:space="preserve"> </w:t>
+      </w:r>
+      <w:r>
+        <w:t xml:space="preserve">after onset minus onset and is NA when none is documented. Same-day</w:t>
+      </w:r>
+      <w:r>
+        <w:t xml:space="preserve"> </w:t>
+      </w:r>
+      <w:r>
+        <w:t xml:space="preserve">Dpre=0. Do not substitute a routine visit for documented administration.</w:t>
       </w:r>
     </w:p>
     <w:tbl>
@@ -4125,88 +4439,7 @@
         <w:pStyle w:val="BodyText"/>
       </w:pPr>
       <w:r>
-        <w:t xml:space="preserve">Site certification: I certify that the transmitted file contains only</w:t>
-      </w:r>
-      <w:r>
-        <w:t xml:space="preserve"> </w:t>
-      </w:r>
-      <w:r>
-        <w:t xml:space="preserve">the six columns shown above. The site code is the approved</w:t>
-      </w:r>
-      <w:r>
-        <w:t xml:space="preserve"> </w:t>
-      </w:r>
-      <w:r>
-        <w:t xml:space="preserve">nonidentifying study code, and the clinic row ID is not derived from an</w:t>
-      </w:r>
-      <w:r>
-        <w:t xml:space="preserve"> </w:t>
-      </w:r>
-      <w:r>
-        <w:t xml:space="preserve">identifier. No clinic name, names, calendar dates, phenotype</w:t>
-      </w:r>
-      <w:r>
-        <w:t xml:space="preserve"> </w:t>
-      </w:r>
-      <w:r>
-        <w:t xml:space="preserve">information, free text, MRNs or MRN-derived codes, contact information,</w:t>
-      </w:r>
-      <w:r>
-        <w:t xml:space="preserve"> </w:t>
-      </w:r>
-      <w:r>
-        <w:t xml:space="preserve">or mapping key are included. Name/title: __________ Signature:</w:t>
-      </w:r>
-      <w:r>
-        <w:t xml:space="preserve"> </w:t>
-      </w:r>
-      <w:r>
-        <w:t xml:space="preserve">__________ Date: __________</w:t>
-      </w:r>
-    </w:p>
-    <w:bookmarkEnd w:id="42"/>
-    <w:bookmarkStart w:id="45" w:name="Xfdb838c57fd8feb44caa8e3ee7b4aa144a209ea"/>
-    <w:p>
-      <w:pPr>
-        <w:pStyle w:val="Heading1"/>
-      </w:pPr>
-      <w:r>
-        <w:t xml:space="preserve">Part 5. Conflict of Interest and Funding Disclosure</w:t>
-      </w:r>
-    </w:p>
-    <w:bookmarkStart w:id="43" w:name="investigator-disclosure-statement"/>
-    <w:p>
-      <w:pPr>
-        <w:pStyle w:val="Heading2"/>
-      </w:pPr>
-      <w:r>
-        <w:t xml:space="preserve">Investigator disclosure statement</w:t>
-      </w:r>
-    </w:p>
-    <w:p>
-      <w:pPr>
-        <w:pStyle w:val="FirstParagraph"/>
-      </w:pPr>
-      <w:r>
-        <w:t xml:space="preserve">Each investigator and key study staff member must disclose financial and</w:t>
-      </w:r>
-      <w:r>
-        <w:t xml:space="preserve"> </w:t>
-      </w:r>
-      <w:r>
-        <w:t xml:space="preserve">nonfinancial interests under the reviewing institution’s policy.</w:t>
-      </w:r>
-      <w:r>
-        <w:t xml:space="preserve"> </w:t>
-      </w:r>
-      <w:r>
-        <w:t xml:space="preserve">Complete the statements below; do not represent “none” until each person</w:t>
-      </w:r>
-      <w:r>
-        <w:t xml:space="preserve"> </w:t>
-      </w:r>
-      <w:r>
-        <w:t xml:space="preserve">has submitted the institution’s required disclosure.</w:t>
+        <w:t xml:space="preserve">The clinic also submits these four aggregate counts separately:</w:t>
       </w:r>
     </w:p>
     <w:tbl>
@@ -4234,6 +4467,232 @@
                 <w:b/>
                 <w:bCs/>
               </w:rPr>
+              <w:t xml:space="preserve">24-month aggregate measure</w:t>
+            </w:r>
+          </w:p>
+        </w:tc>
+        <w:tc>
+          <w:tcPr/>
+          <w:p>
+            <w:pPr>
+              <w:pStyle w:val="Compact"/>
+              <w:jc w:val="right"/>
+            </w:pPr>
+            <w:r>
+              <w:rPr>
+                <w:b/>
+                <w:bCs/>
+              </w:rPr>
+              <w:t xml:space="preserve">Count</w:t>
+            </w:r>
+          </w:p>
+        </w:tc>
+      </w:tr>
+      <w:tr>
+        <w:tc>
+          <w:tcPr/>
+          <w:p>
+            <w:pPr>
+              <w:pStyle w:val="Compact"/>
+            </w:pPr>
+            <w:r>
+              <w:t xml:space="preserve">All clinic patients with sufficient records to establish vaccination status through 24 months</w:t>
+            </w:r>
+          </w:p>
+        </w:tc>
+        <w:tc>
+          <w:tcPr/>
+          <w:p>
+            <w:pPr>
+              <w:pStyle w:val="Compact"/>
+            </w:pPr>
+          </w:p>
+        </w:tc>
+      </w:tr>
+      <w:tr>
+        <w:tc>
+          <w:tcPr/>
+          <w:p>
+            <w:pPr>
+              <w:pStyle w:val="Compact"/>
+            </w:pPr>
+            <w:r>
+              <w:t xml:space="preserve">Above patients with no documented vaccination through 24 months</w:t>
+            </w:r>
+          </w:p>
+        </w:tc>
+        <w:tc>
+          <w:tcPr/>
+          <w:p>
+            <w:pPr>
+              <w:pStyle w:val="Compact"/>
+            </w:pPr>
+          </w:p>
+        </w:tc>
+      </w:tr>
+      <w:tr>
+        <w:tc>
+          <w:tcPr/>
+          <w:p>
+            <w:pPr>
+              <w:pStyle w:val="Compact"/>
+            </w:pPr>
+            <w:r>
+              <w:t xml:space="preserve">Qualifying SORA cases with sufficient records to establish vaccination status through 24 months</w:t>
+            </w:r>
+          </w:p>
+        </w:tc>
+        <w:tc>
+          <w:tcPr/>
+          <w:p>
+            <w:pPr>
+              <w:pStyle w:val="Compact"/>
+            </w:pPr>
+          </w:p>
+        </w:tc>
+      </w:tr>
+      <w:tr>
+        <w:tc>
+          <w:tcPr/>
+          <w:p>
+            <w:pPr>
+              <w:pStyle w:val="Compact"/>
+            </w:pPr>
+            <w:r>
+              <w:t xml:space="preserve">Above SORA cases with no documented vaccination through 24 months</w:t>
+            </w:r>
+          </w:p>
+        </w:tc>
+        <w:tc>
+          <w:tcPr/>
+          <w:p>
+            <w:pPr>
+              <w:pStyle w:val="Compact"/>
+            </w:pPr>
+          </w:p>
+        </w:tc>
+      </w:tr>
+    </w:tbl>
+    <w:p>
+      <w:pPr>
+        <w:pStyle w:val="BodyText"/>
+      </w:pPr>
+      <w:r>
+        <w:t xml:space="preserve">Site certification: I certify that the transmitted file contains only</w:t>
+      </w:r>
+      <w:r>
+        <w:t xml:space="preserve"> </w:t>
+      </w:r>
+      <w:r>
+        <w:t xml:space="preserve">the seven columns shown above plus the separately labeled aggregate</w:t>
+      </w:r>
+      <w:r>
+        <w:t xml:space="preserve"> </w:t>
+      </w:r>
+      <w:r>
+        <w:t xml:space="preserve">counts. The site code is the approved</w:t>
+      </w:r>
+      <w:r>
+        <w:t xml:space="preserve"> </w:t>
+      </w:r>
+      <w:r>
+        <w:t xml:space="preserve">nonidentifying study code, and the clinic row ID is not derived from an</w:t>
+      </w:r>
+      <w:r>
+        <w:t xml:space="preserve"> </w:t>
+      </w:r>
+      <w:r>
+        <w:t xml:space="preserve">identifier. No clinic name, names, calendar dates, phenotype</w:t>
+      </w:r>
+      <w:r>
+        <w:t xml:space="preserve"> </w:t>
+      </w:r>
+      <w:r>
+        <w:t xml:space="preserve">information, free text, MRNs or MRN-derived codes, contact information,</w:t>
+      </w:r>
+      <w:r>
+        <w:t xml:space="preserve"> </w:t>
+      </w:r>
+      <w:r>
+        <w:t xml:space="preserve">or mapping key are included. Name/title: __________ Signature:</w:t>
+      </w:r>
+      <w:r>
+        <w:t xml:space="preserve"> </w:t>
+      </w:r>
+      <w:r>
+        <w:t xml:space="preserve">__________ Date: __________</w:t>
+      </w:r>
+    </w:p>
+    <w:bookmarkEnd w:id="43"/>
+    <w:bookmarkStart w:id="46" w:name="Xfdb838c57fd8feb44caa8e3ee7b4aa144a209ea"/>
+    <w:p>
+      <w:pPr>
+        <w:pStyle w:val="Heading1"/>
+      </w:pPr>
+      <w:r>
+        <w:t xml:space="preserve">Part 5. Conflict of Interest and Funding Disclosure</w:t>
+      </w:r>
+    </w:p>
+    <w:bookmarkStart w:id="44" w:name="investigator-disclosure-statement"/>
+    <w:p>
+      <w:pPr>
+        <w:pStyle w:val="Heading2"/>
+      </w:pPr>
+      <w:r>
+        <w:t xml:space="preserve">Investigator disclosure statement</w:t>
+      </w:r>
+    </w:p>
+    <w:p>
+      <w:pPr>
+        <w:pStyle w:val="FirstParagraph"/>
+      </w:pPr>
+      <w:r>
+        <w:t xml:space="preserve">Each investigator and key study staff member must disclose financial and</w:t>
+      </w:r>
+      <w:r>
+        <w:t xml:space="preserve"> </w:t>
+      </w:r>
+      <w:r>
+        <w:t xml:space="preserve">nonfinancial interests under the reviewing institution’s policy.</w:t>
+      </w:r>
+      <w:r>
+        <w:t xml:space="preserve"> </w:t>
+      </w:r>
+      <w:r>
+        <w:t xml:space="preserve">Complete the statements below; do not represent “none” until each person</w:t>
+      </w:r>
+      <w:r>
+        <w:t xml:space="preserve"> </w:t>
+      </w:r>
+      <w:r>
+        <w:t xml:space="preserve">has submitted the institution’s required disclosure.</w:t>
+      </w:r>
+    </w:p>
+    <w:tbl>
+      <w:tblPr>
+        <w:tblStyle w:val="Table"/>
+        <w:tblW w:type="auto" w:w="0"/>
+        <w:tblLook w:firstRow="1" w:lastRow="0" w:firstColumn="0" w:lastColumn="0" w:noHBand="0" w:noVBand="0" w:val="0020"/>
+      </w:tblPr>
+      <w:tblGrid>
+        <w:gridCol w:w="3960"/>
+        <w:gridCol w:w="3960"/>
+      </w:tblGrid>
+      <w:tr>
+        <w:trPr>
+          <w:tblHeader w:val="on"/>
+        </w:trPr>
+        <w:tc>
+          <w:tcPr/>
+          <w:p>
+            <w:pPr>
+              <w:pStyle w:val="Compact"/>
+            </w:pPr>
+            <w:r>
+              <w:rPr>
+                <w:b/>
+                <w:bCs/>
+              </w:rPr>
               <w:t xml:space="preserve">Disclosure item</w:t>
             </w:r>
           </w:p>
@@ -4273,7 +4732,7 @@
               <w:pStyle w:val="Compact"/>
             </w:pPr>
             <w:r>
-              <w:t xml:space="preserve">MAPS: [amount/source/terms]. Clinic compensation: up to $5,000 per clinic based on documented staff effort and record volume [confirm structure]. Other support: [list/none].</w:t>
+              <w:t xml:space="preserve">MAPS: [amount/source/terms]. Clinic compensation: up to $5,000 per clinic for reasonable, documented actual screening and abstraction effort, independent of whether records qualify and independent of timing or results [confirm structure]. Other support: [list/none].</w:t>
             </w:r>
           </w:p>
         </w:tc>
@@ -4375,8 +4834,8 @@
         </w:tc>
       </w:tr>
     </w:tbl>
-    <w:bookmarkEnd w:id="43"/>
-    <w:bookmarkStart w:id="44" w:name="suggested-publication-disclosure"/>
+    <w:bookmarkEnd w:id="44"/>
+    <w:bookmarkStart w:id="45" w:name="suggested-publication-disclosure"/>
     <w:p>
       <w:pPr>
         <w:pStyle w:val="Heading2"/>
@@ -4429,15 +4888,177 @@
         <w:t xml:space="preserve">disclosures: [insert].”</w:t>
       </w:r>
     </w:p>
-    <w:bookmarkEnd w:id="44"/>
     <w:bookmarkEnd w:id="45"/>
-    <w:bookmarkStart w:id="46" w:name="Xc15f36d66b92f5c4a313d91e0905dbb4abdfe88"/>
+    <w:bookmarkEnd w:id="46"/>
+    <w:bookmarkStart w:id="47" w:name="Xc15f36d66b92f5c4a313d91e0905dbb4abdfe88"/>
     <w:p>
       <w:pPr>
         <w:pStyle w:val="Heading1"/>
       </w:pPr>
       <w:r>
         <w:t xml:space="preserve">Part 6. Required Site and Submission Attachments</w:t>
+      </w:r>
+    </w:p>
+    <w:p>
+      <w:pPr>
+        <w:numPr>
+          <w:ilvl w:val="0"/>
+          <w:numId w:val="1009"/>
+        </w:numPr>
+      </w:pPr>
+      <w:r>
+        <w:t xml:space="preserve">Completed institution-specific IRB application and protocol signature</w:t>
+      </w:r>
+      <w:r>
+        <w:t xml:space="preserve"> </w:t>
+      </w:r>
+      <w:r>
+        <w:t xml:space="preserve">page.</w:t>
+      </w:r>
+    </w:p>
+    <w:p>
+      <w:pPr>
+        <w:numPr>
+          <w:ilvl w:val="0"/>
+          <w:numId w:val="1009"/>
+        </w:numPr>
+      </w:pPr>
+      <w:r>
+        <w:t xml:space="preserve">PI CV/biosketch, human-subjects and HIPAA training certificates, and</w:t>
+      </w:r>
+      <w:r>
+        <w:t xml:space="preserve"> </w:t>
+      </w:r>
+      <w:r>
+        <w:t xml:space="preserve">investigator roster.</w:t>
+      </w:r>
+    </w:p>
+    <w:p>
+      <w:pPr>
+        <w:numPr>
+          <w:ilvl w:val="0"/>
+          <w:numId w:val="1009"/>
+        </w:numPr>
+      </w:pPr>
+      <w:r>
+        <w:t xml:space="preserve">Statistical simulation/power appendix approved by a named</w:t>
+      </w:r>
+      <w:r>
+        <w:t xml:space="preserve"> </w:t>
+      </w:r>
+      <w:r>
+        <w:t xml:space="preserve">statistician.</w:t>
+      </w:r>
+    </w:p>
+    <w:p>
+      <w:pPr>
+        <w:numPr>
+          <w:ilvl w:val="0"/>
+          <w:numId w:val="1009"/>
+        </w:numPr>
+      </w:pPr>
+      <w:r>
+        <w:t xml:space="preserve">Data dictionary, abstraction manual, and validation rules.</w:t>
+      </w:r>
+    </w:p>
+    <w:p>
+      <w:pPr>
+        <w:numPr>
+          <w:ilvl w:val="0"/>
+          <w:numId w:val="1009"/>
+        </w:numPr>
+      </w:pPr>
+      <w:r>
+        <w:t xml:space="preserve">Site agreement/data use agreement or reliance agreement, as</w:t>
+      </w:r>
+      <w:r>
+        <w:t xml:space="preserve"> </w:t>
+      </w:r>
+      <w:r>
+        <w:t xml:space="preserve">applicable.</w:t>
+      </w:r>
+    </w:p>
+    <w:p>
+      <w:pPr>
+        <w:numPr>
+          <w:ilvl w:val="0"/>
+          <w:numId w:val="1009"/>
+        </w:numPr>
+      </w:pPr>
+      <w:r>
+        <w:t xml:space="preserve">Clinic payment schedule and budget justification showing reimbursement</w:t>
+      </w:r>
+      <w:r>
+        <w:t xml:space="preserve"> </w:t>
+      </w:r>
+      <w:r>
+        <w:t xml:space="preserve">is not outcome-contingent.</w:t>
+      </w:r>
+    </w:p>
+    <w:p>
+      <w:pPr>
+        <w:numPr>
+          <w:ilvl w:val="0"/>
+          <w:numId w:val="1009"/>
+        </w:numPr>
+      </w:pPr>
+      <w:r>
+        <w:t xml:space="preserve">Recruitment/site outreach email and phone script labeled “do not use</w:t>
+      </w:r>
+      <w:r>
+        <w:t xml:space="preserve"> </w:t>
+      </w:r>
+      <w:r>
+        <w:t xml:space="preserve">until IRB determination.”</w:t>
+      </w:r>
+    </w:p>
+    <w:p>
+      <w:pPr>
+        <w:numPr>
+          <w:ilvl w:val="0"/>
+          <w:numId w:val="1009"/>
+        </w:numPr>
+      </w:pPr>
+      <w:r>
+        <w:t xml:space="preserve">HIPAA de-identification attestation or Expert Determination</w:t>
+      </w:r>
+      <w:r>
+        <w:t xml:space="preserve"> </w:t>
+      </w:r>
+      <w:r>
+        <w:t xml:space="preserve">documentation for each data flow.</w:t>
+      </w:r>
+    </w:p>
+    <w:p>
+      <w:pPr>
+        <w:numPr>
+          <w:ilvl w:val="0"/>
+          <w:numId w:val="1009"/>
+        </w:numPr>
+      </w:pPr>
+      <w:r>
+        <w:t xml:space="preserve">Public data disclosure-risk review plan and repository terms.</w:t>
+      </w:r>
+    </w:p>
+    <w:p>
+      <w:pPr>
+        <w:numPr>
+          <w:ilvl w:val="0"/>
+          <w:numId w:val="1009"/>
+        </w:numPr>
+      </w:pPr>
+      <w:r>
+        <w:t xml:space="preserve">Conflict-of-interest forms and management plan, if required.</w:t>
+      </w:r>
+    </w:p>
+    <w:bookmarkEnd w:id="47"/>
+    <w:bookmarkStart w:id="48" w:name="references"/>
+    <w:p>
+      <w:pPr>
+        <w:pStyle w:val="Heading1"/>
+      </w:pPr>
+      <w:r>
+        <w:t xml:space="preserve">References</w:t>
       </w:r>
     </w:p>
     <w:p>
@@ -4448,13 +5069,25 @@
         </w:numPr>
       </w:pPr>
       <w:r>
-        <w:t xml:space="preserve">Completed institution-specific IRB application and protocol signature</w:t>
-      </w:r>
-      <w:r>
-        <w:t xml:space="preserve"> </w:t>
-      </w:r>
-      <w:r>
-        <w:t xml:space="preserve">page.</w:t>
+        <w:t xml:space="preserve">Tan C, Frewer V, Cox G, Williams K, Ure A. Prevalence and Age of</w:t>
+      </w:r>
+      <w:r>
+        <w:t xml:space="preserve"> </w:t>
+      </w:r>
+      <w:r>
+        <w:t xml:space="preserve">Onset of Regression in Children with Autism Spectrum Disorder: A</w:t>
+      </w:r>
+      <w:r>
+        <w:t xml:space="preserve"> </w:t>
+      </w:r>
+      <w:r>
+        <w:t xml:space="preserve">Systematic Review and Meta-analytical Update. Autism Research.</w:t>
+      </w:r>
+      <w:r>
+        <w:t xml:space="preserve"> </w:t>
+      </w:r>
+      <w:r>
+        <w:t xml:space="preserve">2021;14(3):582–598. doi:10.1002/aur.2463.</w:t>
       </w:r>
     </w:p>
     <w:p>
@@ -4465,13 +5098,25 @@
         </w:numPr>
       </w:pPr>
       <w:r>
-        <w:t xml:space="preserve">PI CV/biosketch, human-subjects and HIPAA training certificates, and</w:t>
-      </w:r>
-      <w:r>
-        <w:t xml:space="preserve"> </w:t>
-      </w:r>
-      <w:r>
-        <w:t xml:space="preserve">investigator roster.</w:t>
+        <w:t xml:space="preserve">Ozonoff S, et al. Changing conceptualizations of regression: What</w:t>
+      </w:r>
+      <w:r>
+        <w:t xml:space="preserve"> </w:t>
+      </w:r>
+      <w:r>
+        <w:t xml:space="preserve">prospective studies reveal about the onset of autism spectrum</w:t>
+      </w:r>
+      <w:r>
+        <w:t xml:space="preserve"> </w:t>
+      </w:r>
+      <w:r>
+        <w:t xml:space="preserve">disorder. Neuroscience &amp; Biobehavioral Reviews. 2019. PMID:</w:t>
+      </w:r>
+      <w:r>
+        <w:t xml:space="preserve"> </w:t>
+      </w:r>
+      <w:r>
+        <w:t xml:space="preserve">30885812.</w:t>
       </w:r>
     </w:p>
     <w:p>
@@ -4482,13 +5127,25 @@
         </w:numPr>
       </w:pPr>
       <w:r>
-        <w:t xml:space="preserve">Statistical simulation/power appendix approved by a named</w:t>
-      </w:r>
-      <w:r>
-        <w:t xml:space="preserve"> </w:t>
-      </w:r>
-      <w:r>
-        <w:t xml:space="preserve">statistician.</w:t>
+        <w:t xml:space="preserve">Taylor LE, Swerdfeger AL, Eslick GD. Vaccines are not associated</w:t>
+      </w:r>
+      <w:r>
+        <w:t xml:space="preserve"> </w:t>
+      </w:r>
+      <w:r>
+        <w:t xml:space="preserve">with autism: an evidence-based meta-analysis of case-control and</w:t>
+      </w:r>
+      <w:r>
+        <w:t xml:space="preserve"> </w:t>
+      </w:r>
+      <w:r>
+        <w:t xml:space="preserve">cohort studies. Vaccine. 2014;32(29):3623–3629.</w:t>
+      </w:r>
+      <w:r>
+        <w:t xml:space="preserve"> </w:t>
+      </w:r>
+      <w:r>
+        <w:t xml:space="preserve">doi:10.1016/j.vaccine.2014.04.085.</w:t>
       </w:r>
     </w:p>
     <w:p>
@@ -4499,7 +5156,19 @@
         </w:numPr>
       </w:pPr>
       <w:r>
-        <w:t xml:space="preserve">Data dictionary, abstraction manual, and validation rules.</w:t>
+        <w:t xml:space="preserve">Hviid A, Hansen JV, Frisch M, Melbye M. Measles, Mumps, Rubella</w:t>
+      </w:r>
+      <w:r>
+        <w:t xml:space="preserve"> </w:t>
+      </w:r>
+      <w:r>
+        <w:t xml:space="preserve">Vaccination and Autism: A Nationwide Cohort Study. Ann Intern Med.</w:t>
+      </w:r>
+      <w:r>
+        <w:t xml:space="preserve"> </w:t>
+      </w:r>
+      <w:r>
+        <w:t xml:space="preserve">2019;170(8):513–520. doi:10.7326/M18-2101.</w:t>
       </w:r>
     </w:p>
     <w:p>
@@ -4510,13 +5179,19 @@
         </w:numPr>
       </w:pPr>
       <w:r>
-        <w:t xml:space="preserve">Site agreement/data use agreement or reliance agreement, as</w:t>
-      </w:r>
-      <w:r>
-        <w:t xml:space="preserve"> </w:t>
-      </w:r>
-      <w:r>
-        <w:t xml:space="preserve">applicable.</w:t>
+        <w:t xml:space="preserve">Taylor B, et al. Measles, mumps, and rubella vaccination and bowel</w:t>
+      </w:r>
+      <w:r>
+        <w:t xml:space="preserve"> </w:t>
+      </w:r>
+      <w:r>
+        <w:t xml:space="preserve">problems or developmental regression in children with autism:</w:t>
+      </w:r>
+      <w:r>
+        <w:t xml:space="preserve"> </w:t>
+      </w:r>
+      <w:r>
+        <w:t xml:space="preserve">population study. BMJ. 2002;324:393–396. PMID: 11850369.</w:t>
       </w:r>
     </w:p>
     <w:p>
@@ -4527,13 +5202,19 @@
         </w:numPr>
       </w:pPr>
       <w:r>
-        <w:t xml:space="preserve">Clinic payment schedule and budget justification showing reimbursement</w:t>
-      </w:r>
-      <w:r>
-        <w:t xml:space="preserve"> </w:t>
-      </w:r>
-      <w:r>
-        <w:t xml:space="preserve">is not outcome-contingent.</w:t>
+        <w:t xml:space="preserve">U.S. Department of Health and Human Services, Office for Civil</w:t>
+      </w:r>
+      <w:r>
+        <w:t xml:space="preserve"> </w:t>
+      </w:r>
+      <w:r>
+        <w:t xml:space="preserve">Rights. Guidance Regarding Methods for De-identification of</w:t>
+      </w:r>
+      <w:r>
+        <w:t xml:space="preserve"> </w:t>
+      </w:r>
+      <w:r>
+        <w:t xml:space="preserve">Protected Health Information under the HIPAA Privacy Rule.</w:t>
       </w:r>
     </w:p>
     <w:p>
@@ -4544,228 +5225,6 @@
         </w:numPr>
       </w:pPr>
       <w:r>
-        <w:t xml:space="preserve">Recruitment/site outreach email and phone script labeled “do not use</w:t>
-      </w:r>
-      <w:r>
-        <w:t xml:space="preserve"> </w:t>
-      </w:r>
-      <w:r>
-        <w:t xml:space="preserve">until IRB determination.”</w:t>
-      </w:r>
-    </w:p>
-    <w:p>
-      <w:pPr>
-        <w:numPr>
-          <w:ilvl w:val="0"/>
-          <w:numId w:val="1010"/>
-        </w:numPr>
-      </w:pPr>
-      <w:r>
-        <w:t xml:space="preserve">HIPAA de-identification attestation or Expert Determination</w:t>
-      </w:r>
-      <w:r>
-        <w:t xml:space="preserve"> </w:t>
-      </w:r>
-      <w:r>
-        <w:t xml:space="preserve">documentation for each data flow.</w:t>
-      </w:r>
-    </w:p>
-    <w:p>
-      <w:pPr>
-        <w:numPr>
-          <w:ilvl w:val="0"/>
-          <w:numId w:val="1010"/>
-        </w:numPr>
-      </w:pPr>
-      <w:r>
-        <w:t xml:space="preserve">Public data disclosure-risk review plan and repository terms.</w:t>
-      </w:r>
-    </w:p>
-    <w:p>
-      <w:pPr>
-        <w:numPr>
-          <w:ilvl w:val="0"/>
-          <w:numId w:val="1010"/>
-        </w:numPr>
-      </w:pPr>
-      <w:r>
-        <w:t xml:space="preserve">Conflict-of-interest forms and management plan, if required.</w:t>
-      </w:r>
-    </w:p>
-    <w:bookmarkEnd w:id="46"/>
-    <w:bookmarkStart w:id="47" w:name="references"/>
-    <w:p>
-      <w:pPr>
-        <w:pStyle w:val="Heading1"/>
-      </w:pPr>
-      <w:r>
-        <w:t xml:space="preserve">References</w:t>
-      </w:r>
-    </w:p>
-    <w:p>
-      <w:pPr>
-        <w:numPr>
-          <w:ilvl w:val="0"/>
-          <w:numId w:val="1011"/>
-        </w:numPr>
-      </w:pPr>
-      <w:r>
-        <w:t xml:space="preserve">Tan C, Frewer V, Cox G, Williams K, Ure A. Prevalence and Age of</w:t>
-      </w:r>
-      <w:r>
-        <w:t xml:space="preserve"> </w:t>
-      </w:r>
-      <w:r>
-        <w:t xml:space="preserve">Onset of Regression in Children with Autism Spectrum Disorder: A</w:t>
-      </w:r>
-      <w:r>
-        <w:t xml:space="preserve"> </w:t>
-      </w:r>
-      <w:r>
-        <w:t xml:space="preserve">Systematic Review and Meta-analytical Update. Autism Research.</w:t>
-      </w:r>
-      <w:r>
-        <w:t xml:space="preserve"> </w:t>
-      </w:r>
-      <w:r>
-        <w:t xml:space="preserve">2021;14(3):582–598. doi:10.1002/aur.2463.</w:t>
-      </w:r>
-    </w:p>
-    <w:p>
-      <w:pPr>
-        <w:numPr>
-          <w:ilvl w:val="0"/>
-          <w:numId w:val="1011"/>
-        </w:numPr>
-      </w:pPr>
-      <w:r>
-        <w:t xml:space="preserve">Ozonoff S, et al. Changing conceptualizations of regression: What</w:t>
-      </w:r>
-      <w:r>
-        <w:t xml:space="preserve"> </w:t>
-      </w:r>
-      <w:r>
-        <w:t xml:space="preserve">prospective studies reveal about the onset of autism spectrum</w:t>
-      </w:r>
-      <w:r>
-        <w:t xml:space="preserve"> </w:t>
-      </w:r>
-      <w:r>
-        <w:t xml:space="preserve">disorder. Neuroscience &amp; Biobehavioral Reviews. 2019. PMID:</w:t>
-      </w:r>
-      <w:r>
-        <w:t xml:space="preserve"> </w:t>
-      </w:r>
-      <w:r>
-        <w:t xml:space="preserve">30885812.</w:t>
-      </w:r>
-    </w:p>
-    <w:p>
-      <w:pPr>
-        <w:numPr>
-          <w:ilvl w:val="0"/>
-          <w:numId w:val="1011"/>
-        </w:numPr>
-      </w:pPr>
-      <w:r>
-        <w:t xml:space="preserve">Taylor LE, Swerdfeger AL, Eslick GD. Vaccines are not associated</w:t>
-      </w:r>
-      <w:r>
-        <w:t xml:space="preserve"> </w:t>
-      </w:r>
-      <w:r>
-        <w:t xml:space="preserve">with autism: an evidence-based meta-analysis of case-control and</w:t>
-      </w:r>
-      <w:r>
-        <w:t xml:space="preserve"> </w:t>
-      </w:r>
-      <w:r>
-        <w:t xml:space="preserve">cohort studies. Vaccine. 2014;32(29):3623–3629.</w:t>
-      </w:r>
-      <w:r>
-        <w:t xml:space="preserve"> </w:t>
-      </w:r>
-      <w:r>
-        <w:t xml:space="preserve">doi:10.1016/j.vaccine.2014.04.085.</w:t>
-      </w:r>
-    </w:p>
-    <w:p>
-      <w:pPr>
-        <w:numPr>
-          <w:ilvl w:val="0"/>
-          <w:numId w:val="1011"/>
-        </w:numPr>
-      </w:pPr>
-      <w:r>
-        <w:t xml:space="preserve">Hviid A, Hansen JV, Frisch M, Melbye M. Measles, Mumps, Rubella</w:t>
-      </w:r>
-      <w:r>
-        <w:t xml:space="preserve"> </w:t>
-      </w:r>
-      <w:r>
-        <w:t xml:space="preserve">Vaccination and Autism: A Nationwide Cohort Study. Ann Intern Med.</w:t>
-      </w:r>
-      <w:r>
-        <w:t xml:space="preserve"> </w:t>
-      </w:r>
-      <w:r>
-        <w:t xml:space="preserve">2019;170(8):513–520. doi:10.7326/M18-2101.</w:t>
-      </w:r>
-    </w:p>
-    <w:p>
-      <w:pPr>
-        <w:numPr>
-          <w:ilvl w:val="0"/>
-          <w:numId w:val="1011"/>
-        </w:numPr>
-      </w:pPr>
-      <w:r>
-        <w:t xml:space="preserve">Taylor B, et al. Measles, mumps, and rubella vaccination and bowel</w:t>
-      </w:r>
-      <w:r>
-        <w:t xml:space="preserve"> </w:t>
-      </w:r>
-      <w:r>
-        <w:t xml:space="preserve">problems or developmental regression in children with autism:</w:t>
-      </w:r>
-      <w:r>
-        <w:t xml:space="preserve"> </w:t>
-      </w:r>
-      <w:r>
-        <w:t xml:space="preserve">population study. BMJ. 2002;324:393–396. PMID: 11850369.</w:t>
-      </w:r>
-    </w:p>
-    <w:p>
-      <w:pPr>
-        <w:numPr>
-          <w:ilvl w:val="0"/>
-          <w:numId w:val="1011"/>
-        </w:numPr>
-      </w:pPr>
-      <w:r>
-        <w:t xml:space="preserve">U.S. Department of Health and Human Services, Office for Civil</w:t>
-      </w:r>
-      <w:r>
-        <w:t xml:space="preserve"> </w:t>
-      </w:r>
-      <w:r>
-        <w:t xml:space="preserve">Rights. Guidance Regarding Methods for De-identification of</w:t>
-      </w:r>
-      <w:r>
-        <w:t xml:space="preserve"> </w:t>
-      </w:r>
-      <w:r>
-        <w:t xml:space="preserve">Protected Health Information under the HIPAA Privacy Rule.</w:t>
-      </w:r>
-    </w:p>
-    <w:p>
-      <w:pPr>
-        <w:numPr>
-          <w:ilvl w:val="0"/>
-          <w:numId w:val="1011"/>
-        </w:numPr>
-      </w:pPr>
-      <w:r>
         <w:t xml:space="preserve">U.S. Department of Health and Human Services, Office for Human</w:t>
       </w:r>
       <w:r>
@@ -4781,7 +5240,7 @@
         <w:t xml:space="preserve">information and waiver/alteration of informed consent.</w:t>
       </w:r>
     </w:p>
-    <w:bookmarkEnd w:id="47"/>
+    <w:bookmarkEnd w:id="48"/>
     <w:sectPr>
       <w:footnotePr>
         <w:numRestart w:val="eachSect"/>
@@ -5078,176 +5537,6 @@
       <w:rPr>
         <w:rFonts w:ascii="Wingdings" w:hAnsi="Wingdings" w:cs="Wingdings" w:hint="default"/>
       </w:rPr>
-    </w:lvl>
-  </w:abstractNum>
-  <w:abstractNum w:abstractNumId="99414">
-    <w:nsid w:val="00A99414"/>
-    <w:multiLevelType w:val="multilevel"/>
-    <w:lvl w:ilvl="0">
-      <w:start w:val="4"/>
-      <w:numFmt w:val="decimal"/>
-      <w:lvlText w:val="%1."/>
-      <w:lvlJc w:val="left"/>
-      <w:pPr>
-        <w:ind w:left="720" w:hanging="360"/>
-      </w:pPr>
-    </w:lvl>
-    <w:lvl w:ilvl="1">
-      <w:start w:val="4"/>
-      <w:numFmt w:val="decimal"/>
-      <w:lvlText w:val="%2."/>
-      <w:lvlJc w:val="left"/>
-      <w:pPr>
-        <w:ind w:left="1440" w:hanging="360"/>
-      </w:pPr>
-    </w:lvl>
-    <w:lvl w:ilvl="2">
-      <w:start w:val="4"/>
-      <w:numFmt w:val="decimal"/>
-      <w:lvlText w:val="%3."/>
-      <w:lvlJc w:val="left"/>
-      <w:pPr>
-        <w:ind w:left="2160" w:hanging="360"/>
-      </w:pPr>
-    </w:lvl>
-    <w:lvl w:ilvl="3">
-      <w:start w:val="4"/>
-      <w:numFmt w:val="decimal"/>
-      <w:lvlText w:val="%4."/>
-      <w:lvlJc w:val="left"/>
-      <w:pPr>
-        <w:ind w:left="2880" w:hanging="360"/>
-      </w:pPr>
-    </w:lvl>
-    <w:lvl w:ilvl="4">
-      <w:start w:val="4"/>
-      <w:numFmt w:val="decimal"/>
-      <w:lvlText w:val="%5."/>
-      <w:lvlJc w:val="left"/>
-      <w:pPr>
-        <w:ind w:left="3600" w:hanging="360"/>
-      </w:pPr>
-    </w:lvl>
-    <w:lvl w:ilvl="5">
-      <w:start w:val="4"/>
-      <w:numFmt w:val="decimal"/>
-      <w:lvlText w:val="%6."/>
-      <w:lvlJc w:val="left"/>
-      <w:pPr>
-        <w:ind w:left="4320" w:hanging="360"/>
-      </w:pPr>
-    </w:lvl>
-    <w:lvl w:ilvl="6">
-      <w:start w:val="4"/>
-      <w:numFmt w:val="decimal"/>
-      <w:lvlText w:val="%7."/>
-      <w:lvlJc w:val="left"/>
-      <w:pPr>
-        <w:ind w:left="5040" w:hanging="360"/>
-      </w:pPr>
-    </w:lvl>
-    <w:lvl w:ilvl="7">
-      <w:start w:val="4"/>
-      <w:numFmt w:val="decimal"/>
-      <w:lvlText w:val="%8."/>
-      <w:lvlJc w:val="left"/>
-      <w:pPr>
-        <w:ind w:left="5760" w:hanging="360"/>
-      </w:pPr>
-    </w:lvl>
-    <w:lvl w:ilvl="8">
-      <w:start w:val="4"/>
-      <w:numFmt w:val="decimal"/>
-      <w:lvlText w:val="%9."/>
-      <w:lvlJc w:val="left"/>
-      <w:pPr>
-        <w:ind w:left="6480" w:hanging="360"/>
-      </w:pPr>
-    </w:lvl>
-  </w:abstractNum>
-  <w:abstractNum w:abstractNumId="994110">
-    <w:nsid w:val="0A994110"/>
-    <w:multiLevelType w:val="multilevel"/>
-    <w:lvl w:ilvl="0">
-      <w:start w:val="10"/>
-      <w:numFmt w:val="decimal"/>
-      <w:lvlText w:val="%1."/>
-      <w:lvlJc w:val="left"/>
-      <w:pPr>
-        <w:ind w:left="720" w:hanging="360"/>
-      </w:pPr>
-    </w:lvl>
-    <w:lvl w:ilvl="1">
-      <w:start w:val="10"/>
-      <w:numFmt w:val="decimal"/>
-      <w:lvlText w:val="%2."/>
-      <w:lvlJc w:val="left"/>
-      <w:pPr>
-        <w:ind w:left="1440" w:hanging="360"/>
-      </w:pPr>
-    </w:lvl>
-    <w:lvl w:ilvl="2">
-      <w:start w:val="10"/>
-      <w:numFmt w:val="decimal"/>
-      <w:lvlText w:val="%3."/>
-      <w:lvlJc w:val="left"/>
-      <w:pPr>
-        <w:ind w:left="2160" w:hanging="360"/>
-      </w:pPr>
-    </w:lvl>
-    <w:lvl w:ilvl="3">
-      <w:start w:val="10"/>
-      <w:numFmt w:val="decimal"/>
-      <w:lvlText w:val="%4."/>
-      <w:lvlJc w:val="left"/>
-      <w:pPr>
-        <w:ind w:left="2880" w:hanging="360"/>
-      </w:pPr>
-    </w:lvl>
-    <w:lvl w:ilvl="4">
-      <w:start w:val="10"/>
-      <w:numFmt w:val="decimal"/>
-      <w:lvlText w:val="%5."/>
-      <w:lvlJc w:val="left"/>
-      <w:pPr>
-        <w:ind w:left="3600" w:hanging="360"/>
-      </w:pPr>
-    </w:lvl>
-    <w:lvl w:ilvl="5">
-      <w:start w:val="10"/>
-      <w:numFmt w:val="decimal"/>
-      <w:lvlText w:val="%6."/>
-      <w:lvlJc w:val="left"/>
-      <w:pPr>
-        <w:ind w:left="4320" w:hanging="360"/>
-      </w:pPr>
-    </w:lvl>
-    <w:lvl w:ilvl="6">
-      <w:start w:val="10"/>
-      <w:numFmt w:val="decimal"/>
-      <w:lvlText w:val="%7."/>
-      <w:lvlJc w:val="left"/>
-      <w:pPr>
-        <w:ind w:left="5040" w:hanging="360"/>
-      </w:pPr>
-    </w:lvl>
-    <w:lvl w:ilvl="7">
-      <w:start w:val="10"/>
-      <w:numFmt w:val="decimal"/>
-      <w:lvlText w:val="%8."/>
-      <w:lvlJc w:val="left"/>
-      <w:pPr>
-        <w:ind w:left="5760" w:hanging="360"/>
-      </w:pPr>
-    </w:lvl>
-    <w:lvl w:ilvl="8">
-      <w:start w:val="10"/>
-      <w:numFmt w:val="decimal"/>
-      <w:lvlText w:val="%9."/>
-      <w:lvlJc w:val="left"/>
-      <w:pPr>
-        <w:ind w:left="6480" w:hanging="360"/>
-      </w:pPr>
     </w:lvl>
   </w:abstractNum>
   <w:num w:numId="1000">
@@ -5290,33 +5579,33 @@
     <w:abstractNumId w:val="991"/>
   </w:num>
   <w:num w:numId="1004">
-    <w:abstractNumId w:val="99414"/>
+    <w:abstractNumId w:val="99411"/>
     <w:lvlOverride w:ilvl="0">
-      <w:startOverride w:val="4"/>
+      <w:startOverride w:val="1"/>
     </w:lvlOverride>
     <w:lvlOverride w:ilvl="1">
-      <w:startOverride w:val="4"/>
+      <w:startOverride w:val="1"/>
     </w:lvlOverride>
     <w:lvlOverride w:ilvl="2">
-      <w:startOverride w:val="4"/>
+      <w:startOverride w:val="1"/>
     </w:lvlOverride>
     <w:lvlOverride w:ilvl="3">
-      <w:startOverride w:val="4"/>
+      <w:startOverride w:val="1"/>
     </w:lvlOverride>
     <w:lvlOverride w:ilvl="4">
-      <w:startOverride w:val="4"/>
+      <w:startOverride w:val="1"/>
     </w:lvlOverride>
     <w:lvlOverride w:ilvl="5">
-      <w:startOverride w:val="4"/>
+      <w:startOverride w:val="1"/>
     </w:lvlOverride>
     <w:lvlOverride w:ilvl="6">
-      <w:startOverride w:val="4"/>
+      <w:startOverride w:val="1"/>
     </w:lvlOverride>
     <w:lvlOverride w:ilvl="7">
-      <w:startOverride w:val="4"/>
+      <w:startOverride w:val="1"/>
     </w:lvlOverride>
     <w:lvlOverride w:ilvl="8">
-      <w:startOverride w:val="4"/>
+      <w:startOverride w:val="1"/>
     </w:lvlOverride>
   </w:num>
   <w:num w:numId="1005">
@@ -5326,45 +5615,42 @@
     <w:abstractNumId w:val="991"/>
   </w:num>
   <w:num w:numId="1007">
-    <w:abstractNumId w:val="991"/>
+    <w:abstractNumId w:val="99411"/>
+    <w:lvlOverride w:ilvl="0">
+      <w:startOverride w:val="1"/>
+    </w:lvlOverride>
+    <w:lvlOverride w:ilvl="1">
+      <w:startOverride w:val="1"/>
+    </w:lvlOverride>
+    <w:lvlOverride w:ilvl="2">
+      <w:startOverride w:val="1"/>
+    </w:lvlOverride>
+    <w:lvlOverride w:ilvl="3">
+      <w:startOverride w:val="1"/>
+    </w:lvlOverride>
+    <w:lvlOverride w:ilvl="4">
+      <w:startOverride w:val="1"/>
+    </w:lvlOverride>
+    <w:lvlOverride w:ilvl="5">
+      <w:startOverride w:val="1"/>
+    </w:lvlOverride>
+    <w:lvlOverride w:ilvl="6">
+      <w:startOverride w:val="1"/>
+    </w:lvlOverride>
+    <w:lvlOverride w:ilvl="7">
+      <w:startOverride w:val="1"/>
+    </w:lvlOverride>
+    <w:lvlOverride w:ilvl="8">
+      <w:startOverride w:val="1"/>
+    </w:lvlOverride>
   </w:num>
   <w:num w:numId="1008">
-    <w:abstractNumId w:val="994110"/>
-    <w:lvlOverride w:ilvl="0">
-      <w:startOverride w:val="10"/>
-    </w:lvlOverride>
-    <w:lvlOverride w:ilvl="1">
-      <w:startOverride w:val="10"/>
-    </w:lvlOverride>
-    <w:lvlOverride w:ilvl="2">
-      <w:startOverride w:val="10"/>
-    </w:lvlOverride>
-    <w:lvlOverride w:ilvl="3">
-      <w:startOverride w:val="10"/>
-    </w:lvlOverride>
-    <w:lvlOverride w:ilvl="4">
-      <w:startOverride w:val="10"/>
-    </w:lvlOverride>
-    <w:lvlOverride w:ilvl="5">
-      <w:startOverride w:val="10"/>
-    </w:lvlOverride>
-    <w:lvlOverride w:ilvl="6">
-      <w:startOverride w:val="10"/>
-    </w:lvlOverride>
-    <w:lvlOverride w:ilvl="7">
-      <w:startOverride w:val="10"/>
-    </w:lvlOverride>
-    <w:lvlOverride w:ilvl="8">
-      <w:startOverride w:val="10"/>
-    </w:lvlOverride>
+    <w:abstractNumId w:val="991"/>
   </w:num>
   <w:num w:numId="1009">
     <w:abstractNumId w:val="991"/>
   </w:num>
   <w:num w:numId="1010">
-    <w:abstractNumId w:val="991"/>
-  </w:num>
-  <w:num w:numId="1011">
     <w:abstractNumId w:val="99411"/>
     <w:lvlOverride w:ilvl="0">
       <w:startOverride w:val="1"/>

</xml_diff>

<commit_message>
Finalize IRB protocol and data privacy safeguards
</commit_message>
<xml_diff>
--- a/irb_submission/IRB_SUBMISSION_BUNDLE/01_SORA_IRB_Submission_Packet.docx
+++ b/irb_submission/IRB_SUBMISSION_BUNDLE/01_SORA_IRB_Submission_Packet.docx
@@ -132,7 +132,7 @@
               <w:pStyle w:val="Compact"/>
             </w:pPr>
             <w:r>
-              <w:t xml:space="preserve">[IRB assigned] / Version 1.1 / 11 August 2026</w:t>
+              <w:t xml:space="preserve">[IRB assigned] / Version 1.2 / 11 August 2026</w:t>
             </w:r>
           </w:p>
         </w:tc>
@@ -750,7 +750,7 @@
         <w:t xml:space="preserve"> </w:t>
       </w:r>
       <w:r>
-        <w:t xml:space="preserve">clinical data created before the study cutoff date of [date] for</w:t>
+        <w:t xml:space="preserve">clinical data created on or before 11 August 2026 for</w:t>
       </w:r>
       <w:r>
         <w:t xml:space="preserve"> </w:t>
@@ -816,19 +816,13 @@
         <w:t xml:space="preserve"> </w:t>
       </w:r>
       <w:r>
-        <w:t xml:space="preserve">timing results. The final minimum sample-size requirement will be</w:t>
-      </w:r>
-      <w:r>
-        <w:t xml:space="preserve"> </w:t>
-      </w:r>
-      <w:r>
-        <w:t xml:space="preserve">confirmed through simulation by the study statistician before data</w:t>
-      </w:r>
-      <w:r>
-        <w:t xml:space="preserve"> </w:t>
-      </w:r>
-      <w:r>
-        <w:t xml:space="preserve">collection begins.</w:t>
+        <w:t xml:space="preserve">timing results. The precision basis and fixed sensitivity analyses are</w:t>
+      </w:r>
+      <w:r>
+        <w:t xml:space="preserve"> </w:t>
+      </w:r>
+      <w:r>
+        <w:t xml:space="preserve">specified in Section 9.6 and will not be altered using study outcomes.</w:t>
       </w:r>
     </w:p>
     <w:bookmarkEnd w:id="14"/>
@@ -1039,7 +1033,25 @@
         <w:t xml:space="preserve"> </w:t>
       </w:r>
       <w:r>
-        <w:t xml:space="preserve">[start year] through [end year].</w:t>
+        <w:t xml:space="preserve">The start date will be documented in the site activation log before</w:t>
+      </w:r>
+      <w:r>
+        <w:t xml:space="preserve"> </w:t>
+      </w:r>
+      <w:r>
+        <w:t xml:space="preserve">screening based on record-system availability; the end date will be</w:t>
+      </w:r>
+      <w:r>
+        <w:t xml:space="preserve"> </w:t>
+      </w:r>
+      <w:r>
+        <w:t xml:space="preserve">no later than 11 August 2026. The period will not be selected or</w:t>
+      </w:r>
+      <w:r>
+        <w:t xml:space="preserve"> </w:t>
+      </w:r>
+      <w:r>
+        <w:t xml:space="preserve">changed in response to observed timing results.</w:t>
       </w:r>
     </w:p>
     <w:bookmarkEnd w:id="16"/>
@@ -1454,18 +1466,18 @@
               <w:pStyle w:val="Compact"/>
             </w:pPr>
             <w:r>
-              <w:t xml:space="preserve">Nonidentifying code assigned for analysis; clinic-name mapping is restricted</w:t>
-            </w:r>
-          </w:p>
-        </w:tc>
-        <w:tc>
-          <w:tcPr/>
-          <w:p>
-            <w:pPr>
-              <w:pStyle w:val="Compact"/>
-            </w:pPr>
-            <w:r>
-              <w:t xml:space="preserve">Required internally; recoded or removed before public release</w:t>
+              <w:t xml:space="preserve">Study code assigned for analysis; clinic-name mapping is stored separately and restricted</w:t>
+            </w:r>
+          </w:p>
+        </w:tc>
+        <w:tc>
+          <w:tcPr/>
+          <w:p>
+            <w:pPr>
+              <w:pStyle w:val="Compact"/>
+            </w:pPr>
+            <w:r>
+              <w:t xml:space="preserve">Required internally; removed or pooled before any approved public release</w:t>
             </w:r>
           </w:p>
         </w:tc>
@@ -1716,7 +1728,7 @@
         <w:t xml:space="preserve"> </w:t>
       </w:r>
       <w:r>
-        <w:t xml:space="preserve">nonidentifying site code is retained internally only to support</w:t>
+        <w:t xml:space="preserve">site code is retained internally only to support</w:t>
       </w:r>
       <w:r>
         <w:t xml:space="preserve"> </w:t>
@@ -1861,43 +1873,93 @@
         <w:t xml:space="preserve"> </w:t>
       </w:r>
       <w:r>
-        <w:t xml:space="preserve">qualifying cases using age in whole days. Before database lock, the</w:t>
-      </w:r>
-      <w:r>
-        <w:t xml:space="preserve"> </w:t>
-      </w:r>
-      <w:r>
-        <w:t xml:space="preserve">statistician will prespecify a smoothing scale substantially wider than</w:t>
-      </w:r>
-      <w:r>
-        <w:t xml:space="preserve"> </w:t>
-      </w:r>
-      <w:r>
-        <w:t xml:space="preserve">the 1–7-day windows being examined, so short localized peaks are not</w:t>
-      </w:r>
-      <w:r>
-        <w:t xml:space="preserve"> </w:t>
-      </w:r>
-      <w:r>
-        <w:t xml:space="preserve">absorbed into the developmental-age trend. Estimation will be</w:t>
-      </w:r>
-      <w:r>
-        <w:t xml:space="preserve"> </w:t>
-      </w:r>
-      <w:r>
-        <w:t xml:space="preserve">cross-fitted by site: each site's expected age curve will be estimated</w:t>
-      </w:r>
-      <w:r>
-        <w:t xml:space="preserve"> </w:t>
-      </w:r>
-      <w:r>
-        <w:t xml:space="preserve">without that site's cases, or by another prespecified cross-fitting</w:t>
-      </w:r>
-      <w:r>
-        <w:t xml:space="preserve"> </w:t>
-      </w:r>
-      <w:r>
-        <w:t xml:space="preserve">scheme appropriate to site sizes. Raw age histograms, the smooth curve,</w:t>
+        <w:t xml:space="preserve">qualifying cases using age in whole days from 0 through 1,826 days. The</w:t>
+      </w:r>
+      <w:r>
+        <w:t xml:space="preserve"> </w:t>
+      </w:r>
+      <w:r>
+        <w:t xml:space="preserve">prespecified estimator is a Gaussian kernel density estimate with a</w:t>
+      </w:r>
+      <w:r>
+        <w:t xml:space="preserve"> </w:t>
+      </w:r>
+      <w:r>
+        <w:t xml:space="preserve">60-day bandwidth and reflection at the 0- and 1,826-day boundaries.</w:t>
+      </w:r>
+      <w:r>
+        <w:t xml:space="preserve"> </w:t>
+      </w:r>
+      <w:r>
+        <w:t xml:space="preserve">This bandwidth is deliberately much</w:t>
+      </w:r>
+      <w:r>
+        <w:t xml:space="preserve"> </w:t>
+      </w:r>
+      <w:r>
+        <w:t xml:space="preserve">wider than the 1–7-day timing windows and therefore estimates the broad</w:t>
+      </w:r>
+      <w:r>
+        <w:t xml:space="preserve"> </w:t>
+      </w:r>
+      <w:r>
+        <w:t xml:space="preserve">developmental-age pattern rather than short peaks. Sensitivity analyses</w:t>
+      </w:r>
+      <w:r>
+        <w:t xml:space="preserve"> </w:t>
+      </w:r>
+      <w:r>
+        <w:t xml:space="preserve">will use 30-, 90-, and 120-day bandwidths. No bandwidth will be selected</w:t>
+      </w:r>
+      <w:r>
+        <w:t xml:space="preserve"> </w:t>
+      </w:r>
+      <w:r>
+        <w:t xml:space="preserve">by optimizing the apparent post-vaccination signal.</w:t>
+      </w:r>
+    </w:p>
+    <w:p>
+      <w:pPr>
+        <w:pStyle w:val="BodyText"/>
+      </w:pPr>
+      <w:r>
+        <w:t xml:space="preserve">Estimation will be leave-one-site-out: for every record from site s, the</w:t>
+      </w:r>
+      <w:r>
+        <w:t xml:space="preserve"> </w:t>
+      </w:r>
+      <w:r>
+        <w:t xml:space="preserve">reference density at each age will be estimated using all qualifying</w:t>
+      </w:r>
+      <w:r>
+        <w:t xml:space="preserve"> </w:t>
+      </w:r>
+      <w:r>
+        <w:t xml:space="preserve">records from sites other than s. If exclusion of a site leaves fewer</w:t>
+      </w:r>
+      <w:r>
+        <w:t xml:space="preserve"> </w:t>
+      </w:r>
+      <w:r>
+        <w:t xml:space="preserve">than 100 reference records, that site's curve will be labeled unstable</w:t>
+      </w:r>
+      <w:r>
+        <w:t xml:space="preserve"> </w:t>
+      </w:r>
+      <w:r>
+        <w:t xml:space="preserve">and its records will not contribute to the Monte Carlo p value; they</w:t>
+      </w:r>
+      <w:r>
+        <w:t xml:space="preserve"> </w:t>
+      </w:r>
+      <w:r>
+        <w:t xml:space="preserve">remain in all descriptive analyses. Raw</w:t>
+      </w:r>
+      <w:r>
+        <w:t xml:space="preserve"> </w:t>
+      </w:r>
+      <w:r>
+        <w:t xml:space="preserve">7-day and 30-day age histograms, the prespecified smooth curve,</w:t>
       </w:r>
       <w:r>
         <w:t xml:space="preserve"> </w:t>
@@ -1929,7 +1991,7 @@
         <w:t xml:space="preserve"> </w:t>
       </w:r>
       <w:r>
-        <w:t xml:space="preserve">onset frequency at that developmental age rather than assumed uniform.</w:t>
+        <w:t xml:space="preserve">onset density at that developmental age rather than assumed uniform.</w:t>
       </w:r>
       <w:r>
         <w:t xml:space="preserve"> </w:t>
@@ -2051,31 +2113,97 @@
         <w:t xml:space="preserve"> </w:t>
       </w:r>
       <w:r>
-        <w:t xml:space="preserve">excess statistic and its randomization-adjusted p value may be reported</w:t>
-      </w:r>
-      <w:r>
-        <w:t xml:space="preserve"> </w:t>
-      </w:r>
-      <w:r>
-        <w:t xml:space="preserve">only under a statistician-approved null model finalized before database</w:t>
-      </w:r>
-      <w:r>
-        <w:t xml:space="preserve"> </w:t>
-      </w:r>
-      <w:r>
-        <w:t xml:space="preserve">lock; otherwise the scan is descriptive. The selected peak will always</w:t>
-      </w:r>
-      <w:r>
-        <w:t xml:space="preserve"> </w:t>
-      </w:r>
-      <w:r>
-        <w:t xml:space="preserve">be labeled data-adaptive. The protocol does not assume onset is uniform</w:t>
-      </w:r>
-      <w:r>
-        <w:t xml:space="preserve"> </w:t>
-      </w:r>
-      <w:r>
-        <w:t xml:space="preserve">between vaccinations.</w:t>
+        <w:t xml:space="preserve">excess statistic will be reported descriptively. For the secondary</w:t>
+      </w:r>
+      <w:r>
+        <w:t xml:space="preserve"> </w:t>
+      </w:r>
+      <w:r>
+        <w:t xml:space="preserve">adjacent-interval analysis, the expected probability for each onset day</w:t>
+      </w:r>
+      <w:r>
+        <w:t xml:space="preserve"> </w:t>
+      </w:r>
+      <w:r>
+        <w:t xml:space="preserve">is the cross-fitted age-density value for that day divided by the sum of</w:t>
+      </w:r>
+      <w:r>
+        <w:t xml:space="preserve"> </w:t>
+      </w:r>
+      <w:r>
+        <w:t xml:space="preserve">those values over the child's adjacent-vaccination interval. One hundred</w:t>
+      </w:r>
+      <w:r>
+        <w:t xml:space="preserve"> </w:t>
+      </w:r>
+      <w:r>
+        <w:t xml:space="preserve">thousand Monte Carlo datasets will draw one onset day per child from</w:t>
+      </w:r>
+      <w:r>
+        <w:t xml:space="preserve"> </w:t>
+      </w:r>
+      <w:r>
+        <w:t xml:space="preserve">these probabilities while preserving each child's observed interval and</w:t>
+      </w:r>
+      <w:r>
+        <w:t xml:space="preserve"> </w:t>
+      </w:r>
+      <w:r>
+        <w:t xml:space="preserve">site. For each scanned Dpre window W, O(W) is the observed number of</w:t>
+      </w:r>
+      <w:r>
+        <w:t xml:space="preserve"> </w:t>
+      </w:r>
+      <w:r>
+        <w:t xml:space="preserve">records in W; E(W) and SD(W) are the Monte Carlo mean and standard</w:t>
+      </w:r>
+      <w:r>
+        <w:t xml:space="preserve"> </w:t>
+      </w:r>
+      <w:r>
+        <w:t xml:space="preserve">deviation of that count; and Z(W)=[O(W)-E(W)]/SD(W). The scan statistic</w:t>
+      </w:r>
+      <w:r>
+        <w:t xml:space="preserve"> </w:t>
+      </w:r>
+      <w:r>
+        <w:t xml:space="preserve">is the largest Z(W), with windows having SD(W)=0 omitted. The familywise</w:t>
+      </w:r>
+      <w:r>
+        <w:t xml:space="preserve"> </w:t>
+      </w:r>
+      <w:r>
+        <w:t xml:space="preserve">p value is (1 plus the number of simulated maximum statistics at least</w:t>
+      </w:r>
+      <w:r>
+        <w:t xml:space="preserve"> </w:t>
+      </w:r>
+      <w:r>
+        <w:t xml:space="preserve">as large as observed)/(100,001). The Monte Carlo seed will be fixed at</w:t>
+      </w:r>
+      <w:r>
+        <w:t xml:space="preserve"> </w:t>
+      </w:r>
+      <w:r>
+        <w:t xml:space="preserve">20260811 and published. This p value is exploratory because later</w:t>
+      </w:r>
+      <w:r>
+        <w:t xml:space="preserve"> </w:t>
+      </w:r>
+      <w:r>
+        <w:t xml:space="preserve">vaccination is required and the reference curve comes from a selected</w:t>
+      </w:r>
+      <w:r>
+        <w:t xml:space="preserve"> </w:t>
+      </w:r>
+      <w:r>
+        <w:t xml:space="preserve">case series. The selected peak will always be labeled data-adaptive. The</w:t>
+      </w:r>
+      <w:r>
+        <w:t xml:space="preserve"> </w:t>
+      </w:r>
+      <w:r>
+        <w:t xml:space="preserve">protocol does not assume onset is uniform between vaccinations.</w:t>
       </w:r>
     </w:p>
     <w:p>
@@ -2155,19 +2283,49 @@
         <w:t xml:space="preserve"> </w:t>
       </w:r>
       <w:r>
-        <w:t xml:space="preserve">corresponding proportion in the clinic source population using</w:t>
-      </w:r>
-      <w:r>
-        <w:t xml:space="preserve"> </w:t>
-      </w:r>
-      <w:r>
-        <w:t xml:space="preserve">site-stratified estimates and a pooled method prespecified by the</w:t>
-      </w:r>
-      <w:r>
-        <w:t xml:space="preserve"> </w:t>
-      </w:r>
-      <w:r>
-        <w:t xml:space="preserve">statistician. These aggregate counts contain no patient-level data.</w:t>
+        <w:t xml:space="preserve">corresponding proportion in the clinic source population. Each site's</w:t>
+      </w:r>
+      <w:r>
+        <w:t xml:space="preserve"> </w:t>
+      </w:r>
+      <w:r>
+        <w:t xml:space="preserve">risk ratio and risk difference will be shown with exact binomial</w:t>
+      </w:r>
+      <w:r>
+        <w:t xml:space="preserve"> </w:t>
+      </w:r>
+      <w:r>
+        <w:t xml:space="preserve">confidence intervals. The pooled analysis will use a Mantel-Haenszel</w:t>
+      </w:r>
+      <w:r>
+        <w:t xml:space="preserve"> </w:t>
+      </w:r>
+      <w:r>
+        <w:t xml:space="preserve">risk ratio stratified by clinic; a continuity-corrected estimate and</w:t>
+      </w:r>
+      <w:r>
+        <w:t xml:space="preserve"> </w:t>
+      </w:r>
+      <w:r>
+        <w:t xml:space="preserve">exact or Monte Carlo confidence interval will be used when any cell is</w:t>
+      </w:r>
+      <w:r>
+        <w:t xml:space="preserve"> </w:t>
+      </w:r>
+      <w:r>
+        <w:t xml:space="preserve">zero. A pooled estimate will not be reported if fewer than three sites</w:t>
+      </w:r>
+      <w:r>
+        <w:t xml:space="preserve"> </w:t>
+      </w:r>
+      <w:r>
+        <w:t xml:space="preserve">provide valid denominators. These aggregate counts contain no</w:t>
+      </w:r>
+      <w:r>
+        <w:t xml:space="preserve"> </w:t>
+      </w:r>
+      <w:r>
+        <w:t xml:space="preserve">patient-level data.</w:t>
       </w:r>
     </w:p>
     <w:p>
@@ -2223,55 +2381,79 @@
         <w:t xml:space="preserve"> </w:t>
       </w:r>
       <w:r>
-        <w:t xml:space="preserve">observable, by age, sex, vaccination-before-onset status, and Dpre. Site</w:t>
-      </w:r>
-      <w:r>
-        <w:t xml:space="preserve"> </w:t>
-      </w:r>
-      <w:r>
-        <w:t xml:space="preserve">heterogeneity is an estimand; analyses will include site-stratified and</w:t>
-      </w:r>
-      <w:r>
-        <w:t xml:space="preserve"> </w:t>
-      </w:r>
-      <w:r>
-        <w:t xml:space="preserve">leave-one-site-out results. With only five or a small number of sites,</w:t>
-      </w:r>
-      <w:r>
-        <w:t xml:space="preserve"> </w:t>
-      </w:r>
-      <w:r>
-        <w:t xml:space="preserve">the statistician will use a small-sample-valid fixed-effect,</w:t>
-      </w:r>
-      <w:r>
-        <w:t xml:space="preserve"> </w:t>
-      </w:r>
-      <w:r>
-        <w:t xml:space="preserve">randomization, or hierarchical method rather than uncorrected</w:t>
-      </w:r>
-      <w:r>
-        <w:t xml:space="preserve"> </w:t>
-      </w:r>
-      <w:r>
-        <w:t xml:space="preserve">cluster-robust standard errors. Confirmatory and exploratory analyses,</w:t>
-      </w:r>
-      <w:r>
-        <w:t xml:space="preserve"> </w:t>
-      </w:r>
-      <w:r>
-        <w:t xml:space="preserve">if any, and their multiplicity family will be frozen before database</w:t>
-      </w:r>
-      <w:r>
-        <w:t xml:space="preserve"> </w:t>
-      </w:r>
-      <w:r>
-        <w:t xml:space="preserve">lock. No record will be excluded because its timing value is unfavorable</w:t>
-      </w:r>
-      <w:r>
-        <w:t xml:space="preserve"> </w:t>
-      </w:r>
-      <w:r>
-        <w:t xml:space="preserve">to a hypothesis.</w:t>
+        <w:t xml:space="preserve">observable, by age, sex, vaccination-before-onset status, and Dpre. No</w:t>
+      </w:r>
+      <w:r>
+        <w:t xml:space="preserve"> </w:t>
+      </w:r>
+      <w:r>
+        <w:t xml:space="preserve">patient-level value will be imputed. Invalid values will be queried once</w:t>
+      </w:r>
+      <w:r>
+        <w:t xml:space="preserve"> </w:t>
+      </w:r>
+      <w:r>
+        <w:t xml:space="preserve">through the clinic row ID; unresolved values will be set to missing with</w:t>
+      </w:r>
+      <w:r>
+        <w:t xml:space="preserve"> </w:t>
+      </w:r>
+      <w:r>
+        <w:t xml:space="preserve">the reason retained in an internal query log. Site heterogeneity is an</w:t>
+      </w:r>
+      <w:r>
+        <w:t xml:space="preserve"> </w:t>
+      </w:r>
+      <w:r>
+        <w:t xml:space="preserve">estimand: all principal displays will be site-stratified, and pooled</w:t>
+      </w:r>
+      <w:r>
+        <w:t xml:space="preserve"> </w:t>
+      </w:r>
+      <w:r>
+        <w:t xml:space="preserve">results will be repeated after omitting each site in turn. Sex-stratified</w:t>
+      </w:r>
+      <w:r>
+        <w:t xml:space="preserve"> </w:t>
+      </w:r>
+      <w:r>
+        <w:t xml:space="preserve">results are exploratory and will be suppressed when a stratum contains</w:t>
+      </w:r>
+      <w:r>
+        <w:t xml:space="preserve"> </w:t>
+      </w:r>
+      <w:r>
+        <w:t xml:space="preserve">fewer than 11 records. No uncorrected cluster-robust standard errors will</w:t>
+      </w:r>
+      <w:r>
+        <w:t xml:space="preserve"> </w:t>
+      </w:r>
+      <w:r>
+        <w:t xml:space="preserve">be used with the small number of sites. There are no confirmatory</w:t>
+      </w:r>
+      <w:r>
+        <w:t xml:space="preserve"> </w:t>
+      </w:r>
+      <w:r>
+        <w:t xml:space="preserve">hypothesis tests. The Monte Carlo moving-window scan is one familywise-</w:t>
+      </w:r>
+      <w:r>
+        <w:t xml:space="preserve"> </w:t>
+      </w:r>
+      <w:r>
+        <w:t xml:space="preserve">adjusted exploratory test; all other p values, if shown, are labeled</w:t>
+      </w:r>
+      <w:r>
+        <w:t xml:space="preserve"> </w:t>
+      </w:r>
+      <w:r>
+        <w:t xml:space="preserve">exploratory. No record will be excluded because its timing value is</w:t>
+      </w:r>
+      <w:r>
+        <w:t xml:space="preserve"> </w:t>
+      </w:r>
+      <w:r>
+        <w:t xml:space="preserve">unfavorable to a hypothesis.</w:t>
       </w:r>
     </w:p>
     <w:bookmarkEnd w:id="25"/>
@@ -2295,49 +2477,85 @@
         <w:t xml:space="preserve"> </w:t>
       </w:r>
       <w:r>
-        <w:t xml:space="preserve">clinics. The final sample-size calculation must be completed by the</w:t>
-      </w:r>
-      <w:r>
-        <w:t xml:space="preserve"> </w:t>
-      </w:r>
-      <w:r>
-        <w:t xml:space="preserve">study statistician using conservative age-curve shapes, alternative</w:t>
-      </w:r>
-      <w:r>
-        <w:t xml:space="preserve"> </w:t>
-      </w:r>
-      <w:r>
-        <w:t xml:space="preserve">smoothing scales, short-window concentrations including a days 2–4</w:t>
-      </w:r>
-      <w:r>
-        <w:t xml:space="preserve"> </w:t>
-      </w:r>
-      <w:r>
-        <w:t xml:space="preserve">peak, unequal site contributions,</w:t>
-      </w:r>
-      <w:r>
-        <w:t xml:space="preserve"> </w:t>
-      </w:r>
-      <w:r>
-        <w:t xml:space="preserve">within-site dependence, missing Dpost, and any multiplicity adjustment.</w:t>
-      </w:r>
-      <w:r>
-        <w:t xml:space="preserve"> </w:t>
-      </w:r>
-      <w:r>
-        <w:t xml:space="preserve">The simulation and its assumptions will be finalized before IRB approval</w:t>
-      </w:r>
-      <w:r>
-        <w:t xml:space="preserve"> </w:t>
-      </w:r>
-      <w:r>
-        <w:t xml:space="preserve">and data collection and will not use observed study outcomes to stop or</w:t>
-      </w:r>
-      <w:r>
-        <w:t xml:space="preserve"> </w:t>
-      </w:r>
-      <w:r>
-        <w:t xml:space="preserve">extend enrollment.</w:t>
+        <w:t xml:space="preserve">clinics. This is a precision-based target for an exploratory case series,</w:t>
+      </w:r>
+      <w:r>
+        <w:t xml:space="preserve"> </w:t>
+      </w:r>
+      <w:r>
+        <w:t xml:space="preserve">not a claim of power for a causal effect. At n=300, a proportion near</w:t>
+      </w:r>
+      <w:r>
+        <w:t xml:space="preserve"> </w:t>
+      </w:r>
+      <w:r>
+        <w:t xml:space="preserve">40% has a conventional binomial 95% confidence-interval half-width of</w:t>
+      </w:r>
+      <w:r>
+        <w:t xml:space="preserve"> </w:t>
+      </w:r>
+      <w:r>
+        <w:t xml:space="preserve">approximately 5.5 percentage points; a proportion near 10% has a</w:t>
+      </w:r>
+      <w:r>
+        <w:t xml:space="preserve"> </w:t>
+      </w:r>
+      <w:r>
+        <w:t xml:space="preserve">half-width of approximately 3.4 points. Site stratification and</w:t>
+      </w:r>
+      <w:r>
+        <w:t xml:space="preserve"> </w:t>
+      </w:r>
+      <w:r>
+        <w:t xml:space="preserve">dependence may widen uncertainty, so confidence intervals and</w:t>
+      </w:r>
+      <w:r>
+        <w:t xml:space="preserve"> </w:t>
+      </w:r>
+      <w:r>
+        <w:t xml:space="preserve">site-specific counts will be reported rather than relying on these</w:t>
+      </w:r>
+      <w:r>
+        <w:t xml:space="preserve"> </w:t>
+      </w:r>
+      <w:r>
+        <w:t xml:space="preserve">nominal values. All eligible records in each locked ascertainment period</w:t>
+      </w:r>
+      <w:r>
+        <w:t xml:space="preserve"> </w:t>
+      </w:r>
+      <w:r>
+        <w:t xml:space="preserve">will be included even if the total exceeds 300. Enrollment will not stop,</w:t>
+      </w:r>
+      <w:r>
+        <w:t xml:space="preserve"> </w:t>
+      </w:r>
+      <w:r>
+        <w:t xml:space="preserve">continue, or expand in response to the observed Dpre distribution. The</w:t>
+      </w:r>
+      <w:r>
+        <w:t xml:space="preserve"> </w:t>
+      </w:r>
+      <w:r>
+        <w:t xml:space="preserve">30-, 60-, 90-, and 120-day smoothing analyses and the 100,000-replicate</w:t>
+      </w:r>
+      <w:r>
+        <w:t xml:space="preserve"> </w:t>
+      </w:r>
+      <w:r>
+        <w:t xml:space="preserve">Monte Carlo procedure specified above constitute the operating-</w:t>
+      </w:r>
+      <w:r>
+        <w:t xml:space="preserve"> </w:t>
+      </w:r>
+      <w:r>
+        <w:t xml:space="preserve">characteristic sensitivity analysis; no outcome-informed tuning is</w:t>
+      </w:r>
+      <w:r>
+        <w:t xml:space="preserve"> </w:t>
+      </w:r>
+      <w:r>
+        <w:t xml:space="preserve">permitted.</w:t>
       </w:r>
     </w:p>
     <w:bookmarkEnd w:id="26"/>
@@ -2565,61 +2783,61 @@
         <w:pStyle w:val="FirstParagraph"/>
       </w:pPr>
       <w:r>
-        <w:t xml:space="preserve">Results will be reported regardless of direction. Row-level public</w:t>
-      </w:r>
-      <w:r>
-        <w:t xml:space="preserve"> </w:t>
-      </w:r>
-      <w:r>
-        <w:t xml:space="preserve">release may occur only after documented disclosure-risk review by</w:t>
-      </w:r>
-      <w:r>
-        <w:t xml:space="preserve"> </w:t>
-      </w:r>
-      <w:r>
-        <w:t xml:space="preserve">[named qualified reviewer/privacy office]. If acceptable risk cannot</w:t>
-      </w:r>
-      <w:r>
-        <w:t xml:space="preserve"> </w:t>
-      </w:r>
-      <w:r>
-        <w:t xml:space="preserve">be achieved, only aggregate results and analysis code will be released.</w:t>
-      </w:r>
-      <w:r>
-        <w:t xml:space="preserve"> </w:t>
-      </w:r>
-      <w:r>
-        <w:t xml:space="preserve">The internal analytic dataset will not automatically be public. Cell</w:t>
-      </w:r>
-      <w:r>
-        <w:t xml:space="preserve"> </w:t>
-      </w:r>
-      <w:r>
-        <w:t xml:space="preserve">suppression, age binning, top/bottom coding of intervals, clinic masking</w:t>
-      </w:r>
-      <w:r>
-        <w:t xml:space="preserve"> </w:t>
-      </w:r>
-      <w:r>
-        <w:t xml:space="preserve">or pooling, and removal of rare combinations will be applied as needed.</w:t>
-      </w:r>
-      <w:r>
-        <w:t xml:space="preserve"> </w:t>
-      </w:r>
-      <w:r>
-        <w:t xml:space="preserve">If Safe Harbor cannot be established because a retained variable is a</w:t>
-      </w:r>
-      <w:r>
-        <w:t xml:space="preserve"> </w:t>
-      </w:r>
-      <w:r>
-        <w:t xml:space="preserve">unique characteristic or code, a qualified expert determination will be</w:t>
-      </w:r>
-      <w:r>
-        <w:t xml:space="preserve"> </w:t>
-      </w:r>
-      <w:r>
-        <w:t xml:space="preserve">obtained before release. Neither MAPS nor investigators will attempt</w:t>
+        <w:t xml:space="preserve">Results will be reported regardless of direction. Aggregate results,</w:t>
+      </w:r>
+      <w:r>
+        <w:t xml:space="preserve"> </w:t>
+      </w:r>
+      <w:r>
+        <w:t xml:space="preserve">the frozen analysis code, and a synthetic demonstration dataset will be</w:t>
+      </w:r>
+      <w:r>
+        <w:t xml:space="preserve"> </w:t>
+      </w:r>
+      <w:r>
+        <w:t xml:space="preserve">released. Row-level study data will not be released by default. Such a</w:t>
+      </w:r>
+      <w:r>
+        <w:t xml:space="preserve"> </w:t>
+      </w:r>
+      <w:r>
+        <w:t xml:space="preserve">release may occur only after a qualified HIPAA statistical expert who is</w:t>
+      </w:r>
+      <w:r>
+        <w:t xml:space="preserve"> </w:t>
+      </w:r>
+      <w:r>
+        <w:t xml:space="preserve">independent of the analysis documents that the risk of identification is</w:t>
+      </w:r>
+      <w:r>
+        <w:t xml:space="preserve"> </w:t>
+      </w:r>
+      <w:r>
+        <w:t xml:space="preserve">very small and approves the exact public file. The public file will omit</w:t>
+      </w:r>
+      <w:r>
+        <w:t xml:space="preserve"> </w:t>
+      </w:r>
+      <w:r>
+        <w:t xml:space="preserve">clinic row IDs, replace row numbers, remove or pool site codes, suppress</w:t>
+      </w:r>
+      <w:r>
+        <w:t xml:space="preserve"> </w:t>
+      </w:r>
+      <w:r>
+        <w:t xml:space="preserve">cells smaller than 11, and bin or top-code age and extreme intervals as</w:t>
+      </w:r>
+      <w:r>
+        <w:t xml:space="preserve"> </w:t>
+      </w:r>
+      <w:r>
+        <w:t xml:space="preserve">the expert directs. If that determination is not obtained, no row-level</w:t>
+      </w:r>
+      <w:r>
+        <w:t xml:space="preserve"> </w:t>
+      </w:r>
+      <w:r>
+        <w:t xml:space="preserve">data will be released. Neither MAPS nor investigators will attempt</w:t>
       </w:r>
       <w:r>
         <w:t xml:space="preserve"> </w:t>
@@ -2679,7 +2897,7 @@
         <w:t xml:space="preserve"> </w:t>
       </w:r>
       <w:r>
-        <w:t xml:space="preserve">worksheet, calculate age in months, Dpre, and Dpost, and run</w:t>
+        <w:t xml:space="preserve">worksheet, calculate age in whole days, Dpre, and Dpost, and run</w:t>
       </w:r>
       <w:r>
         <w:t xml:space="preserve"> </w:t>
@@ -2731,13 +2949,19 @@
         <w:t xml:space="preserve"> </w:t>
       </w:r>
       <w:r>
-        <w:t xml:space="preserve">Excel workbook or an equivalent CSV file through [approved secure</w:t>
-      </w:r>
-      <w:r>
-        <w:t xml:space="preserve"> </w:t>
-      </w:r>
-      <w:r>
-        <w:t xml:space="preserve">upload portal]. Paper forms, scanned forms, photographs, fax, and</w:t>
+        <w:t xml:space="preserve">Excel workbook or an equivalent CSV file through an institution-</w:t>
+      </w:r>
+      <w:r>
+        <w:t xml:space="preserve"> </w:t>
+      </w:r>
+      <w:r>
+        <w:t xml:space="preserve">managed encrypted file-transfer portal named in the site activation</w:t>
+      </w:r>
+      <w:r>
+        <w:t xml:space="preserve"> </w:t>
+      </w:r>
+      <w:r>
+        <w:t xml:space="preserve">record. Paper forms, scanned forms, photographs, fax, email, and</w:t>
       </w:r>
       <w:r>
         <w:t xml:space="preserve"> </w:t>
@@ -2778,13 +3002,19 @@
         </w:numPr>
       </w:pPr>
       <w:r>
-        <w:t xml:space="preserve">The coordinating center stores the internal analytic file in [named</w:t>
-      </w:r>
-      <w:r>
-        <w:t xml:space="preserve"> </w:t>
-      </w:r>
-      <w:r>
-        <w:t xml:space="preserve">institution-managed encrypted platform], encrypted in transit and</w:t>
+        <w:t xml:space="preserve">The coordinating center stores the internal analytic file only in the</w:t>
+      </w:r>
+      <w:r>
+        <w:t xml:space="preserve"> </w:t>
+      </w:r>
+      <w:r>
+        <w:t xml:space="preserve">institution-managed encrypted platform named in the site activation</w:t>
+      </w:r>
+      <w:r>
+        <w:t xml:space="preserve"> </w:t>
+      </w:r>
+      <w:r>
+        <w:t xml:space="preserve">record, encrypted in transit and</w:t>
       </w:r>
       <w:r>
         <w:t xml:space="preserve"> </w:t>
@@ -3339,6 +3569,62 @@
         </w:tc>
       </w:tr>
     </w:tbl>
+    <w:p>
+      <w:pPr>
+        <w:pStyle w:val="BodyText"/>
+      </w:pPr>
+      <w:r>
+        <w:t xml:space="preserve">The PI is the access owner. Access requires documented PI approval,</w:t>
+      </w:r>
+      <w:r>
+        <w:t xml:space="preserve"> </w:t>
+      </w:r>
+      <w:r>
+        <w:t xml:space="preserve">current human-subjects/privacy training, and a role requiring the data.</w:t>
+      </w:r>
+      <w:r>
+        <w:t xml:space="preserve"> </w:t>
+      </w:r>
+      <w:r>
+        <w:t xml:space="preserve">The data manager will review the authorized-user list and audit log every</w:t>
+      </w:r>
+      <w:r>
+        <w:t xml:space="preserve"> </w:t>
+      </w:r>
+      <w:r>
+        <w:t xml:space="preserve">three months and remove access within one business day after a role ends.</w:t>
+      </w:r>
+      <w:r>
+        <w:t xml:space="preserve"> </w:t>
+      </w:r>
+      <w:r>
+        <w:t xml:space="preserve">Personal email, consumer cloud storage, portable media, and unencrypted</w:t>
+      </w:r>
+      <w:r>
+        <w:t xml:space="preserve"> </w:t>
+      </w:r>
+      <w:r>
+        <w:t xml:space="preserve">or personally owned devices are prohibited. After upload, the data</w:t>
+      </w:r>
+      <w:r>
+        <w:t xml:space="preserve"> </w:t>
+      </w:r>
+      <w:r>
+        <w:t xml:space="preserve">manager will validate receipt and row counts; authorized temporary local</w:t>
+      </w:r>
+      <w:r>
+        <w:t xml:space="preserve"> </w:t>
+      </w:r>
+      <w:r>
+        <w:t xml:space="preserve">downloads will then be deleted from transfer workstations and recycle</w:t>
+      </w:r>
+      <w:r>
+        <w:t xml:space="preserve"> </w:t>
+      </w:r>
+      <w:r>
+        <w:t xml:space="preserve">bins and the deletion recorded.</w:t>
+      </w:r>
+    </w:p>
     <w:bookmarkEnd w:id="35"/>
     <w:bookmarkStart w:id="36" w:name="X845763d3baf2fde4f7f4181b440e73c159cddaa"/>
     <w:p>
@@ -3360,37 +3646,61 @@
         <w:t xml:space="preserve"> </w:t>
       </w:r>
       <w:r>
-        <w:t xml:space="preserve">it with investigators. The received analytic dataset, audit logs, code,</w:t>
-      </w:r>
-      <w:r>
-        <w:t xml:space="preserve"> </w:t>
-      </w:r>
-      <w:r>
-        <w:t xml:space="preserve">and regulatory records will be retained for [institutional requirement,</w:t>
-      </w:r>
-      <w:r>
-        <w:t xml:space="preserve"> </w:t>
-      </w:r>
-      <w:r>
-        <w:t xml:space="preserve">commonly at least 3–7 years after study closure/publication]. Before</w:t>
-      </w:r>
-      <w:r>
-        <w:t xml:space="preserve"> </w:t>
-      </w:r>
-      <w:r>
-        <w:t xml:space="preserve">public release, clinic row IDs are replaced with new public row numbers.</w:t>
-      </w:r>
-      <w:r>
-        <w:t xml:space="preserve"> </w:t>
-      </w:r>
-      <w:r>
-        <w:t xml:space="preserve">Public-use data cannot be recalled after publication, making pre-release</w:t>
-      </w:r>
-      <w:r>
-        <w:t xml:space="preserve"> </w:t>
-      </w:r>
-      <w:r>
-        <w:t xml:space="preserve">review mandatory.</w:t>
+        <w:t xml:space="preserve">it with investigators; destruction of clinical source records is not</w:t>
+      </w:r>
+      <w:r>
+        <w:t xml:space="preserve"> </w:t>
+      </w:r>
+      <w:r>
+        <w:t xml:space="preserve">required by this protocol. The coordinating center will retain the</w:t>
+      </w:r>
+      <w:r>
+        <w:t xml:space="preserve"> </w:t>
+      </w:r>
+      <w:r>
+        <w:t xml:space="preserve">received analytic dataset, audit logs, code, and regulatory records for</w:t>
+      </w:r>
+      <w:r>
+        <w:t xml:space="preserve"> </w:t>
+      </w:r>
+      <w:r>
+        <w:t xml:space="preserve">seven years after study closure or final publication, whichever is</w:t>
+      </w:r>
+      <w:r>
+        <w:t xml:space="preserve"> </w:t>
+      </w:r>
+      <w:r>
+        <w:t xml:space="preserve">later, unless the reviewing institution requires longer retention. At</w:t>
+      </w:r>
+      <w:r>
+        <w:t xml:space="preserve"> </w:t>
+      </w:r>
+      <w:r>
+        <w:t xml:space="preserve">the end of retention, internal row-level files and working downloads will</w:t>
+      </w:r>
+      <w:r>
+        <w:t xml:space="preserve"> </w:t>
+      </w:r>
+      <w:r>
+        <w:t xml:space="preserve">be securely destroyed under institutional policy and destruction will</w:t>
+      </w:r>
+      <w:r>
+        <w:t xml:space="preserve"> </w:t>
+      </w:r>
+      <w:r>
+        <w:t xml:space="preserve">be documented. Before public release, clinic row IDs are replaced with</w:t>
+      </w:r>
+      <w:r>
+        <w:t xml:space="preserve"> </w:t>
+      </w:r>
+      <w:r>
+        <w:t xml:space="preserve">new public row numbers. Public-use data cannot be recalled after</w:t>
+      </w:r>
+      <w:r>
+        <w:t xml:space="preserve"> </w:t>
+      </w:r>
+      <w:r>
+        <w:t xml:space="preserve">publication, making pre-release review mandatory.</w:t>
       </w:r>
     </w:p>
     <w:bookmarkEnd w:id="36"/>
@@ -3414,7 +3724,13 @@
         <w:t xml:space="preserve"> </w:t>
       </w:r>
       <w:r>
-        <w:t xml:space="preserve">immediately to the PI and [privacy/security office]. Access will be</w:t>
+        <w:t xml:space="preserve">within 24 hours of discovery to the PI and the coordinating</w:t>
+      </w:r>
+      <w:r>
+        <w:t xml:space="preserve"> </w:t>
+      </w:r>
+      <w:r>
+        <w:t xml:space="preserve">institution's privacy/security official. Access will be</w:t>
       </w:r>
       <w:r>
         <w:t xml:space="preserve"> </w:t>
@@ -4732,7 +5048,7 @@
               <w:pStyle w:val="Compact"/>
             </w:pPr>
             <w:r>
-              <w:t xml:space="preserve">MAPS: [amount/source/terms]. Clinic compensation: up to $5,000 per clinic for reasonable, documented actual screening and abstraction effort, independent of whether records qualify and independent of timing or results [confirm structure]. Other support: [list/none].</w:t>
+              <w:t xml:space="preserve">List every cash and in-kind funder, amount, payment recipient, and agreement. Clinic reimbursement may be up to $5,000 per clinic solely for reasonable, documented actual screening and abstraction effort and must be independent of whether records qualify, vaccination timing, or study results.</w:t>
             </w:r>
           </w:p>
         </w:tc>
@@ -4804,7 +5120,7 @@
               <w:pStyle w:val="Compact"/>
             </w:pPr>
             <w:r>
-              <w:t xml:space="preserve">[Recruitment/data-abstraction payments; confirm payment is for reasonable costs and is not contingent on eligible-case count or study outcome].</w:t>
+              <w:t xml:space="preserve">Disclose all data-abstraction reimbursement. No payment may be per eligible SORA record or contingent on eligible-case count, timing distribution, or study outcome.</w:t>
             </w:r>
           </w:p>
         </w:tc>
@@ -4828,12 +5144,62 @@
               <w:pStyle w:val="Compact"/>
             </w:pPr>
             <w:r>
-              <w:t xml:space="preserve">Independent eligibility adjudication where feasible; blinded timing calculation until eligibility lock; prespecified analysis; independent statistician; full reporting; funding and interests disclosed in publications. [Add institutional COI committee requirements].</w:t>
+              <w:t xml:space="preserve">Eligibility is adjudicated before Dpre/Dpost calculation; the protocol, data dictionary, and code are frozen before database lock; all sites and results are reported; and all funding and interests are disclosed. Any reviewing-institution COI requirements control.</w:t>
             </w:r>
           </w:p>
         </w:tc>
       </w:tr>
     </w:tbl>
+    <w:p>
+      <w:pPr>
+        <w:pStyle w:val="BodyText"/>
+      </w:pPr>
+      <w:r>
+        <w:t xml:space="preserve">Funding may come from one or multiple sources. Funds will be pooled as</w:t>
+      </w:r>
+      <w:r>
+        <w:t xml:space="preserve"> </w:t>
+      </w:r>
+      <w:r>
+        <w:t xml:space="preserve">unrestricted study support whenever practicable. No funder may select</w:t>
+      </w:r>
+      <w:r>
+        <w:t xml:space="preserve"> </w:t>
+      </w:r>
+      <w:r>
+        <w:t xml:space="preserve">records, determine eligibility, access clinic linkage keys or the</w:t>
+      </w:r>
+      <w:r>
+        <w:t xml:space="preserve"> </w:t>
+      </w:r>
+      <w:r>
+        <w:t xml:space="preserve">internal row-level dataset, direct the analysis, suppress results, edit</w:t>
+      </w:r>
+      <w:r>
+        <w:t xml:space="preserve"> </w:t>
+      </w:r>
+      <w:r>
+        <w:t xml:space="preserve">conclusions, or veto or delay publication. Multiple funders do not alter</w:t>
+      </w:r>
+      <w:r>
+        <w:t xml:space="preserve"> </w:t>
+      </w:r>
+      <w:r>
+        <w:t xml:space="preserve">the analysis or reduce disclosure duties; each source and amount will be</w:t>
+      </w:r>
+      <w:r>
+        <w:t xml:space="preserve"> </w:t>
+      </w:r>
+      <w:r>
+        <w:t xml:space="preserve">reported separately. Investigators retain final authority over protocol,</w:t>
+      </w:r>
+      <w:r>
+        <w:t xml:space="preserve"> </w:t>
+      </w:r>
+      <w:r>
+        <w:t xml:space="preserve">analysis, interpretation, and publication.</w:t>
+      </w:r>
+    </w:p>
     <w:bookmarkEnd w:id="44"/>
     <w:bookmarkStart w:id="45" w:name="suggested-publication-disclosure"/>
     <w:p>
@@ -4941,13 +5307,13 @@
         </w:numPr>
       </w:pPr>
       <w:r>
-        <w:t xml:space="preserve">Statistical simulation/power appendix approved by a named</w:t>
-      </w:r>
-      <w:r>
-        <w:t xml:space="preserve"> </w:t>
-      </w:r>
-      <w:r>
-        <w:t xml:space="preserve">statistician.</w:t>
+        <w:t xml:space="preserve">Statistical analysis plan in Protocol Section 9, acknowledged by the</w:t>
+      </w:r>
+      <w:r>
+        <w:t xml:space="preserve"> </w:t>
+      </w:r>
+      <w:r>
+        <w:t xml:space="preserve">PI and analyst before database lock.</w:t>
       </w:r>
     </w:p>
     <w:p>

</xml_diff>